<commit_message>
add some loss data
</commit_message>
<xml_diff>
--- a/乙級筆試資料/工作倫理與職業道德共同科目-900070A15.docx
+++ b/乙級筆試資料/工作倫理與職業道德共同科目-900070A15.docx
@@ -1,6 +1,6 @@
 
 <file path=word/document.xml><?xml version="1.0" encoding="utf-8"?>
-<w:document xmlns:wpc="http://schemas.microsoft.com/office/word/2010/wordprocessingCanvas" xmlns:cx="http://schemas.microsoft.com/office/drawing/2014/chartex" xmlns:cx1="http://schemas.microsoft.com/office/drawing/2015/9/8/chartex" xmlns:cx2="http://schemas.microsoft.com/office/drawing/2015/10/21/chartex" xmlns:cx3="http://schemas.microsoft.com/office/drawing/2016/5/9/chartex" xmlns:cx4="http://schemas.microsoft.com/office/drawing/2016/5/10/chartex" xmlns:cx5="http://schemas.microsoft.com/office/drawing/2016/5/11/chartex" xmlns:cx6="http://schemas.microsoft.com/office/drawing/2016/5/12/chartex" xmlns:cx7="http://schemas.microsoft.com/office/drawing/2016/5/13/chartex" xmlns:cx8="http://schemas.microsoft.com/office/drawing/2016/5/14/chartex" xmlns:mc="http://schemas.openxmlformats.org/markup-compatibility/2006" xmlns:aink="http://schemas.microsoft.com/office/drawing/2016/ink" xmlns:am3d="http://schemas.microsoft.com/office/drawing/2017/model3d" xmlns:o="urn:schemas-microsoft-com:office:office" xmlns:r="http://schemas.openxmlformats.org/officeDocument/2006/relationships" xmlns:m="http://schemas.openxmlformats.org/officeDocument/2006/math" xmlns:v="urn:schemas-microsoft-com:vml" xmlns:wp14="http://schemas.microsoft.com/office/word/2010/wordprocessingDrawing" xmlns:wp="http://schemas.openxmlformats.org/drawingml/2006/wordprocessingDrawing" xmlns:w10="urn:schemas-microsoft-com:office:word" xmlns:w="http://schemas.openxmlformats.org/wordprocessingml/2006/main" xmlns:w14="http://schemas.microsoft.com/office/word/2010/wordml" xmlns:w15="http://schemas.microsoft.com/office/word/2012/wordml" xmlns:w16cex="http://schemas.microsoft.com/office/word/2018/wordml/cex" xmlns:w16cid="http://schemas.microsoft.com/office/word/2016/wordml/cid" xmlns:w16="http://schemas.microsoft.com/office/word/2018/wordml" xmlns:w16sdtdh="http://schemas.microsoft.com/office/word/2020/wordml/sdtdatahash" xmlns:w16se="http://schemas.microsoft.com/office/word/2015/wordml/symex" xmlns:wpg="http://schemas.microsoft.com/office/word/2010/wordprocessingGroup" xmlns:wpi="http://schemas.microsoft.com/office/word/2010/wordprocessingInk" xmlns:wne="http://schemas.microsoft.com/office/word/2006/wordml" xmlns:wps="http://schemas.microsoft.com/office/word/2010/wordprocessingShape" mc:Ignorable="w14 w15 w16se w16cid w16 w16cex w16sdtdh wp14">
+<w:document xmlns:wpc="http://schemas.microsoft.com/office/word/2010/wordprocessingCanvas" xmlns:cx="http://schemas.microsoft.com/office/drawing/2014/chartex" xmlns:mc="http://schemas.openxmlformats.org/markup-compatibility/2006" xmlns:o="urn:schemas-microsoft-com:office:office" xmlns:r="http://schemas.openxmlformats.org/officeDocument/2006/relationships" xmlns:m="http://schemas.openxmlformats.org/officeDocument/2006/math" xmlns:v="urn:schemas-microsoft-com:vml" xmlns:wp14="http://schemas.microsoft.com/office/word/2010/wordprocessingDrawing" xmlns:wp="http://schemas.openxmlformats.org/drawingml/2006/wordprocessingDrawing" xmlns:w10="urn:schemas-microsoft-com:office:word" xmlns:w="http://schemas.openxmlformats.org/wordprocessingml/2006/main" xmlns:w14="http://schemas.microsoft.com/office/word/2010/wordml" xmlns:w15="http://schemas.microsoft.com/office/word/2012/wordml" xmlns:w16se="http://schemas.microsoft.com/office/word/2015/wordml/symex" xmlns:wpg="http://schemas.microsoft.com/office/word/2010/wordprocessingGroup" xmlns:wpi="http://schemas.microsoft.com/office/word/2010/wordprocessingInk" xmlns:wne="http://schemas.microsoft.com/office/word/2006/wordml" xmlns:wps="http://schemas.microsoft.com/office/word/2010/wordprocessingShape" mc:Ignorable="w14 w15 w16se wp14">
   <w:body>
     <w:p>
       <w:pPr>
@@ -8,34 +8,58 @@
         <w:ind w:left="210" w:right="44" w:firstLine="0"/>
       </w:pPr>
       <w:r>
-        <w:t xml:space="preserve">90007 工作倫理與職業道德共同科目 不分級 工作項目 01：工作倫理與職業道德 </w:t>
-      </w:r>
-    </w:p>
-    <w:p>
-      <w:pPr>
-        <w:numPr>
-          <w:ilvl w:val="0"/>
-          <w:numId w:val="1"/>
-        </w:numPr>
-        <w:spacing w:beforeLines="50" w:before="120" w:afterLines="50" w:after="120"/>
-        <w:ind w:right="44" w:hanging="554"/>
-      </w:pPr>
-      <w:r>
+        <w:t xml:space="preserve">90007 工作倫理與職業道德共同科目 </w:t>
+      </w:r>
+      <w:proofErr w:type="gramStart"/>
+      <w:r>
+        <w:t>不</w:t>
+      </w:r>
+      <w:proofErr w:type="gramEnd"/>
+      <w:r>
+        <w:t xml:space="preserve">分級 工作項目 01：工作倫理與職業道德 </w:t>
+      </w:r>
+    </w:p>
+    <w:p>
+      <w:pPr>
+        <w:numPr>
+          <w:ilvl w:val="0"/>
+          <w:numId w:val="1"/>
+        </w:numPr>
+        <w:spacing w:beforeLines="50" w:before="120" w:afterLines="50" w:after="120"/>
+        <w:ind w:right="44" w:hanging="554"/>
+        <w:rPr>
+          <w:color w:val="F2F2F2" w:themeColor="background1" w:themeShade="F2"/>
+        </w:rPr>
+      </w:pPr>
+      <w:r>
+        <w:rPr>
+          <w:color w:val="F2F2F2" w:themeColor="background1" w:themeShade="F2"/>
+        </w:rPr>
         <w:t>(3)</w:t>
       </w:r>
       <w:r>
-        <w:t xml:space="preserve"> </w:t>
-      </w:r>
-      <w:r>
+        <w:rPr>
+          <w:color w:val="F2F2F2" w:themeColor="background1" w:themeShade="F2"/>
+        </w:rPr>
+        <w:t xml:space="preserve"> </w:t>
+      </w:r>
+      <w:r>
+        <w:rPr>
+          <w:color w:val="F2F2F2" w:themeColor="background1" w:themeShade="F2"/>
+        </w:rPr>
         <w:t>請問下列何者「不是」個人資料保護法所定義的個人資料？ ①身分證號碼</w:t>
       </w:r>
       <w:r>
         <w:rPr>
           <w:rFonts w:hint="eastAsia"/>
-        </w:rPr>
-        <w:t xml:space="preserve"> </w:t>
-      </w:r>
-      <w:r>
+          <w:color w:val="F2F2F2" w:themeColor="background1" w:themeShade="F2"/>
+        </w:rPr>
+        <w:t xml:space="preserve"> </w:t>
+      </w:r>
+      <w:r>
+        <w:rPr>
+          <w:color w:val="F2F2F2" w:themeColor="background1" w:themeShade="F2"/>
+        </w:rPr>
         <w:t xml:space="preserve">②最高學歷 ③綽號 ④護照號碼 。 </w:t>
       </w:r>
     </w:p>
@@ -47,14 +71,26 @@
         </w:numPr>
         <w:spacing w:beforeLines="50" w:before="120" w:afterLines="50" w:after="120"/>
         <w:ind w:right="44" w:hanging="554"/>
-      </w:pPr>
-      <w:r>
+        <w:rPr>
+          <w:color w:val="F2F2F2" w:themeColor="background1" w:themeShade="F2"/>
+        </w:rPr>
+      </w:pPr>
+      <w:r>
+        <w:rPr>
+          <w:color w:val="F2F2F2" w:themeColor="background1" w:themeShade="F2"/>
+        </w:rPr>
         <w:t>(4)</w:t>
       </w:r>
       <w:r>
-        <w:t xml:space="preserve"> </w:t>
-      </w:r>
-      <w:r>
+        <w:rPr>
+          <w:color w:val="F2F2F2" w:themeColor="background1" w:themeShade="F2"/>
+        </w:rPr>
+        <w:t xml:space="preserve"> </w:t>
+      </w:r>
+      <w:r>
+        <w:rPr>
+          <w:color w:val="F2F2F2" w:themeColor="background1" w:themeShade="F2"/>
+        </w:rPr>
         <w:t xml:space="preserve">下列何者「違反」個人資料保護法？ ①公司基於人事管理之特定目的，張貼榮譽榜揭示績優員工姓名 ②縣市政府提供村里長轄區內符合資格之老人名冊供發放敬老金 ③網路購物公司為辦理退貨，將客戶之住家地址提供予宅配公司 ④學校將應屆畢業生之住家地址提供補習班招生使用 。 </w:t>
       </w:r>
     </w:p>
@@ -66,14 +102,26 @@
         </w:numPr>
         <w:spacing w:beforeLines="50" w:before="120" w:afterLines="50" w:after="120"/>
         <w:ind w:right="44" w:hanging="554"/>
-      </w:pPr>
-      <w:r>
+        <w:rPr>
+          <w:color w:val="F2F2F2" w:themeColor="background1" w:themeShade="F2"/>
+        </w:rPr>
+      </w:pPr>
+      <w:r>
+        <w:rPr>
+          <w:color w:val="F2F2F2" w:themeColor="background1" w:themeShade="F2"/>
+        </w:rPr>
         <w:t>(1)</w:t>
       </w:r>
       <w:r>
-        <w:t xml:space="preserve"> </w:t>
-      </w:r>
-      <w:r>
+        <w:rPr>
+          <w:color w:val="F2F2F2" w:themeColor="background1" w:themeShade="F2"/>
+        </w:rPr>
+        <w:t xml:space="preserve"> </w:t>
+      </w:r>
+      <w:r>
+        <w:rPr>
+          <w:color w:val="F2F2F2" w:themeColor="background1" w:themeShade="F2"/>
+        </w:rPr>
         <w:t xml:space="preserve">非公務機關利用個人資料進行行銷時，下列敘述何者「錯誤」？ ①若已取得當事人書面同意，當事人即不得拒絕利用其個人資料行銷 ②於首次行銷時，應提供當事人表示拒絕行銷之方式 ③當事人表示拒絕接受行銷時，應停止利用其個人資料 ④倘非公務機關違反「應即停止利用其個人資料行銷」之義務，未於限期內改正者，按次處新臺幣 2 萬元以上 20 萬元以下罰鍰 。 </w:t>
       </w:r>
     </w:p>
@@ -87,6 +135,9 @@
         <w:ind w:right="44" w:hanging="554"/>
       </w:pPr>
       <w:r>
+        <w:rPr>
+          <w:color w:val="F2F2F2" w:themeColor="background1" w:themeShade="F2"/>
+        </w:rPr>
         <w:t>(4)</w:t>
       </w:r>
       <w:r>
@@ -104,14 +155,26 @@
         </w:numPr>
         <w:spacing w:beforeLines="50" w:before="120" w:afterLines="50" w:after="120"/>
         <w:ind w:right="44" w:hanging="554"/>
-      </w:pPr>
-      <w:r>
+        <w:rPr>
+          <w:color w:val="F2F2F2" w:themeColor="background1" w:themeShade="F2"/>
+        </w:rPr>
+      </w:pPr>
+      <w:r>
+        <w:rPr>
+          <w:color w:val="F2F2F2" w:themeColor="background1" w:themeShade="F2"/>
+        </w:rPr>
         <w:t>(2)</w:t>
       </w:r>
       <w:r>
-        <w:t xml:space="preserve"> </w:t>
-      </w:r>
-      <w:r>
+        <w:rPr>
+          <w:color w:val="F2F2F2" w:themeColor="background1" w:themeShade="F2"/>
+        </w:rPr>
+        <w:t xml:space="preserve"> </w:t>
+      </w:r>
+      <w:r>
+        <w:rPr>
+          <w:color w:val="F2F2F2" w:themeColor="background1" w:themeShade="F2"/>
+        </w:rPr>
         <w:t xml:space="preserve">關於個人資料保護法之敘述，下列何者「錯誤」？ ①公務機關執行法定職務必要範圍內，可以蒐集、處理或利用一般性個人資料 ②間接蒐集之個人資料，於處理或利用前，不必告知當事人個人資料來源 ③非公務機關亦應維護個人資料之正確，並主動或依當事人之請求更正或補充 ④外國學生在臺灣短期進修或留學，也受到我國個人資料保護法的保障 。 </w:t>
       </w:r>
     </w:p>
@@ -123,14 +186,26 @@
         </w:numPr>
         <w:spacing w:beforeLines="50" w:before="120" w:afterLines="50" w:after="120"/>
         <w:ind w:right="44" w:hanging="554"/>
-      </w:pPr>
-      <w:r>
+        <w:rPr>
+          <w:color w:val="F2F2F2" w:themeColor="background1" w:themeShade="F2"/>
+        </w:rPr>
+      </w:pPr>
+      <w:r>
+        <w:rPr>
+          <w:color w:val="F2F2F2" w:themeColor="background1" w:themeShade="F2"/>
+        </w:rPr>
         <w:t>(2)</w:t>
       </w:r>
       <w:r>
-        <w:t xml:space="preserve"> </w:t>
-      </w:r>
-      <w:r>
+        <w:rPr>
+          <w:color w:val="F2F2F2" w:themeColor="background1" w:themeShade="F2"/>
+        </w:rPr>
+        <w:t xml:space="preserve"> </w:t>
+      </w:r>
+      <w:r>
+        <w:rPr>
+          <w:color w:val="F2F2F2" w:themeColor="background1" w:themeShade="F2"/>
+        </w:rPr>
         <w:t xml:space="preserve">下列關於個人資料保護法的敘述，下列敘述何者錯誤？ ①不管是否使用電腦處理的個人資料，都受個人資料保護法保護 ②公務機關依法執行公權力，不受個人資料保護法規範 ③身分證字號、婚姻、指紋都是個人資料 ④我的病歷資料雖然是由醫生所撰寫，但也屬於是我的個人資料範圍 。 </w:t>
       </w:r>
     </w:p>
@@ -142,14 +217,26 @@
         </w:numPr>
         <w:spacing w:beforeLines="50" w:before="120" w:afterLines="50" w:after="120" w:line="279" w:lineRule="auto"/>
         <w:ind w:right="44" w:hanging="554"/>
-      </w:pPr>
-      <w:r>
+        <w:rPr>
+          <w:color w:val="F2F2F2" w:themeColor="background1" w:themeShade="F2"/>
+        </w:rPr>
+      </w:pPr>
+      <w:r>
+        <w:rPr>
+          <w:color w:val="F2F2F2" w:themeColor="background1" w:themeShade="F2"/>
+        </w:rPr>
         <w:t>(3)</w:t>
       </w:r>
       <w:r>
-        <w:t xml:space="preserve"> </w:t>
-      </w:r>
-      <w:r>
+        <w:rPr>
+          <w:color w:val="F2F2F2" w:themeColor="background1" w:themeShade="F2"/>
+        </w:rPr>
+        <w:t xml:space="preserve"> </w:t>
+      </w:r>
+      <w:r>
+        <w:rPr>
+          <w:color w:val="F2F2F2" w:themeColor="background1" w:themeShade="F2"/>
+        </w:rPr>
         <w:tab/>
         <w:t xml:space="preserve">對於依照個人資料保護法應告知之事項，下列何者不在法定應告知的事項內？ ①個人資料利用之期間、地區、對象及方式 ②蒐集之目的 ③蒐集機關的負責人姓名 ④如拒絕提供或提供不正確個人資料將造成之影響 。 </w:t>
       </w:r>
@@ -162,14 +249,26 @@
         </w:numPr>
         <w:spacing w:beforeLines="50" w:before="120" w:afterLines="50" w:after="120"/>
         <w:ind w:right="44" w:hanging="554"/>
-      </w:pPr>
-      <w:r>
+        <w:rPr>
+          <w:color w:val="F2F2F2" w:themeColor="background1" w:themeShade="F2"/>
+        </w:rPr>
+      </w:pPr>
+      <w:r>
+        <w:rPr>
+          <w:color w:val="F2F2F2" w:themeColor="background1" w:themeShade="F2"/>
+        </w:rPr>
         <w:t>(2)</w:t>
       </w:r>
       <w:r>
-        <w:t xml:space="preserve"> </w:t>
-      </w:r>
-      <w:r>
+        <w:rPr>
+          <w:color w:val="F2F2F2" w:themeColor="background1" w:themeShade="F2"/>
+        </w:rPr>
+        <w:t xml:space="preserve"> </w:t>
+      </w:r>
+      <w:r>
+        <w:rPr>
+          <w:color w:val="F2F2F2" w:themeColor="background1" w:themeShade="F2"/>
+        </w:rPr>
         <w:t xml:space="preserve">請問下列何者非為個人資料保護法第 3 條所規範之當事人權利？ ①查詢或請求閱覽 ②請求刪除他人之資料 ③請求補充或更正 ④請求停止蒐集、處理或利用 。 </w:t>
       </w:r>
     </w:p>
@@ -181,14 +280,26 @@
         </w:numPr>
         <w:spacing w:beforeLines="50" w:before="120" w:afterLines="50" w:after="120"/>
         <w:ind w:right="44" w:hanging="554"/>
-      </w:pPr>
-      <w:r>
+        <w:rPr>
+          <w:color w:val="F2F2F2" w:themeColor="background1" w:themeShade="F2"/>
+        </w:rPr>
+      </w:pPr>
+      <w:r>
+        <w:rPr>
+          <w:color w:val="F2F2F2" w:themeColor="background1" w:themeShade="F2"/>
+        </w:rPr>
         <w:t>(4)</w:t>
       </w:r>
       <w:r>
-        <w:t xml:space="preserve"> </w:t>
-      </w:r>
-      <w:r>
+        <w:rPr>
+          <w:color w:val="F2F2F2" w:themeColor="background1" w:themeShade="F2"/>
+        </w:rPr>
+        <w:t xml:space="preserve"> </w:t>
+      </w:r>
+      <w:r>
+        <w:rPr>
+          <w:color w:val="F2F2F2" w:themeColor="background1" w:themeShade="F2"/>
+        </w:rPr>
         <w:t xml:space="preserve">下列何者非安全使用電腦內的個人資料檔案的做法？ ①利用帳號與密碼登入機制來管理可以存取個資者的人 ②規範不同人員可讀取的個人資料檔案範圍 ③個人資料檔案使用完畢後立即退出應用程式，不得留置於電腦中 ④為確保重要的個人資料可即時取得，將登入密碼標示在螢幕下方 。 </w:t>
       </w:r>
     </w:p>
@@ -200,14 +311,26 @@
         </w:numPr>
         <w:spacing w:beforeLines="50" w:before="120" w:afterLines="50" w:after="120" w:line="279" w:lineRule="auto"/>
         <w:ind w:right="44" w:hanging="554"/>
-      </w:pPr>
-      <w:r>
+        <w:rPr>
+          <w:color w:val="F2F2F2" w:themeColor="background1" w:themeShade="F2"/>
+        </w:rPr>
+      </w:pPr>
+      <w:r>
+        <w:rPr>
+          <w:color w:val="F2F2F2" w:themeColor="background1" w:themeShade="F2"/>
+        </w:rPr>
         <w:t>(1)</w:t>
       </w:r>
       <w:r>
-        <w:t xml:space="preserve"> </w:t>
-      </w:r>
-      <w:r>
+        <w:rPr>
+          <w:color w:val="F2F2F2" w:themeColor="background1" w:themeShade="F2"/>
+        </w:rPr>
+        <w:t xml:space="preserve"> </w:t>
+      </w:r>
+      <w:r>
+        <w:rPr>
+          <w:color w:val="F2F2F2" w:themeColor="background1" w:themeShade="F2"/>
+        </w:rPr>
         <w:t xml:space="preserve">下列何者行為非屬個人資料保護法所稱之國際傳輸？ ①將個人資料傳送給經濟部 ②將個人資料傳送給美國的分公司 ③將個人資料傳送給法國的人事部門 ④將個人資料傳送給日本的委託公司 。 </w:t>
       </w:r>
     </w:p>
@@ -221,6 +344,9 @@
         <w:ind w:right="44" w:hanging="554"/>
       </w:pPr>
       <w:r>
+        <w:rPr>
+          <w:color w:val="F2F2F2" w:themeColor="background1" w:themeShade="F2"/>
+        </w:rPr>
         <w:t>(1)</w:t>
       </w:r>
       <w:r>
@@ -244,6 +370,9 @@
         <w:ind w:right="44" w:hanging="554"/>
       </w:pPr>
       <w:r>
+        <w:rPr>
+          <w:color w:val="F2F2F2" w:themeColor="background1" w:themeShade="F2"/>
+        </w:rPr>
         <w:t>(4)</w:t>
       </w:r>
       <w:r>
@@ -263,6 +392,9 @@
         <w:ind w:right="44" w:hanging="554"/>
       </w:pPr>
       <w:r>
+        <w:rPr>
+          <w:color w:val="F2F2F2" w:themeColor="background1" w:themeShade="F2"/>
+        </w:rPr>
         <w:t>(1)</w:t>
       </w:r>
       <w:r>
@@ -282,6 +414,9 @@
         <w:ind w:right="44" w:hanging="554"/>
       </w:pPr>
       <w:r>
+        <w:rPr>
+          <w:color w:val="F2F2F2" w:themeColor="background1" w:themeShade="F2"/>
+        </w:rPr>
         <w:t>(2)</w:t>
       </w:r>
       <w:r>
@@ -299,14 +434,26 @@
         </w:numPr>
         <w:spacing w:beforeLines="50" w:before="120" w:afterLines="50" w:after="120"/>
         <w:ind w:right="44" w:hanging="554"/>
-      </w:pPr>
-      <w:r>
+        <w:rPr>
+          <w:color w:val="F2F2F2" w:themeColor="background1" w:themeShade="F2"/>
+        </w:rPr>
+      </w:pPr>
+      <w:r>
+        <w:rPr>
+          <w:color w:val="F2F2F2" w:themeColor="background1" w:themeShade="F2"/>
+        </w:rPr>
         <w:t>(1)</w:t>
       </w:r>
       <w:r>
-        <w:t xml:space="preserve"> </w:t>
-      </w:r>
-      <w:r>
+        <w:rPr>
+          <w:color w:val="F2F2F2" w:themeColor="background1" w:themeShade="F2"/>
+        </w:rPr>
+        <w:t xml:space="preserve"> </w:t>
+      </w:r>
+      <w:r>
+        <w:rPr>
+          <w:color w:val="F2F2F2" w:themeColor="background1" w:themeShade="F2"/>
+        </w:rPr>
         <w:t xml:space="preserve">下列有關著作權之概念，何者正確？ ①國外學者之著作，可受我國著作權法的保護 ②公務機關所函頒之公文，受我國著作權法的保護 ③著作權要待向智慧財產權申請通過後才可主張 ④以傳達事實之新聞報導，依然受著作權之保障 。 </w:t>
       </w:r>
     </w:p>
@@ -320,50 +467,99 @@
         <w:ind w:right="44" w:hanging="554"/>
       </w:pPr>
       <w:r>
+        <w:rPr>
+          <w:color w:val="F2F2F2" w:themeColor="background1" w:themeShade="F2"/>
+        </w:rPr>
         <w:t>(2)</w:t>
       </w:r>
       <w:r>
         <w:t xml:space="preserve"> </w:t>
       </w:r>
       <w:r>
-        <w:t xml:space="preserve">受雇人於職務上所完成之著作，如果沒有特別以契約約定，其著作人為下列何者？ ①雇用人 ②受雇人 ③雇用公司或機關法人代表 ④由雇用人指定之自然人或法人 。 </w:t>
-      </w:r>
-    </w:p>
-    <w:p>
-      <w:pPr>
-        <w:numPr>
-          <w:ilvl w:val="0"/>
-          <w:numId w:val="1"/>
-        </w:numPr>
-        <w:spacing w:beforeLines="50" w:before="120" w:afterLines="50" w:after="120"/>
-        <w:ind w:right="44" w:hanging="554"/>
-      </w:pPr>
-      <w:r>
+        <w:t>受雇人於職務上所完成之著作，如果沒有</w:t>
+      </w:r>
+      <w:proofErr w:type="gramStart"/>
+      <w:r>
+        <w:t>特別</w:t>
+      </w:r>
+      <w:proofErr w:type="gramEnd"/>
+      <w:r>
+        <w:t xml:space="preserve">以契約約定，其著作人為下列何者？ ①雇用人 ②受雇人 ③雇用公司或機關法人代表 ④由雇用人指定之自然人或法人 。 </w:t>
+      </w:r>
+    </w:p>
+    <w:p>
+      <w:pPr>
+        <w:numPr>
+          <w:ilvl w:val="0"/>
+          <w:numId w:val="1"/>
+        </w:numPr>
+        <w:spacing w:beforeLines="50" w:before="120" w:afterLines="50" w:after="120"/>
+        <w:ind w:right="44" w:hanging="554"/>
+        <w:rPr>
+          <w:color w:val="F2F2F2" w:themeColor="background1" w:themeShade="F2"/>
+        </w:rPr>
+      </w:pPr>
+      <w:r>
+        <w:rPr>
+          <w:color w:val="F2F2F2" w:themeColor="background1" w:themeShade="F2"/>
+        </w:rPr>
         <w:t>(1)</w:t>
       </w:r>
       <w:r>
-        <w:t xml:space="preserve"> </w:t>
-      </w:r>
-      <w:r>
-        <w:t xml:space="preserve">任職於某公司的程式設計工程師，因職務所編寫之電腦程式，如果沒有特別以契約約定，則該電腦程式重製之權利歸屬下列何者？ ①公司 ②編寫程式之工程師 ③公司全體股東共有 ④公司與編寫程式之工程師共有 。 </w:t>
-      </w:r>
-    </w:p>
-    <w:p>
-      <w:pPr>
-        <w:numPr>
-          <w:ilvl w:val="0"/>
-          <w:numId w:val="1"/>
-        </w:numPr>
-        <w:spacing w:beforeLines="50" w:before="120" w:afterLines="50" w:after="120"/>
-        <w:ind w:right="44" w:hanging="554"/>
-      </w:pPr>
-      <w:r>
+        <w:rPr>
+          <w:color w:val="F2F2F2" w:themeColor="background1" w:themeShade="F2"/>
+        </w:rPr>
+        <w:t xml:space="preserve"> </w:t>
+      </w:r>
+      <w:r>
+        <w:rPr>
+          <w:color w:val="F2F2F2" w:themeColor="background1" w:themeShade="F2"/>
+        </w:rPr>
+        <w:t>任職於某公司的程式設計工程師，因職務所編寫之電腦程式，如果沒有</w:t>
+      </w:r>
+      <w:proofErr w:type="gramStart"/>
+      <w:r>
+        <w:rPr>
+          <w:color w:val="F2F2F2" w:themeColor="background1" w:themeShade="F2"/>
+        </w:rPr>
+        <w:t>特別</w:t>
+      </w:r>
+      <w:proofErr w:type="gramEnd"/>
+      <w:r>
+        <w:rPr>
+          <w:color w:val="F2F2F2" w:themeColor="background1" w:themeShade="F2"/>
+        </w:rPr>
+        <w:t xml:space="preserve">以契約約定，則該電腦程式重製之權利歸屬下列何者？ ①公司 ②編寫程式之工程師 ③公司全體股東共有 ④公司與編寫程式之工程師共有 。 </w:t>
+      </w:r>
+    </w:p>
+    <w:p>
+      <w:pPr>
+        <w:numPr>
+          <w:ilvl w:val="0"/>
+          <w:numId w:val="1"/>
+        </w:numPr>
+        <w:spacing w:beforeLines="50" w:before="120" w:afterLines="50" w:after="120"/>
+        <w:ind w:right="44" w:hanging="554"/>
+        <w:rPr>
+          <w:color w:val="F2F2F2" w:themeColor="background1" w:themeShade="F2"/>
+        </w:rPr>
+      </w:pPr>
+      <w:r>
+        <w:rPr>
+          <w:color w:val="F2F2F2" w:themeColor="background1" w:themeShade="F2"/>
+        </w:rPr>
         <w:t>(3)</w:t>
       </w:r>
       <w:r>
-        <w:t xml:space="preserve"> </w:t>
-      </w:r>
-      <w:r>
+        <w:rPr>
+          <w:color w:val="F2F2F2" w:themeColor="background1" w:themeShade="F2"/>
+        </w:rPr>
+        <w:t xml:space="preserve"> </w:t>
+      </w:r>
+      <w:r>
+        <w:rPr>
+          <w:color w:val="F2F2F2" w:themeColor="background1" w:themeShade="F2"/>
+        </w:rPr>
         <w:t xml:space="preserve">某公司員工因執行業務，擅自以重製之方法侵害他人之著作財產權，若被害人提起告訴，下列對於處罰對象的敘述，何者正確？ ①僅處罰侵犯他人著作財產權之員工 ②僅處罰雇用該名員工的公司 ③該名員工及其雇主皆須受罰 ④員工只要在從事侵犯他人著作財產權之行為前請示雇主並獲同意，便可以不受處罰 。 </w:t>
       </w:r>
     </w:p>
@@ -375,14 +571,26 @@
         </w:numPr>
         <w:spacing w:beforeLines="50" w:before="120" w:afterLines="50" w:after="120"/>
         <w:ind w:right="44" w:hanging="554"/>
-      </w:pPr>
-      <w:r>
+        <w:rPr>
+          <w:color w:val="F2F2F2" w:themeColor="background1" w:themeShade="F2"/>
+        </w:rPr>
+      </w:pPr>
+      <w:r>
+        <w:rPr>
+          <w:color w:val="F2F2F2" w:themeColor="background1" w:themeShade="F2"/>
+        </w:rPr>
         <w:t>(1)</w:t>
       </w:r>
       <w:r>
-        <w:t xml:space="preserve"> </w:t>
-      </w:r>
-      <w:r>
+        <w:rPr>
+          <w:color w:val="F2F2F2" w:themeColor="background1" w:themeShade="F2"/>
+        </w:rPr>
+        <w:t xml:space="preserve"> </w:t>
+      </w:r>
+      <w:r>
+        <w:rPr>
+          <w:color w:val="F2F2F2" w:themeColor="background1" w:themeShade="F2"/>
+        </w:rPr>
         <w:t xml:space="preserve">某廠商之商標在我國已經獲准註冊，請問若希望將商品行銷販賣到國外，請問是否需在當地申請註冊才能受到保護？ ①是，因為商標權註冊採取屬地保護原則 ②否，因為我國申請註冊之商標權在國外也會受到承認 ③不一定，需視我國是否與商品希望行銷販賣的國家訂有相互商標承認之協定 ④不一定，需視商品希望行銷販賣的國家是否為 WTO 會員國 。 </w:t>
       </w:r>
     </w:p>
@@ -396,6 +604,9 @@
         <w:ind w:right="44" w:hanging="554"/>
       </w:pPr>
       <w:r>
+        <w:rPr>
+          <w:color w:val="F2F2F2" w:themeColor="background1" w:themeShade="F2"/>
+        </w:rPr>
         <w:t>(1)</w:t>
       </w:r>
       <w:r>
@@ -413,11 +624,26 @@
         </w:numPr>
         <w:spacing w:beforeLines="50" w:before="120" w:afterLines="50" w:after="120"/>
         <w:ind w:right="44" w:hanging="554"/>
-      </w:pPr>
-      <w:r>
-        <w:t>(4) 任職大發公司的郝聰明，專門從事技術研發，有關研發技術的專利申請權及專利權歸屬，下列敘述何者錯誤？ ①職務上所完成的發明，除契約另有約定外，專利申請權及專利權屬於大發公司 ②職務上所完成的發明，雖然專利申請權及專利權屬</w:t>
-      </w:r>
-      <w:r>
+        <w:rPr>
+          <w:color w:val="F2F2F2" w:themeColor="background1" w:themeShade="F2"/>
+        </w:rPr>
+      </w:pPr>
+      <w:r>
+        <w:rPr>
+          <w:color w:val="F2F2F2" w:themeColor="background1" w:themeShade="F2"/>
+        </w:rPr>
+        <w:t>(4)</w:t>
+      </w:r>
+      <w:r>
+        <w:rPr>
+          <w:color w:val="F2F2F2" w:themeColor="background1" w:themeShade="F2"/>
+        </w:rPr>
+        <w:t xml:space="preserve"> 任職大發公司的郝聰明，專門從事技術研發，有關研發技術的專利申請權及專利權歸屬，下列敘述何者錯誤？ ①職務上所完成的發明，除契約另有約定外，專利申請權及專利權屬於大發公司 ②職務上所完成的發明，雖然專利申請權及專利權屬</w:t>
+      </w:r>
+      <w:r>
+        <w:rPr>
+          <w:color w:val="F2F2F2" w:themeColor="background1" w:themeShade="F2"/>
+        </w:rPr>
         <w:lastRenderedPageBreak/>
         <w:t xml:space="preserve">於大發公司，但是郝聰明享有姓名表示權 ③郝聰明完成非職務上的發明，應即以書面通知大發公司 ④大發公司與郝聰明之雇傭契約約定，郝聰明非職務上的發明，全部屬於公司，約定有效 。 </w:t>
       </w:r>
@@ -430,27 +656,51 @@
         </w:numPr>
         <w:spacing w:beforeLines="50" w:before="120" w:afterLines="50" w:after="120"/>
         <w:ind w:right="44" w:hanging="554"/>
-      </w:pPr>
-      <w:r>
-        <w:t xml:space="preserve">(3) 有關著作權的下列敘述何者不正確？ ①我們到表演場所觀看表演時，不可隨便錄音或錄影 ②到攝影展上，拿相機拍攝展示的作品，分贈給朋友，是侵害著作權的行為 ③網路上供人下載的免費軟體，都不受著作權法保護，所以我可以燒成大補帖光碟，再去賣給別人 ④高普考試題，不受著作權法保護 。 </w:t>
-      </w:r>
-    </w:p>
-    <w:p>
-      <w:pPr>
-        <w:numPr>
-          <w:ilvl w:val="0"/>
-          <w:numId w:val="1"/>
-        </w:numPr>
-        <w:spacing w:beforeLines="50" w:before="120" w:afterLines="50" w:after="120"/>
-        <w:ind w:right="44" w:hanging="554"/>
-      </w:pPr>
-      <w:r>
+        <w:rPr>
+          <w:color w:val="F2F2F2" w:themeColor="background1" w:themeShade="F2"/>
+        </w:rPr>
+      </w:pPr>
+      <w:r>
+        <w:rPr>
+          <w:color w:val="F2F2F2" w:themeColor="background1" w:themeShade="F2"/>
+        </w:rPr>
         <w:t>(3)</w:t>
       </w:r>
       <w:r>
-        <w:t xml:space="preserve"> </w:t>
-      </w:r>
-      <w:r>
+        <w:rPr>
+          <w:color w:val="F2F2F2" w:themeColor="background1" w:themeShade="F2"/>
+        </w:rPr>
+        <w:t xml:space="preserve"> 有關著作權的下列敘述何者不正確？ ①我們到表演場所觀看表演時，不可隨便錄音或錄影 ②到攝影展上，拿相機拍攝展示的作品，分贈給朋友，是侵害著作權的行為 ③網路上供人下載的免費軟體，都不受著作權法保護，所以我可以燒成大補帖光碟，再去賣給別人 ④高普考試題，不受著作權法保護 。 </w:t>
+      </w:r>
+    </w:p>
+    <w:p>
+      <w:pPr>
+        <w:numPr>
+          <w:ilvl w:val="0"/>
+          <w:numId w:val="1"/>
+        </w:numPr>
+        <w:spacing w:beforeLines="50" w:before="120" w:afterLines="50" w:after="120"/>
+        <w:ind w:right="44" w:hanging="554"/>
+        <w:rPr>
+          <w:color w:val="F2F2F2" w:themeColor="background1" w:themeShade="F2"/>
+        </w:rPr>
+      </w:pPr>
+      <w:r>
+        <w:rPr>
+          <w:color w:val="F2F2F2" w:themeColor="background1" w:themeShade="F2"/>
+        </w:rPr>
+        <w:t>(3)</w:t>
+      </w:r>
+      <w:r>
+        <w:rPr>
+          <w:color w:val="F2F2F2" w:themeColor="background1" w:themeShade="F2"/>
+        </w:rPr>
+        <w:t xml:space="preserve"> </w:t>
+      </w:r>
+      <w:r>
+        <w:rPr>
+          <w:color w:val="F2F2F2" w:themeColor="background1" w:themeShade="F2"/>
+        </w:rPr>
         <w:t xml:space="preserve">有關著作權的下列敘述何者錯誤？ ①撰寫碩博士論文時，在合理範圍內引用他人的著作，只要註明出處，不會構成侵害著作權 ②在網路散布盜版光碟，不管有沒有營利，會構成侵害著作權 ③在網路的部落格看到一篇文章很棒，只要註明出處，就可以把文章複製在自己的部落格 ④將補習班老師的上課內容錄音檔，放到網路上拍賣，會構成侵害著作權 。 </w:t>
       </w:r>
     </w:p>
@@ -462,14 +712,26 @@
         </w:numPr>
         <w:spacing w:beforeLines="50" w:before="120" w:afterLines="50" w:after="120"/>
         <w:ind w:right="44" w:hanging="554"/>
-      </w:pPr>
-      <w:r>
+        <w:rPr>
+          <w:color w:val="F2F2F2" w:themeColor="background1" w:themeShade="F2"/>
+        </w:rPr>
+      </w:pPr>
+      <w:r>
+        <w:rPr>
+          <w:color w:val="F2F2F2" w:themeColor="background1" w:themeShade="F2"/>
+        </w:rPr>
         <w:t>(4)</w:t>
       </w:r>
       <w:r>
-        <w:t xml:space="preserve"> </w:t>
-      </w:r>
-      <w:r>
+        <w:rPr>
+          <w:color w:val="F2F2F2" w:themeColor="background1" w:themeShade="F2"/>
+        </w:rPr>
+        <w:t xml:space="preserve"> </w:t>
+      </w:r>
+      <w:r>
+        <w:rPr>
+          <w:color w:val="F2F2F2" w:themeColor="background1" w:themeShade="F2"/>
+        </w:rPr>
         <w:t xml:space="preserve">有關商標權的下列敘述何者錯誤？ ①要取得商標權一定要申請商標註冊 ②商標註冊後可取得 10 年商標權 ③商標註冊後，3 年不使用，會被廢止商標權 ④在夜市買的仿冒品，品質不好，上網拍賣，不會構成侵權 。 </w:t>
       </w:r>
     </w:p>
@@ -483,31 +745,55 @@
         <w:ind w:right="44" w:hanging="554"/>
       </w:pPr>
       <w:r>
+        <w:rPr>
+          <w:color w:val="F2F2F2" w:themeColor="background1" w:themeShade="F2"/>
+        </w:rPr>
         <w:t>(1)</w:t>
       </w:r>
       <w:r>
-        <w:t xml:space="preserve"> </w:t>
-      </w:r>
-      <w:r>
-        <w:t xml:space="preserve">下列關於營業秘密的敘述，何者不正確？ ①受雇人於非職務上研究或開發之營業秘密，仍歸雇用人所有 ②營業秘密不得為質權及強制執行之標的 ③營業秘密所有人得授權他人使用其營業秘密 ④營業秘密得全部或部分讓與他人或與他人共有 。 </w:t>
-      </w:r>
-    </w:p>
-    <w:p>
-      <w:pPr>
-        <w:numPr>
-          <w:ilvl w:val="0"/>
-          <w:numId w:val="1"/>
-        </w:numPr>
-        <w:spacing w:beforeLines="50" w:before="120" w:afterLines="50" w:after="120"/>
-        <w:ind w:right="44" w:hanging="554"/>
-      </w:pPr>
-      <w:r>
+        <w:rPr>
+          <w:color w:val="F2F2F2" w:themeColor="background1" w:themeShade="F2"/>
+        </w:rPr>
+        <w:t xml:space="preserve"> </w:t>
+      </w:r>
+      <w:r>
+        <w:rPr>
+          <w:color w:val="F2F2F2" w:themeColor="background1" w:themeShade="F2"/>
+        </w:rPr>
+        <w:t>下列關於營業秘密的敘述，何者不正確？ ①受雇人於非職務上研究或開發之營業秘密，仍歸雇用人所有 ②營業秘密不得為質權及強制執行之標的 ③營業秘密所有人得授權他人使用其營業秘密 ④營業秘密得全部或部分讓與他人或與他人共有 。</w:t>
+      </w:r>
+      <w:r>
+        <w:t xml:space="preserve"> </w:t>
+      </w:r>
+    </w:p>
+    <w:p>
+      <w:pPr>
+        <w:numPr>
+          <w:ilvl w:val="0"/>
+          <w:numId w:val="1"/>
+        </w:numPr>
+        <w:spacing w:beforeLines="50" w:before="120" w:afterLines="50" w:after="120"/>
+        <w:ind w:right="44" w:hanging="554"/>
+        <w:rPr>
+          <w:color w:val="F2F2F2" w:themeColor="background1" w:themeShade="F2"/>
+        </w:rPr>
+      </w:pPr>
+      <w:r>
+        <w:rPr>
+          <w:color w:val="F2F2F2" w:themeColor="background1" w:themeShade="F2"/>
+        </w:rPr>
         <w:t>(1)</w:t>
       </w:r>
       <w:r>
-        <w:t xml:space="preserve"> </w:t>
-      </w:r>
-      <w:r>
+        <w:rPr>
+          <w:color w:val="F2F2F2" w:themeColor="background1" w:themeShade="F2"/>
+        </w:rPr>
+        <w:t xml:space="preserve"> </w:t>
+      </w:r>
+      <w:r>
+        <w:rPr>
+          <w:color w:val="F2F2F2" w:themeColor="background1" w:themeShade="F2"/>
+        </w:rPr>
         <w:t xml:space="preserve">下列何者「非」屬於營業秘密？ ①具廣告性質的不動產交易底價 ②須授權取得之產品設計或開發流程圖示 ③公司內部管制的各種計畫方案 ④客戶名單 。 </w:t>
       </w:r>
     </w:p>
@@ -521,31 +807,55 @@
         <w:ind w:right="44" w:hanging="554"/>
       </w:pPr>
       <w:r>
+        <w:rPr>
+          <w:color w:val="F2F2F2" w:themeColor="background1" w:themeShade="F2"/>
+        </w:rPr>
         <w:t>(3)</w:t>
       </w:r>
       <w:r>
-        <w:t xml:space="preserve"> </w:t>
-      </w:r>
-      <w:r>
-        <w:t xml:space="preserve">營業秘密可分為「技術機密」與「商業機密」，下列何者屬於「商業機密」？ ①程式 ②設計圖 ③客戶名單 ④生產製程 。 </w:t>
-      </w:r>
-    </w:p>
-    <w:p>
-      <w:pPr>
-        <w:numPr>
-          <w:ilvl w:val="0"/>
-          <w:numId w:val="1"/>
-        </w:numPr>
-        <w:spacing w:beforeLines="50" w:before="120" w:afterLines="50" w:after="120"/>
-        <w:ind w:right="44" w:hanging="554"/>
-      </w:pPr>
-      <w:r>
+        <w:rPr>
+          <w:color w:val="F2F2F2" w:themeColor="background1" w:themeShade="F2"/>
+        </w:rPr>
+        <w:t xml:space="preserve"> </w:t>
+      </w:r>
+      <w:r>
+        <w:rPr>
+          <w:color w:val="F2F2F2" w:themeColor="background1" w:themeShade="F2"/>
+        </w:rPr>
+        <w:t>營業秘密可分為「技術機密」與「商業機密」，下列何者屬於「商業機密」？ ①程式 ②設計圖 ③客戶名單 ④生產製程 。</w:t>
+      </w:r>
+      <w:r>
+        <w:t xml:space="preserve"> </w:t>
+      </w:r>
+    </w:p>
+    <w:p>
+      <w:pPr>
+        <w:numPr>
+          <w:ilvl w:val="0"/>
+          <w:numId w:val="1"/>
+        </w:numPr>
+        <w:spacing w:beforeLines="50" w:before="120" w:afterLines="50" w:after="120"/>
+        <w:ind w:right="44" w:hanging="554"/>
+        <w:rPr>
+          <w:color w:val="F2F2F2" w:themeColor="background1" w:themeShade="F2"/>
+        </w:rPr>
+      </w:pPr>
+      <w:r>
+        <w:rPr>
+          <w:color w:val="F2F2F2" w:themeColor="background1" w:themeShade="F2"/>
+        </w:rPr>
         <w:t>(1)</w:t>
       </w:r>
       <w:r>
-        <w:t xml:space="preserve"> </w:t>
-      </w:r>
-      <w:r>
+        <w:rPr>
+          <w:color w:val="F2F2F2" w:themeColor="background1" w:themeShade="F2"/>
+        </w:rPr>
+        <w:t xml:space="preserve"> </w:t>
+      </w:r>
+      <w:r>
+        <w:rPr>
+          <w:color w:val="F2F2F2" w:themeColor="background1" w:themeShade="F2"/>
+        </w:rPr>
         <w:t xml:space="preserve">甲公司將其新開發受營業秘密法保護之技術，授權乙公司使用，下列何者不得為之？ ①乙公司已獲授權，所以可以未經甲公司同意，再授權丙公司使用 ②約定授權使用限於一定之地域、時間 ③約定授權使用限於特定之內容、一定之使用方法 ④要求被授權人乙公司在一定期間負有保密義務。 </w:t>
       </w:r>
     </w:p>
@@ -557,14 +867,26 @@
         </w:numPr>
         <w:spacing w:beforeLines="50" w:before="120" w:afterLines="50" w:after="120"/>
         <w:ind w:right="44" w:hanging="554"/>
-      </w:pPr>
-      <w:r>
+        <w:rPr>
+          <w:color w:val="F2F2F2" w:themeColor="background1" w:themeShade="F2"/>
+        </w:rPr>
+      </w:pPr>
+      <w:r>
+        <w:rPr>
+          <w:color w:val="F2F2F2" w:themeColor="background1" w:themeShade="F2"/>
+        </w:rPr>
         <w:t>(3)</w:t>
       </w:r>
       <w:r>
-        <w:t xml:space="preserve"> </w:t>
-      </w:r>
-      <w:r>
+        <w:rPr>
+          <w:color w:val="F2F2F2" w:themeColor="background1" w:themeShade="F2"/>
+        </w:rPr>
+        <w:t xml:space="preserve"> </w:t>
+      </w:r>
+      <w:r>
+        <w:rPr>
+          <w:color w:val="F2F2F2" w:themeColor="background1" w:themeShade="F2"/>
+        </w:rPr>
         <w:t xml:space="preserve">甲公司嚴格保密之最新配方產品大賣，下列何者侵害甲公司之營業秘密？ ①鑑定人 A 因司法審理而知悉配方 ②甲公司授權乙公司使用其配方 ③甲公司之 B 員工擅自將配方盜賣給乙公司 ④甲公司與乙公司協議共有配方。 </w:t>
       </w:r>
     </w:p>
@@ -578,6 +900,9 @@
         <w:ind w:right="44" w:hanging="554"/>
       </w:pPr>
       <w:r>
+        <w:rPr>
+          <w:color w:val="F2F2F2" w:themeColor="background1" w:themeShade="F2"/>
+        </w:rPr>
         <w:t>(3)</w:t>
       </w:r>
       <w:r>
@@ -595,14 +920,26 @@
         </w:numPr>
         <w:spacing w:beforeLines="50" w:before="120" w:afterLines="50" w:after="120"/>
         <w:ind w:right="44" w:hanging="554"/>
-      </w:pPr>
-      <w:r>
+        <w:rPr>
+          <w:color w:val="F2F2F2" w:themeColor="background1" w:themeShade="F2"/>
+        </w:rPr>
+      </w:pPr>
+      <w:r>
+        <w:rPr>
+          <w:color w:val="F2F2F2" w:themeColor="background1" w:themeShade="F2"/>
+        </w:rPr>
         <w:t>(4)</w:t>
       </w:r>
       <w:r>
-        <w:t xml:space="preserve"> </w:t>
-      </w:r>
-      <w:r>
+        <w:rPr>
+          <w:color w:val="F2F2F2" w:themeColor="background1" w:themeShade="F2"/>
+        </w:rPr>
+        <w:t xml:space="preserve"> </w:t>
+      </w:r>
+      <w:r>
+        <w:rPr>
+          <w:color w:val="F2F2F2" w:themeColor="background1" w:themeShade="F2"/>
+        </w:rPr>
         <w:t xml:space="preserve">受雇者因承辦業務而知悉營業秘密，在離職後對於該營業秘密的處理方式，下列敘述何者正確？ ①聘雇關係解除後便不再負有保障營業秘密之責 ②僅能自用而不得販售獲取利益 ③自離職日起 3 年後便不再負有保障營業秘密之責 ④離職後仍不得洩漏該營業秘密 。 </w:t>
       </w:r>
     </w:p>
@@ -614,41 +951,77 @@
         </w:numPr>
         <w:spacing w:beforeLines="50" w:before="120" w:afterLines="50" w:after="120"/>
         <w:ind w:right="44" w:hanging="554"/>
-      </w:pPr>
-      <w:r>
-        <w:t xml:space="preserve">(3) 按照現行法律規定，侵害他人營業秘密，其法律責任為： ①僅需負刑事責任 ②僅需負民事損害賠償責任 ③刑事責任與民事損害賠償責任皆須負擔 ④刑事責任與民事損害賠償責任皆不須負擔 。 </w:t>
-      </w:r>
-    </w:p>
-    <w:p>
-      <w:pPr>
-        <w:numPr>
-          <w:ilvl w:val="0"/>
-          <w:numId w:val="1"/>
-        </w:numPr>
-        <w:spacing w:beforeLines="50" w:before="120" w:afterLines="50" w:after="120"/>
-        <w:ind w:right="44" w:hanging="554"/>
-      </w:pPr>
-      <w:r>
+        <w:rPr>
+          <w:color w:val="F2F2F2" w:themeColor="background1" w:themeShade="F2"/>
+        </w:rPr>
+      </w:pPr>
+      <w:r>
+        <w:rPr>
+          <w:color w:val="F2F2F2" w:themeColor="background1" w:themeShade="F2"/>
+        </w:rPr>
+        <w:t>(3)</w:t>
+      </w:r>
+      <w:r>
+        <w:rPr>
+          <w:color w:val="F2F2F2" w:themeColor="background1" w:themeShade="F2"/>
+        </w:rPr>
+        <w:t xml:space="preserve"> 按照現行法律規定，侵害他人營業秘密，其法律責任為： ①僅需負刑事責任 ②僅需負民事損害賠償責任 ③刑事責任與民事損害賠償責任皆須負擔 ④刑事責任與民事損害賠償責任皆不須負擔 。 </w:t>
+      </w:r>
+    </w:p>
+    <w:p>
+      <w:pPr>
+        <w:numPr>
+          <w:ilvl w:val="0"/>
+          <w:numId w:val="1"/>
+        </w:numPr>
+        <w:spacing w:beforeLines="50" w:before="120" w:afterLines="50" w:after="120"/>
+        <w:ind w:right="44" w:hanging="554"/>
+        <w:rPr>
+          <w:color w:val="F2F2F2" w:themeColor="background1" w:themeShade="F2"/>
+        </w:rPr>
+      </w:pPr>
+      <w:r>
+        <w:rPr>
+          <w:color w:val="F2F2F2" w:themeColor="background1" w:themeShade="F2"/>
+        </w:rPr>
         <w:lastRenderedPageBreak/>
-        <w:t xml:space="preserve">(3) 企業內部之營業秘密，可以概分為「商業性營業秘密」及「技術性營業秘密」二大類型，請問下列何者屬於「技術性營業秘密」？ ①人事管理 ② 經銷據點 ③產品配方 ④客戶名單 。 </w:t>
-      </w:r>
-    </w:p>
-    <w:p>
-      <w:pPr>
-        <w:numPr>
-          <w:ilvl w:val="0"/>
-          <w:numId w:val="1"/>
-        </w:numPr>
-        <w:spacing w:beforeLines="50" w:before="120" w:afterLines="50" w:after="120"/>
-        <w:ind w:right="44" w:hanging="554"/>
-      </w:pPr>
-      <w:r>
         <w:t>(3)</w:t>
       </w:r>
       <w:r>
-        <w:t xml:space="preserve"> </w:t>
-      </w:r>
-      <w:r>
+        <w:rPr>
+          <w:color w:val="F2F2F2" w:themeColor="background1" w:themeShade="F2"/>
+        </w:rPr>
+        <w:t xml:space="preserve"> 企業內部之營業秘密，可以概分為「商業性營業秘密」及「技術性營業秘密」二大類型，請問下列何者屬於「技術性營業秘密」？ ①人事管理 ② 經銷據點 ③產品配方 ④客戶名單 。 </w:t>
+      </w:r>
+    </w:p>
+    <w:p>
+      <w:pPr>
+        <w:numPr>
+          <w:ilvl w:val="0"/>
+          <w:numId w:val="1"/>
+        </w:numPr>
+        <w:spacing w:beforeLines="50" w:before="120" w:afterLines="50" w:after="120"/>
+        <w:ind w:right="44" w:hanging="554"/>
+        <w:rPr>
+          <w:color w:val="F2F2F2" w:themeColor="background1" w:themeShade="F2"/>
+        </w:rPr>
+      </w:pPr>
+      <w:r>
+        <w:rPr>
+          <w:color w:val="F2F2F2" w:themeColor="background1" w:themeShade="F2"/>
+        </w:rPr>
+        <w:t>(3)</w:t>
+      </w:r>
+      <w:r>
+        <w:rPr>
+          <w:color w:val="F2F2F2" w:themeColor="background1" w:themeShade="F2"/>
+        </w:rPr>
+        <w:t xml:space="preserve"> </w:t>
+      </w:r>
+      <w:r>
+        <w:rPr>
+          <w:color w:val="F2F2F2" w:themeColor="background1" w:themeShade="F2"/>
+        </w:rPr>
         <w:t xml:space="preserve">某離職同事請求在職員工將離職前所製作之某份文件傳送給他，請問下列回應方式何者正確？ ①由於該項文件係由該離職員工製作，因此可以傳送文件 ②若其目的僅為保留檔案備份，便可以傳送文件 ③可能構成對於營業秘密之侵害，應予拒絕並請他直接向公司提出請求 ④視彼此交情決定是否傳送文件 。 </w:t>
       </w:r>
     </w:p>
@@ -660,14 +1033,26 @@
         </w:numPr>
         <w:spacing w:beforeLines="50" w:before="120" w:afterLines="50" w:after="120"/>
         <w:ind w:right="44" w:hanging="554"/>
-      </w:pPr>
-      <w:r>
+        <w:rPr>
+          <w:color w:val="F2F2F2" w:themeColor="background1" w:themeShade="F2"/>
+        </w:rPr>
+      </w:pPr>
+      <w:r>
+        <w:rPr>
+          <w:color w:val="F2F2F2" w:themeColor="background1" w:themeShade="F2"/>
+        </w:rPr>
         <w:t>(1)</w:t>
       </w:r>
       <w:r>
-        <w:t xml:space="preserve"> </w:t>
-      </w:r>
-      <w:r>
+        <w:rPr>
+          <w:color w:val="F2F2F2" w:themeColor="background1" w:themeShade="F2"/>
+        </w:rPr>
+        <w:t xml:space="preserve"> </w:t>
+      </w:r>
+      <w:r>
+        <w:rPr>
+          <w:color w:val="F2F2F2" w:themeColor="background1" w:themeShade="F2"/>
+        </w:rPr>
         <w:t xml:space="preserve">行為人以竊取等不正當方法取得營業秘密，下列敘述何者正確？ ①已構成犯罪 ②只要後續沒有洩漏便不構成犯罪 ③只要後續沒有出現使用之行為便不構成犯罪 ④只要後續沒有造成所有人之損害便不構成犯罪 。 </w:t>
       </w:r>
     </w:p>
@@ -679,14 +1064,26 @@
         </w:numPr>
         <w:spacing w:beforeLines="50" w:before="120" w:afterLines="50" w:after="120"/>
         <w:ind w:right="44" w:hanging="554"/>
-      </w:pPr>
-      <w:r>
+        <w:rPr>
+          <w:color w:val="F2F2F2" w:themeColor="background1" w:themeShade="F2"/>
+        </w:rPr>
+      </w:pPr>
+      <w:r>
+        <w:rPr>
+          <w:color w:val="F2F2F2" w:themeColor="background1" w:themeShade="F2"/>
+        </w:rPr>
         <w:t>(3)</w:t>
       </w:r>
       <w:r>
-        <w:t xml:space="preserve"> </w:t>
-      </w:r>
-      <w:r>
+        <w:rPr>
+          <w:color w:val="F2F2F2" w:themeColor="background1" w:themeShade="F2"/>
+        </w:rPr>
+        <w:t xml:space="preserve"> </w:t>
+      </w:r>
+      <w:r>
+        <w:rPr>
+          <w:color w:val="F2F2F2" w:themeColor="background1" w:themeShade="F2"/>
+        </w:rPr>
         <w:t xml:space="preserve">針對在我國境內竊取營業秘密後，意圖在外國、中國大陸或港澳地區使用者，營業秘密法是否可以適用？ ①無法適用 ②可以適用，但若屬未遂犯則不罰 ③可以適用並加重其刑 ④能否適用需視該國家或地區與我國是否簽訂相互保護營業秘密之條約或協定 。 </w:t>
       </w:r>
     </w:p>
@@ -700,6 +1097,9 @@
         <w:ind w:right="44" w:hanging="554"/>
       </w:pPr>
       <w:r>
+        <w:rPr>
+          <w:color w:val="F2F2F2" w:themeColor="background1" w:themeShade="F2"/>
+        </w:rPr>
         <w:t>(4)</w:t>
       </w:r>
       <w:r>
@@ -719,6 +1119,9 @@
         <w:ind w:right="44" w:hanging="554"/>
       </w:pPr>
       <w:r>
+        <w:rPr>
+          <w:color w:val="F2F2F2" w:themeColor="background1" w:themeShade="F2"/>
+        </w:rPr>
         <w:t>(1)</w:t>
       </w:r>
       <w:r>
@@ -736,14 +1139,26 @@
         </w:numPr>
         <w:spacing w:beforeLines="50" w:before="120" w:afterLines="50" w:after="120"/>
         <w:ind w:right="44" w:hanging="554"/>
-      </w:pPr>
-      <w:r>
+        <w:rPr>
+          <w:color w:val="F2F2F2" w:themeColor="background1" w:themeShade="F2"/>
+        </w:rPr>
+      </w:pPr>
+      <w:r>
+        <w:rPr>
+          <w:color w:val="F2F2F2" w:themeColor="background1" w:themeShade="F2"/>
+        </w:rPr>
         <w:t>(1)</w:t>
       </w:r>
       <w:r>
-        <w:t xml:space="preserve"> </w:t>
-      </w:r>
-      <w:r>
+        <w:rPr>
+          <w:color w:val="F2F2F2" w:themeColor="background1" w:themeShade="F2"/>
+        </w:rPr>
+        <w:t xml:space="preserve"> </w:t>
+      </w:r>
+      <w:r>
+        <w:rPr>
+          <w:color w:val="F2F2F2" w:themeColor="background1" w:themeShade="F2"/>
+        </w:rPr>
         <w:t xml:space="preserve">公務機關首長要求人事單位聘僱自己的弟弟擔任工友，違反何種法令？ ①公職人員利益衝突迴避法 ②刑法 ③貪污治罪條例 ④未違反法令。 </w:t>
       </w:r>
     </w:p>
@@ -755,14 +1170,26 @@
         </w:numPr>
         <w:spacing w:beforeLines="50" w:before="120" w:afterLines="50" w:after="120"/>
         <w:ind w:right="44" w:hanging="554"/>
-      </w:pPr>
-      <w:r>
+        <w:rPr>
+          <w:color w:val="F2F2F2" w:themeColor="background1" w:themeShade="F2"/>
+        </w:rPr>
+      </w:pPr>
+      <w:r>
+        <w:rPr>
+          <w:color w:val="F2F2F2" w:themeColor="background1" w:themeShade="F2"/>
+        </w:rPr>
         <w:t>(4)</w:t>
       </w:r>
       <w:r>
-        <w:t xml:space="preserve"> </w:t>
-      </w:r>
-      <w:r>
+        <w:rPr>
+          <w:color w:val="F2F2F2" w:themeColor="background1" w:themeShade="F2"/>
+        </w:rPr>
+        <w:t xml:space="preserve"> </w:t>
+      </w:r>
+      <w:r>
+        <w:rPr>
+          <w:color w:val="F2F2F2" w:themeColor="background1" w:themeShade="F2"/>
+        </w:rPr>
         <w:t xml:space="preserve">依新修公布之公職人員利益衝突迴避法(以下簡稱本法)規定，公職人員甲與其關係人下列何種行為不違反本法？ ①甲要求受其監督之機關聘用兒子乙 ②配偶乙以請託關說之方式，請求甲之服務機關通過其名下農地變更使用申請案 ③甲承辦案件時，明知有利益衝突之情事，但因自認為人公正，故不自行迴避 ④關係人丁經政府採購法公告程序取得甲服務機關之年度採購標案 。 </w:t>
       </w:r>
     </w:p>
@@ -776,63 +1203,145 @@
         <w:ind w:right="44" w:hanging="554"/>
       </w:pPr>
       <w:r>
+        <w:rPr>
+          <w:color w:val="F2F2F2" w:themeColor="background1" w:themeShade="F2"/>
+        </w:rPr>
         <w:t>(1)</w:t>
       </w:r>
       <w:r>
         <w:t xml:space="preserve"> </w:t>
       </w:r>
       <w:r>
-        <w:t xml:space="preserve">公司負責人為了要節省開銷，將員工薪資以高報低來投保全民健保及勞保，是觸犯了刑法上之何種罪刑？ ①詐欺罪 ②侵占罪 ③背信罪 ④工商秘密罪 。 </w:t>
-      </w:r>
-    </w:p>
-    <w:p>
-      <w:pPr>
-        <w:numPr>
-          <w:ilvl w:val="0"/>
-          <w:numId w:val="1"/>
-        </w:numPr>
-        <w:spacing w:beforeLines="50" w:before="120" w:afterLines="50" w:after="120"/>
-        <w:ind w:right="44" w:hanging="554"/>
-      </w:pPr>
-      <w:r>
-        <w:t xml:space="preserve">(2) A 受僱於公司擔任會計，因自己的財務陷入危機，多次將公司帳款轉入妻兒戶頭，是觸犯了刑法上之何種罪刑？ ①洩漏工商秘密罪 ②侵占罪 ③詐欺罪 ④偽造文書罪 。 </w:t>
-      </w:r>
-    </w:p>
-    <w:p>
-      <w:pPr>
-        <w:numPr>
-          <w:ilvl w:val="0"/>
-          <w:numId w:val="1"/>
-        </w:numPr>
-        <w:spacing w:beforeLines="50" w:before="120" w:afterLines="50" w:after="120"/>
-        <w:ind w:right="44" w:hanging="554"/>
-      </w:pPr>
-      <w:r>
-        <w:t xml:space="preserve">(3) 某甲於公司擔任業務經理時，未依規定經董事會同意，私自與自己親友之公司訂定生意合約，會觸犯下列何種罪刑？ ①侵占罪 ②貪污罪 ③背信罪 ④詐欺罪 。 </w:t>
-      </w:r>
-    </w:p>
-    <w:p>
-      <w:pPr>
-        <w:numPr>
-          <w:ilvl w:val="0"/>
-          <w:numId w:val="1"/>
-        </w:numPr>
-        <w:spacing w:beforeLines="50" w:before="120" w:afterLines="50" w:after="120"/>
-        <w:ind w:right="44" w:hanging="554"/>
-      </w:pPr>
-      <w:r>
-        <w:t>(1) 如果你擔任公司採購的職務，親朋好友們會向你推銷自家的產品，希望你要採購時，你應該 ①適時地婉拒，說明利益需要迴避的考量，請他們見諒</w:t>
+        <w:t>公司負責人為了要節省開銷，將員工薪資以高</w:t>
+      </w:r>
+      <w:proofErr w:type="gramStart"/>
+      <w:r>
+        <w:t>報低</w:t>
+      </w:r>
+      <w:proofErr w:type="gramEnd"/>
+      <w:r>
+        <w:t xml:space="preserve">來投保全民健保及勞保，是觸犯了刑法上之何種罪刑？ ①詐欺罪 ②侵占罪 ③背信罪 ④工商秘密罪 。 </w:t>
+      </w:r>
+    </w:p>
+    <w:p>
+      <w:pPr>
+        <w:numPr>
+          <w:ilvl w:val="0"/>
+          <w:numId w:val="1"/>
+        </w:numPr>
+        <w:spacing w:beforeLines="50" w:before="120" w:afterLines="50" w:after="120"/>
+        <w:ind w:right="44" w:hanging="554"/>
+        <w:rPr>
+          <w:color w:val="F2F2F2" w:themeColor="background1" w:themeShade="F2"/>
+        </w:rPr>
+      </w:pPr>
+      <w:r>
+        <w:rPr>
+          <w:color w:val="F2F2F2" w:themeColor="background1" w:themeShade="F2"/>
+        </w:rPr>
+        <w:t>(2)</w:t>
+      </w:r>
+      <w:r>
+        <w:rPr>
+          <w:color w:val="F2F2F2" w:themeColor="background1" w:themeShade="F2"/>
+        </w:rPr>
+        <w:t xml:space="preserve"> A 受</w:t>
+      </w:r>
+      <w:proofErr w:type="gramStart"/>
+      <w:r>
+        <w:rPr>
+          <w:color w:val="F2F2F2" w:themeColor="background1" w:themeShade="F2"/>
+        </w:rPr>
+        <w:t>僱</w:t>
+      </w:r>
+      <w:proofErr w:type="gramEnd"/>
+      <w:r>
+        <w:rPr>
+          <w:color w:val="F2F2F2" w:themeColor="background1" w:themeShade="F2"/>
+        </w:rPr>
+        <w:t xml:space="preserve">於公司擔任會計，因自己的財務陷入危機，多次將公司帳款轉入妻兒戶頭，是觸犯了刑法上之何種罪刑？ ①洩漏工商秘密罪 ②侵占罪 ③詐欺罪 ④偽造文書罪 。 </w:t>
+      </w:r>
+    </w:p>
+    <w:p>
+      <w:pPr>
+        <w:numPr>
+          <w:ilvl w:val="0"/>
+          <w:numId w:val="1"/>
+        </w:numPr>
+        <w:spacing w:beforeLines="50" w:before="120" w:afterLines="50" w:after="120"/>
+        <w:ind w:right="44" w:hanging="554"/>
+        <w:rPr>
+          <w:color w:val="F2F2F2" w:themeColor="background1" w:themeShade="F2"/>
+        </w:rPr>
+      </w:pPr>
+      <w:r>
+        <w:rPr>
+          <w:color w:val="F2F2F2" w:themeColor="background1" w:themeShade="F2"/>
+        </w:rPr>
+        <w:t>(3)</w:t>
+      </w:r>
+      <w:r>
+        <w:rPr>
+          <w:color w:val="F2F2F2" w:themeColor="background1" w:themeShade="F2"/>
+        </w:rPr>
+        <w:t xml:space="preserve"> </w:t>
+      </w:r>
+      <w:proofErr w:type="gramStart"/>
+      <w:r>
+        <w:rPr>
+          <w:color w:val="F2F2F2" w:themeColor="background1" w:themeShade="F2"/>
+        </w:rPr>
+        <w:t>某甲於公司</w:t>
+      </w:r>
+      <w:proofErr w:type="gramEnd"/>
+      <w:r>
+        <w:rPr>
+          <w:color w:val="F2F2F2" w:themeColor="background1" w:themeShade="F2"/>
+        </w:rPr>
+        <w:t xml:space="preserve">擔任業務經理時，未依規定經董事會同意，私自與自己親友之公司訂定生意合約，會觸犯下列何種罪刑？ ①侵占罪 ②貪污罪 ③背信罪 ④詐欺罪 。 </w:t>
+      </w:r>
+    </w:p>
+    <w:p>
+      <w:pPr>
+        <w:numPr>
+          <w:ilvl w:val="0"/>
+          <w:numId w:val="1"/>
+        </w:numPr>
+        <w:spacing w:beforeLines="50" w:before="120" w:afterLines="50" w:after="120"/>
+        <w:ind w:right="44" w:hanging="554"/>
+        <w:rPr>
+          <w:color w:val="F2F2F2" w:themeColor="background1" w:themeShade="F2"/>
+        </w:rPr>
+      </w:pPr>
+      <w:r>
+        <w:rPr>
+          <w:color w:val="F2F2F2" w:themeColor="background1" w:themeShade="F2"/>
+        </w:rPr>
+        <w:t>(1)</w:t>
+      </w:r>
+      <w:r>
+        <w:rPr>
+          <w:color w:val="F2F2F2" w:themeColor="background1" w:themeShade="F2"/>
+        </w:rPr>
+        <w:t xml:space="preserve"> 如果你擔任公司採購的職務，親朋好友們會向你推銷自家的產品，希望你要採購時，你應該 ①適時地婉拒，說明利益需要迴避的考量，請他們見諒</w:t>
       </w:r>
       <w:r>
         <w:rPr>
           <w:rFonts w:hint="eastAsia"/>
-        </w:rPr>
-        <w:t xml:space="preserve"> </w:t>
-      </w:r>
-      <w:r>
+          <w:color w:val="F2F2F2" w:themeColor="background1" w:themeShade="F2"/>
+        </w:rPr>
+        <w:t xml:space="preserve"> </w:t>
+      </w:r>
+      <w:r>
+        <w:rPr>
+          <w:color w:val="F2F2F2" w:themeColor="background1" w:themeShade="F2"/>
+        </w:rPr>
         <w:t>②既然是親</w:t>
       </w:r>
       <w:r>
+        <w:rPr>
+          <w:color w:val="F2F2F2" w:themeColor="background1" w:themeShade="F2"/>
+        </w:rPr>
         <w:lastRenderedPageBreak/>
         <w:t xml:space="preserve">朋好友，就應該互相幫忙 ③建議親朋好友將產品折扣，折扣部分歸於自己，就會採購 ④可以暗中地幫忙親朋好友，進行採購，不要被發現有親友關係便可 。 </w:t>
       </w:r>
@@ -845,33 +1354,71 @@
         </w:numPr>
         <w:spacing w:beforeLines="50" w:before="120" w:afterLines="50" w:after="120"/>
         <w:ind w:right="44" w:hanging="554"/>
-      </w:pPr>
-      <w:r>
+        <w:rPr>
+          <w:color w:val="F2F2F2" w:themeColor="background1" w:themeShade="F2"/>
+        </w:rPr>
+      </w:pPr>
+      <w:r>
+        <w:rPr>
+          <w:color w:val="F2F2F2" w:themeColor="background1" w:themeShade="F2"/>
+        </w:rPr>
         <w:t>(3)</w:t>
       </w:r>
       <w:r>
-        <w:t xml:space="preserve"> </w:t>
-      </w:r>
-      <w:r>
-        <w:t xml:space="preserve">小美是公司的業務經理，有一天巧遇國中同班的死黨小林，發現他是公司的下游廠商老闆。最近小美處理一件公司的招標案件，小林的公司也在其中，私下約小美見面，請求她提供這次招標案的底標，並馬上要給予幾十萬元的前謝金，請問小美該怎麼辦？ ①退回錢，並告訴小林都是老朋友，一定會全力幫忙 ②收下錢，將錢拿出來給單位同事們分紅 ③應該堅決拒絕，並避免每次見面都與小林談論相關業務問題 ④朋友一場，給他一個比較接近底標的金額，反正又不是正確的，所以沒關係 。 </w:t>
-      </w:r>
-    </w:p>
-    <w:p>
-      <w:pPr>
-        <w:numPr>
-          <w:ilvl w:val="0"/>
-          <w:numId w:val="1"/>
-        </w:numPr>
-        <w:spacing w:beforeLines="50" w:before="120" w:afterLines="50" w:after="120"/>
-        <w:ind w:right="44" w:hanging="554"/>
-      </w:pPr>
-      <w:r>
+        <w:rPr>
+          <w:color w:val="F2F2F2" w:themeColor="background1" w:themeShade="F2"/>
+        </w:rPr>
+        <w:t xml:space="preserve"> </w:t>
+      </w:r>
+      <w:r>
+        <w:rPr>
+          <w:color w:val="F2F2F2" w:themeColor="background1" w:themeShade="F2"/>
+        </w:rPr>
+        <w:t>小美是公司的業務經理，有一天巧遇國中同班的死黨小林，發現他是公司的下游廠商老闆。最近小美處理一件公司的招標案件，小林的公司也在其中，私下約小美見面，請求她提供這次招標案的底標，並馬上要給予幾十萬元的前謝金，請問</w:t>
+      </w:r>
+      <w:proofErr w:type="gramStart"/>
+      <w:r>
+        <w:rPr>
+          <w:color w:val="F2F2F2" w:themeColor="background1" w:themeShade="F2"/>
+        </w:rPr>
+        <w:t>小美該怎麼辦</w:t>
+      </w:r>
+      <w:proofErr w:type="gramEnd"/>
+      <w:r>
+        <w:rPr>
+          <w:color w:val="F2F2F2" w:themeColor="background1" w:themeShade="F2"/>
+        </w:rPr>
+        <w:t xml:space="preserve">？ ①退回錢，並告訴小林都是老朋友，一定會全力幫忙 ②收下錢，將錢拿出來給單位同事們分紅 ③應該堅決拒絕，並避免每次見面都與小林談論相關業務問題 ④朋友一場，給他一個比較接近底標的金額，反正又不是正確的，所以沒關係 。 </w:t>
+      </w:r>
+    </w:p>
+    <w:p>
+      <w:pPr>
+        <w:numPr>
+          <w:ilvl w:val="0"/>
+          <w:numId w:val="1"/>
+        </w:numPr>
+        <w:spacing w:beforeLines="50" w:before="120" w:afterLines="50" w:after="120"/>
+        <w:ind w:right="44" w:hanging="554"/>
+        <w:rPr>
+          <w:color w:val="F2F2F2" w:themeColor="background1" w:themeShade="F2"/>
+        </w:rPr>
+      </w:pPr>
+      <w:r>
+        <w:rPr>
+          <w:color w:val="F2F2F2" w:themeColor="background1" w:themeShade="F2"/>
+        </w:rPr>
         <w:t>(3)</w:t>
       </w:r>
       <w:r>
-        <w:t xml:space="preserve"> </w:t>
-      </w:r>
-      <w:r>
+        <w:rPr>
+          <w:color w:val="F2F2F2" w:themeColor="background1" w:themeShade="F2"/>
+        </w:rPr>
+        <w:t xml:space="preserve"> </w:t>
+      </w:r>
+      <w:r>
+        <w:rPr>
+          <w:color w:val="F2F2F2" w:themeColor="background1" w:themeShade="F2"/>
+        </w:rPr>
         <w:t xml:space="preserve">公司發給每人一台平板電腦提供業務上使用，但是發現根本很少在使用，為了讓它有效的利用，所以將它拿回家給親人使用，這樣的行為是 ①可以的，這樣就不用花錢買 ②可以的，因為，反正如果放在那裡不用它，是浪費資源的 ③不可以的，因為這是公司的財產，不能私用 ④不可以的，因為使用年限未到，如果年限到報廢了，便可以拿回家 。 </w:t>
       </w:r>
     </w:p>
@@ -883,14 +1430,26 @@
         </w:numPr>
         <w:spacing w:beforeLines="50" w:before="120" w:afterLines="50" w:after="120"/>
         <w:ind w:right="44" w:hanging="554"/>
-      </w:pPr>
-      <w:r>
+        <w:rPr>
+          <w:color w:val="F2F2F2" w:themeColor="background1" w:themeShade="F2"/>
+        </w:rPr>
+      </w:pPr>
+      <w:r>
+        <w:rPr>
+          <w:color w:val="F2F2F2" w:themeColor="background1" w:themeShade="F2"/>
+        </w:rPr>
         <w:t>(3)</w:t>
       </w:r>
       <w:r>
-        <w:t xml:space="preserve"> </w:t>
-      </w:r>
-      <w:r>
+        <w:rPr>
+          <w:color w:val="F2F2F2" w:themeColor="background1" w:themeShade="F2"/>
+        </w:rPr>
+        <w:t xml:space="preserve"> </w:t>
+      </w:r>
+      <w:r>
+        <w:rPr>
+          <w:color w:val="F2F2F2" w:themeColor="background1" w:themeShade="F2"/>
+        </w:rPr>
         <w:t xml:space="preserve">公司的車子，假日又沒人使用，你是鑰匙保管者，請問假日可以開出去嗎？ ①可以，只要付費加油即可 ②可以，反正假日不影響公務 ③不可以，因為是公司的，並非私人擁有 ④不可以，應該是讓公司想要使用的員工，輪流使用才可 。 </w:t>
       </w:r>
     </w:p>
@@ -902,33 +1461,99 @@
         </w:numPr>
         <w:spacing w:beforeLines="50" w:before="120" w:afterLines="50" w:after="120"/>
         <w:ind w:right="44" w:hanging="554"/>
-      </w:pPr>
-      <w:r>
+        <w:rPr>
+          <w:color w:val="F2F2F2" w:themeColor="background1" w:themeShade="F2"/>
+        </w:rPr>
+      </w:pPr>
+      <w:r>
+        <w:rPr>
+          <w:color w:val="F2F2F2" w:themeColor="background1" w:themeShade="F2"/>
+        </w:rPr>
         <w:t>(4)</w:t>
       </w:r>
       <w:r>
-        <w:t xml:space="preserve"> </w:t>
-      </w:r>
-      <w:r>
-        <w:t xml:space="preserve">阿哲是財經線的新聞記者，某次採訪中得知 A 公司在一個月內將有一個大的併購案，這個併購案顯示公司的財力，且能讓 A 公司股價往上飆升。請問阿哲得知此消息後，可以立刻購買該公司的股票嗎？ ①可以，有錢大家賺 ②可以，這是我努力獲得的消息 ③可以，不賺白不賺 ④不可以，屬於內線消息，必須保持記者之操守，不得洩漏 。 </w:t>
-      </w:r>
-    </w:p>
-    <w:p>
-      <w:pPr>
-        <w:numPr>
-          <w:ilvl w:val="0"/>
-          <w:numId w:val="1"/>
-        </w:numPr>
-        <w:spacing w:beforeLines="50" w:before="120" w:afterLines="50" w:after="120"/>
-        <w:ind w:right="44" w:hanging="554"/>
-      </w:pPr>
-      <w:r>
+        <w:rPr>
+          <w:color w:val="F2F2F2" w:themeColor="background1" w:themeShade="F2"/>
+        </w:rPr>
+        <w:t xml:space="preserve"> </w:t>
+      </w:r>
+      <w:r>
+        <w:rPr>
+          <w:color w:val="F2F2F2" w:themeColor="background1" w:themeShade="F2"/>
+        </w:rPr>
+        <w:t>阿哲是財經線的新聞記者，某次採訪中得知 A 公司在一個月內將有一個大的</w:t>
+      </w:r>
+      <w:proofErr w:type="gramStart"/>
+      <w:r>
+        <w:rPr>
+          <w:color w:val="F2F2F2" w:themeColor="background1" w:themeShade="F2"/>
+        </w:rPr>
+        <w:t>併</w:t>
+      </w:r>
+      <w:proofErr w:type="gramEnd"/>
+      <w:r>
+        <w:rPr>
+          <w:color w:val="F2F2F2" w:themeColor="background1" w:themeShade="F2"/>
+        </w:rPr>
+        <w:t>購案，這個</w:t>
+      </w:r>
+      <w:proofErr w:type="gramStart"/>
+      <w:r>
+        <w:rPr>
+          <w:color w:val="F2F2F2" w:themeColor="background1" w:themeShade="F2"/>
+        </w:rPr>
+        <w:t>併</w:t>
+      </w:r>
+      <w:proofErr w:type="gramEnd"/>
+      <w:r>
+        <w:rPr>
+          <w:color w:val="F2F2F2" w:themeColor="background1" w:themeShade="F2"/>
+        </w:rPr>
+        <w:t>購案顯示公司的財力，且能讓 A 公司股價往上</w:t>
+      </w:r>
+      <w:proofErr w:type="gramStart"/>
+      <w:r>
+        <w:rPr>
+          <w:color w:val="F2F2F2" w:themeColor="background1" w:themeShade="F2"/>
+        </w:rPr>
+        <w:t>飆</w:t>
+      </w:r>
+      <w:proofErr w:type="gramEnd"/>
+      <w:r>
+        <w:rPr>
+          <w:color w:val="F2F2F2" w:themeColor="background1" w:themeShade="F2"/>
+        </w:rPr>
+        <w:t xml:space="preserve">升。請問阿哲得知此消息後，可以立刻購買該公司的股票嗎？ ①可以，有錢大家賺 ②可以，這是我努力獲得的消息 ③可以，不賺白不賺 ④不可以，屬於內線消息，必須保持記者之操守，不得洩漏 。 </w:t>
+      </w:r>
+    </w:p>
+    <w:p>
+      <w:pPr>
+        <w:numPr>
+          <w:ilvl w:val="0"/>
+          <w:numId w:val="1"/>
+        </w:numPr>
+        <w:spacing w:beforeLines="50" w:before="120" w:afterLines="50" w:after="120"/>
+        <w:ind w:right="44" w:hanging="554"/>
+        <w:rPr>
+          <w:color w:val="F2F2F2" w:themeColor="background1" w:themeShade="F2"/>
+        </w:rPr>
+      </w:pPr>
+      <w:r>
+        <w:rPr>
+          <w:color w:val="F2F2F2" w:themeColor="background1" w:themeShade="F2"/>
+        </w:rPr>
         <w:t>(4)</w:t>
       </w:r>
       <w:r>
-        <w:t xml:space="preserve"> </w:t>
-      </w:r>
-      <w:r>
+        <w:rPr>
+          <w:color w:val="F2F2F2" w:themeColor="background1" w:themeShade="F2"/>
+        </w:rPr>
+        <w:t xml:space="preserve"> </w:t>
+      </w:r>
+      <w:r>
+        <w:rPr>
+          <w:color w:val="F2F2F2" w:themeColor="background1" w:themeShade="F2"/>
+        </w:rPr>
         <w:t xml:space="preserve">與公務機關接洽業務時，下列敘述何者「正確」？ ①沒有要求公務員違背職務，花錢疏通而已，並不違法 ②唆使公務機關承辦採購人員配合浮報價額，僅屬偽造文書行為 ③口頭允諾行賄金額但還沒送錢，尚不構成犯罪 ④與公務員同謀之共犯，即便不具公務員身分，仍會依據貪污治罪條例處刑 。 </w:t>
       </w:r>
     </w:p>
@@ -940,14 +1565,26 @@
         </w:numPr>
         <w:spacing w:beforeLines="50" w:before="120" w:afterLines="50" w:after="120"/>
         <w:ind w:right="44" w:hanging="554"/>
-      </w:pPr>
-      <w:r>
+        <w:rPr>
+          <w:color w:val="F2F2F2" w:themeColor="background1" w:themeShade="F2"/>
+        </w:rPr>
+      </w:pPr>
+      <w:r>
+        <w:rPr>
+          <w:color w:val="F2F2F2" w:themeColor="background1" w:themeShade="F2"/>
+        </w:rPr>
         <w:t>(3)</w:t>
       </w:r>
       <w:r>
-        <w:t xml:space="preserve"> </w:t>
-      </w:r>
-      <w:r>
+        <w:rPr>
+          <w:color w:val="F2F2F2" w:themeColor="background1" w:themeShade="F2"/>
+        </w:rPr>
+        <w:t xml:space="preserve"> </w:t>
+      </w:r>
+      <w:r>
+        <w:rPr>
+          <w:color w:val="F2F2F2" w:themeColor="background1" w:themeShade="F2"/>
+        </w:rPr>
         <w:t xml:space="preserve">公司總務部門員工因辦理政府採購案，而與公務機關人員有互動時，下列敘述何者「正確」？ ①對於機關承辦人，經常給予不超過新台幣 5 佰元以下的好處，無論有無對價關係，對方收受皆符合廉政倫理規範 ②招待驗收人員至餐廳用餐，是慣例屬社交禮貌行為 ③因民俗節慶公開舉辦之活動，機關公務員在簽准後可受邀參與 ④以借貸名義，餽贈財物予公務員，即可規避刑事追究 。 </w:t>
       </w:r>
     </w:p>
@@ -959,21 +1596,36 @@
         </w:numPr>
         <w:spacing w:beforeLines="50" w:before="120" w:afterLines="50" w:after="120"/>
         <w:ind w:right="44" w:hanging="554"/>
-      </w:pPr>
-      <w:r>
-        <w:t xml:space="preserve">(1) 與公務機關有業務往來構成職務利害關係者，下列敘述何者「正確」？ ① 將餽贈之財物請公務員父母代轉，該公務員亦已違反規定 ②與公務機關承辦人飲宴應酬為增進基本關係的必要方法 ③高級茶葉低價售予有利害關係之承辦公務員，有價購行為就不算違反法規 ④機關公務員藉子女婚宴廣邀業務往來廠商之行為，並無不妥 。 </w:t>
-      </w:r>
-    </w:p>
-    <w:p>
-      <w:pPr>
-        <w:numPr>
-          <w:ilvl w:val="0"/>
-          <w:numId w:val="1"/>
-        </w:numPr>
-        <w:spacing w:beforeLines="50" w:before="120" w:afterLines="50" w:after="120"/>
-        <w:ind w:right="44" w:hanging="554"/>
-      </w:pPr>
-      <w:r>
+        <w:rPr>
+          <w:color w:val="F2F2F2" w:themeColor="background1" w:themeShade="F2"/>
+        </w:rPr>
+      </w:pPr>
+      <w:r>
+        <w:rPr>
+          <w:color w:val="F2F2F2" w:themeColor="background1" w:themeShade="F2"/>
+        </w:rPr>
+        <w:t>(1)</w:t>
+      </w:r>
+      <w:r>
+        <w:rPr>
+          <w:color w:val="F2F2F2" w:themeColor="background1" w:themeShade="F2"/>
+        </w:rPr>
+        <w:t xml:space="preserve"> 與公務機關有業務往來構成職務利害關係者，下列敘述何者「正確」？ ① 將餽贈之財物請公務員父母代轉，該公務員亦已違反規定 ②與公務機關承辦人飲宴應酬為增進基本關係的必要方法 ③高級茶葉低價售予有利害關係之承辦公務員，有價購行為就不算違反法規 ④機關公務員藉子女婚宴廣邀業務往來廠商之行為，並無不妥 。 </w:t>
+      </w:r>
+    </w:p>
+    <w:p>
+      <w:pPr>
+        <w:numPr>
+          <w:ilvl w:val="0"/>
+          <w:numId w:val="1"/>
+        </w:numPr>
+        <w:spacing w:beforeLines="50" w:before="120" w:afterLines="50" w:after="120"/>
+        <w:ind w:right="44" w:hanging="554"/>
+      </w:pPr>
+      <w:r>
+        <w:rPr>
+          <w:color w:val="F2F2F2" w:themeColor="background1" w:themeShade="F2"/>
+        </w:rPr>
         <w:t>(4)</w:t>
       </w:r>
       <w:r>
@@ -991,53 +1643,117 @@
         </w:numPr>
         <w:spacing w:beforeLines="50" w:before="120" w:afterLines="50" w:after="120"/>
         <w:ind w:right="44" w:hanging="554"/>
-      </w:pPr>
-      <w:r>
+        <w:rPr>
+          <w:color w:val="F2F2F2" w:themeColor="background1" w:themeShade="F2"/>
+        </w:rPr>
+      </w:pPr>
+      <w:r>
+        <w:rPr>
+          <w:color w:val="F2F2F2" w:themeColor="background1" w:themeShade="F2"/>
+        </w:rPr>
         <w:lastRenderedPageBreak/>
         <w:t>(4)</w:t>
       </w:r>
       <w:r>
-        <w:t xml:space="preserve"> </w:t>
-      </w:r>
-      <w:r>
-        <w:t xml:space="preserve">廠商某甲承攬公共工程，工程進行期間，甲與其工程人員經常招待該公共工程委辦機關之監工及驗收之公務員喝花酒或招待出國旅遊，下列敘述何者正確？ ①公務員若沒有收現金，就沒有罪 ②只要工程沒有問題，某甲與監工及驗收等相關公務員就沒有犯罪 ③因為不是送錢，所以都沒有犯罪 ④某甲與相關公務員均已涉嫌觸犯貪污治罪條例 。 </w:t>
-      </w:r>
-    </w:p>
-    <w:p>
-      <w:pPr>
-        <w:numPr>
-          <w:ilvl w:val="0"/>
-          <w:numId w:val="1"/>
-        </w:numPr>
-        <w:spacing w:beforeLines="50" w:before="120" w:afterLines="50" w:after="120"/>
-        <w:ind w:right="44" w:hanging="554"/>
-      </w:pPr>
-      <w:r>
+        <w:rPr>
+          <w:color w:val="F2F2F2" w:themeColor="background1" w:themeShade="F2"/>
+        </w:rPr>
+        <w:t xml:space="preserve"> </w:t>
+      </w:r>
+      <w:r>
+        <w:rPr>
+          <w:color w:val="F2F2F2" w:themeColor="background1" w:themeShade="F2"/>
+        </w:rPr>
+        <w:t>廠商某甲承攬公共工程，工程進行</w:t>
+      </w:r>
+      <w:proofErr w:type="gramStart"/>
+      <w:r>
+        <w:rPr>
+          <w:color w:val="F2F2F2" w:themeColor="background1" w:themeShade="F2"/>
+        </w:rPr>
+        <w:t>期間，</w:t>
+      </w:r>
+      <w:proofErr w:type="gramEnd"/>
+      <w:r>
+        <w:rPr>
+          <w:color w:val="F2F2F2" w:themeColor="background1" w:themeShade="F2"/>
+        </w:rPr>
+        <w:t xml:space="preserve">甲與其工程人員經常招待該公共工程委辦機關之監工及驗收之公務員喝花酒或招待出國旅遊，下列敘述何者正確？ ①公務員若沒有收現金，就沒有罪 ②只要工程沒有問題，某甲與監工及驗收等相關公務員就沒有犯罪 ③因為不是送錢，所以都沒有犯罪 ④某甲與相關公務員均已涉嫌觸犯貪污治罪條例 。 </w:t>
+      </w:r>
+    </w:p>
+    <w:p>
+      <w:pPr>
+        <w:numPr>
+          <w:ilvl w:val="0"/>
+          <w:numId w:val="1"/>
+        </w:numPr>
+        <w:spacing w:beforeLines="50" w:before="120" w:afterLines="50" w:after="120"/>
+        <w:ind w:right="44" w:hanging="554"/>
+        <w:rPr>
+          <w:color w:val="F2F2F2" w:themeColor="background1" w:themeShade="F2"/>
+        </w:rPr>
+      </w:pPr>
+      <w:r>
+        <w:rPr>
+          <w:color w:val="F2F2F2" w:themeColor="background1" w:themeShade="F2"/>
+        </w:rPr>
         <w:t>(1)</w:t>
       </w:r>
       <w:r>
-        <w:t xml:space="preserve"> </w:t>
-      </w:r>
-      <w:r>
-        <w:t xml:space="preserve">行（受）賄罪成立要素之一為具有對價關係，而作為公務員職務之對價有「賄賂」或「不正利益」，下列何者「不」屬於「賄賂」或「不正利益」？ ①開工邀請公務員觀禮 ②送百貨公司大額禮券 ③免除債務 ④招待吃米其林等級之高檔大餐 。 </w:t>
-      </w:r>
-    </w:p>
-    <w:p>
-      <w:pPr>
-        <w:numPr>
-          <w:ilvl w:val="0"/>
-          <w:numId w:val="1"/>
-        </w:numPr>
-        <w:spacing w:beforeLines="50" w:before="120" w:afterLines="50" w:after="120"/>
-        <w:ind w:right="44" w:hanging="554"/>
-      </w:pPr>
-      <w:r>
+        <w:rPr>
+          <w:color w:val="F2F2F2" w:themeColor="background1" w:themeShade="F2"/>
+        </w:rPr>
+        <w:t xml:space="preserve"> </w:t>
+      </w:r>
+      <w:r>
+        <w:rPr>
+          <w:color w:val="F2F2F2" w:themeColor="background1" w:themeShade="F2"/>
+        </w:rPr>
+        <w:t>行（受）</w:t>
+      </w:r>
+      <w:proofErr w:type="gramStart"/>
+      <w:r>
+        <w:rPr>
+          <w:color w:val="F2F2F2" w:themeColor="background1" w:themeShade="F2"/>
+        </w:rPr>
+        <w:t>賄罪成立</w:t>
+      </w:r>
+      <w:proofErr w:type="gramEnd"/>
+      <w:r>
+        <w:rPr>
+          <w:color w:val="F2F2F2" w:themeColor="background1" w:themeShade="F2"/>
+        </w:rPr>
+        <w:t xml:space="preserve">要素之一為具有對價關係，而作為公務員職務之對價有「賄賂」或「不正利益」，下列何者「不」屬於「賄賂」或「不正利益」？ ①開工邀請公務員觀禮 ②送百貨公司大額禮券 ③免除債務 ④招待吃米其林等級之高檔大餐 。 </w:t>
+      </w:r>
+    </w:p>
+    <w:p>
+      <w:pPr>
+        <w:numPr>
+          <w:ilvl w:val="0"/>
+          <w:numId w:val="1"/>
+        </w:numPr>
+        <w:spacing w:beforeLines="50" w:before="120" w:afterLines="50" w:after="120"/>
+        <w:ind w:right="44" w:hanging="554"/>
+        <w:rPr>
+          <w:color w:val="F2F2F2" w:themeColor="background1" w:themeShade="F2"/>
+        </w:rPr>
+      </w:pPr>
+      <w:r>
+        <w:rPr>
+          <w:color w:val="F2F2F2" w:themeColor="background1" w:themeShade="F2"/>
+        </w:rPr>
         <w:t>(1)</w:t>
       </w:r>
       <w:r>
-        <w:t xml:space="preserve"> </w:t>
-      </w:r>
-      <w:r>
+        <w:rPr>
+          <w:color w:val="F2F2F2" w:themeColor="background1" w:themeShade="F2"/>
+        </w:rPr>
+        <w:t xml:space="preserve"> </w:t>
+      </w:r>
+      <w:r>
+        <w:rPr>
+          <w:color w:val="F2F2F2" w:themeColor="background1" w:themeShade="F2"/>
+        </w:rPr>
         <w:t xml:space="preserve">下列關於政府採購人員之敘述，何者為正確？ ①不可主動向廠商求取，偶發地收取廠商致贈價值在新臺幣 500 元以下之廣告物、促銷品、紀念品 ② 要求廠商提供與採購無關之額外服務 ③利用職務關係向廠商借貸 ④利用職務關係媒介親友至廠商處所任職 。 </w:t>
       </w:r>
     </w:p>
@@ -1049,14 +1765,26 @@
         </w:numPr>
         <w:spacing w:beforeLines="50" w:before="120" w:afterLines="50" w:after="120"/>
         <w:ind w:right="44" w:hanging="554"/>
-      </w:pPr>
-      <w:r>
+        <w:rPr>
+          <w:color w:val="F2F2F2" w:themeColor="background1" w:themeShade="F2"/>
+        </w:rPr>
+      </w:pPr>
+      <w:r>
+        <w:rPr>
+          <w:color w:val="F2F2F2" w:themeColor="background1" w:themeShade="F2"/>
+        </w:rPr>
         <w:t>(4)</w:t>
       </w:r>
       <w:r>
-        <w:t xml:space="preserve"> </w:t>
-      </w:r>
-      <w:r>
+        <w:rPr>
+          <w:color w:val="F2F2F2" w:themeColor="background1" w:themeShade="F2"/>
+        </w:rPr>
+        <w:t xml:space="preserve"> </w:t>
+      </w:r>
+      <w:r>
+        <w:rPr>
+          <w:color w:val="F2F2F2" w:themeColor="background1" w:themeShade="F2"/>
+        </w:rPr>
         <w:t xml:space="preserve">下列有關貪腐的敘述何者錯誤？ ①貪腐會危害永續發展和法治 ②貪腐會破壞民主體制及價值觀 ③貪腐會破壞倫理道德與正義 ④貪腐有助降低企業的經營成本 。 </w:t>
       </w:r>
     </w:p>
@@ -1068,14 +1796,26 @@
         </w:numPr>
         <w:spacing w:beforeLines="50" w:before="120" w:afterLines="50" w:after="120"/>
         <w:ind w:right="44" w:hanging="554"/>
-      </w:pPr>
-      <w:r>
+        <w:rPr>
+          <w:color w:val="F2F2F2" w:themeColor="background1" w:themeShade="F2"/>
+        </w:rPr>
+      </w:pPr>
+      <w:r>
+        <w:rPr>
+          <w:color w:val="F2F2F2" w:themeColor="background1" w:themeShade="F2"/>
+        </w:rPr>
         <w:t>(3)</w:t>
       </w:r>
       <w:r>
-        <w:t xml:space="preserve"> </w:t>
-      </w:r>
-      <w:r>
+        <w:rPr>
+          <w:color w:val="F2F2F2" w:themeColor="background1" w:themeShade="F2"/>
+        </w:rPr>
+        <w:t xml:space="preserve"> </w:t>
+      </w:r>
+      <w:r>
+        <w:rPr>
+          <w:color w:val="F2F2F2" w:themeColor="background1" w:themeShade="F2"/>
+        </w:rPr>
         <w:t xml:space="preserve">下列有關促進參與預防和打擊貪腐的敘述何者錯誤？ ①提高政府決策透明度 ②廉政機構應受理匿名檢舉 ③儘量不讓公民團體、非政府組織與社區組織有參與的機會 ④向社會大眾及學生宣導貪腐「零容忍」觀念 。 </w:t>
       </w:r>
     </w:p>
@@ -1087,14 +1827,26 @@
         </w:numPr>
         <w:spacing w:beforeLines="50" w:before="120" w:afterLines="50" w:after="120"/>
         <w:ind w:right="44" w:hanging="554"/>
-      </w:pPr>
-      <w:r>
+        <w:rPr>
+          <w:color w:val="F2F2F2" w:themeColor="background1" w:themeShade="F2"/>
+        </w:rPr>
+      </w:pPr>
+      <w:r>
+        <w:rPr>
+          <w:color w:val="F2F2F2" w:themeColor="background1" w:themeShade="F2"/>
+        </w:rPr>
         <w:t>(4)</w:t>
       </w:r>
       <w:r>
-        <w:t xml:space="preserve"> </w:t>
-      </w:r>
-      <w:r>
+        <w:rPr>
+          <w:color w:val="F2F2F2" w:themeColor="background1" w:themeShade="F2"/>
+        </w:rPr>
+        <w:t xml:space="preserve"> </w:t>
+      </w:r>
+      <w:r>
+        <w:rPr>
+          <w:color w:val="F2F2F2" w:themeColor="background1" w:themeShade="F2"/>
+        </w:rPr>
         <w:t xml:space="preserve">下列何者不是設置反貪腐專責機構須具備的必要條件？ ①賦予該機構必要的獨立性 ②使該機構的工作人員行使職權不會受到不當干預 ③提供該機構必要的資源、專職工作人員及必要培訓 ④賦予該機構的工作人員有權力可隨時逮捕貪污嫌疑人 。 </w:t>
       </w:r>
     </w:p>
@@ -1106,14 +1858,26 @@
         </w:numPr>
         <w:spacing w:beforeLines="50" w:before="120" w:afterLines="50" w:after="120"/>
         <w:ind w:right="44" w:hanging="554"/>
-      </w:pPr>
-      <w:r>
+        <w:rPr>
+          <w:color w:val="F2F2F2" w:themeColor="background1" w:themeShade="F2"/>
+        </w:rPr>
+      </w:pPr>
+      <w:r>
+        <w:rPr>
+          <w:color w:val="F2F2F2" w:themeColor="background1" w:themeShade="F2"/>
+        </w:rPr>
         <w:t>(2)</w:t>
       </w:r>
       <w:r>
-        <w:t xml:space="preserve"> </w:t>
-      </w:r>
-      <w:r>
+        <w:rPr>
+          <w:color w:val="F2F2F2" w:themeColor="background1" w:themeShade="F2"/>
+        </w:rPr>
+        <w:t xml:space="preserve"> </w:t>
+      </w:r>
+      <w:r>
+        <w:rPr>
+          <w:color w:val="F2F2F2" w:themeColor="background1" w:themeShade="F2"/>
+        </w:rPr>
         <w:t xml:space="preserve">為建立良好之公司治理制度，公司內部宜納入何種檢舉人制度？ ①告訴乃論制度 ②吹哨者（whistleblower）管道及保護制度 ③不告不理制度 ④非告訴乃論制度 。 </w:t>
       </w:r>
     </w:p>
@@ -1127,6 +1891,9 @@
         <w:ind w:right="44" w:hanging="554"/>
       </w:pPr>
       <w:r>
+        <w:rPr>
+          <w:color w:val="F2F2F2" w:themeColor="background1" w:themeShade="F2"/>
+        </w:rPr>
         <w:t>(2)</w:t>
       </w:r>
       <w:r>
@@ -1144,53 +1911,115 @@
         </w:numPr>
         <w:spacing w:beforeLines="50" w:before="120" w:afterLines="50" w:after="120"/>
         <w:ind w:right="44" w:hanging="554"/>
-      </w:pPr>
-      <w:r>
-        <w:t xml:space="preserve">(4) 公司訂定誠信經營守則時，不包括下列何者？ ①禁止不誠信行為 ②禁止行賄及收賄 ③禁止提供不法政治獻金 ④禁止適當慈善捐助或贊助 。 </w:t>
-      </w:r>
-    </w:p>
-    <w:p>
-      <w:pPr>
-        <w:numPr>
-          <w:ilvl w:val="0"/>
-          <w:numId w:val="1"/>
-        </w:numPr>
-        <w:spacing w:beforeLines="50" w:before="120" w:afterLines="50" w:after="120"/>
-        <w:ind w:right="44" w:hanging="554"/>
-      </w:pPr>
-      <w:r>
-        <w:t xml:space="preserve">(3) 檢舉人應以何種方式檢舉貪污瀆職始能核給獎金？ ①匿名 ②委託他人檢舉 ③以真實姓名檢舉 ④以他人名義檢舉 。 </w:t>
-      </w:r>
-    </w:p>
-    <w:p>
-      <w:pPr>
-        <w:numPr>
-          <w:ilvl w:val="0"/>
-          <w:numId w:val="1"/>
-        </w:numPr>
-        <w:spacing w:beforeLines="50" w:before="120" w:afterLines="50" w:after="120"/>
-        <w:ind w:right="44" w:hanging="554"/>
-      </w:pPr>
-      <w:r>
-        <w:t xml:space="preserve">(4) 我國制定何種法律以保護刑事案件之證人，使其勇於出面作證，俾利犯罪之偵查、審判？ ①貪污治罪條例 ②刑事訴訟法 ③行政程序法 ④證人保護法 。 </w:t>
-      </w:r>
-    </w:p>
-    <w:p>
-      <w:pPr>
-        <w:numPr>
-          <w:ilvl w:val="0"/>
-          <w:numId w:val="1"/>
-        </w:numPr>
-        <w:spacing w:beforeLines="50" w:before="120" w:afterLines="50" w:after="120"/>
-        <w:ind w:right="44" w:hanging="554"/>
-      </w:pPr>
-      <w:r>
+        <w:rPr>
+          <w:color w:val="F2F2F2" w:themeColor="background1" w:themeShade="F2"/>
+        </w:rPr>
+      </w:pPr>
+      <w:r>
+        <w:rPr>
+          <w:color w:val="F2F2F2" w:themeColor="background1" w:themeShade="F2"/>
+        </w:rPr>
+        <w:t>(4)</w:t>
+      </w:r>
+      <w:r>
+        <w:rPr>
+          <w:color w:val="F2F2F2" w:themeColor="background1" w:themeShade="F2"/>
+        </w:rPr>
+        <w:t xml:space="preserve"> 公司訂定誠信經營守則時，不包括下列何者？ ①禁止不誠信行為 ②禁止行賄及收賄 ③禁止提供不法政治獻金 ④禁止適當慈善捐助或贊助 。 </w:t>
+      </w:r>
+    </w:p>
+    <w:p>
+      <w:pPr>
+        <w:numPr>
+          <w:ilvl w:val="0"/>
+          <w:numId w:val="1"/>
+        </w:numPr>
+        <w:spacing w:beforeLines="50" w:before="120" w:afterLines="50" w:after="120"/>
+        <w:ind w:right="44" w:hanging="554"/>
+        <w:rPr>
+          <w:color w:val="F2F2F2" w:themeColor="background1" w:themeShade="F2"/>
+        </w:rPr>
+      </w:pPr>
+      <w:r>
+        <w:rPr>
+          <w:color w:val="F2F2F2" w:themeColor="background1" w:themeShade="F2"/>
+        </w:rPr>
+        <w:t>(3)</w:t>
+      </w:r>
+      <w:r>
+        <w:rPr>
+          <w:color w:val="F2F2F2" w:themeColor="background1" w:themeShade="F2"/>
+        </w:rPr>
+        <w:t xml:space="preserve"> 檢舉人應以何種方式檢舉貪污瀆職始能核給獎金？ ①匿名 ②委託他人檢舉 ③以真實姓名檢舉 ④以他人名義檢舉 。 </w:t>
+      </w:r>
+    </w:p>
+    <w:p>
+      <w:pPr>
+        <w:numPr>
+          <w:ilvl w:val="0"/>
+          <w:numId w:val="1"/>
+        </w:numPr>
+        <w:spacing w:beforeLines="50" w:before="120" w:afterLines="50" w:after="120"/>
+        <w:ind w:right="44" w:hanging="554"/>
+        <w:rPr>
+          <w:color w:val="F2F2F2" w:themeColor="background1" w:themeShade="F2"/>
+        </w:rPr>
+      </w:pPr>
+      <w:r>
+        <w:rPr>
+          <w:color w:val="F2F2F2" w:themeColor="background1" w:themeShade="F2"/>
+        </w:rPr>
+        <w:t>(4)</w:t>
+      </w:r>
+      <w:r>
+        <w:rPr>
+          <w:color w:val="F2F2F2" w:themeColor="background1" w:themeShade="F2"/>
+        </w:rPr>
+        <w:t xml:space="preserve"> 我國制定何種法律以保護刑事案件之證人，使其勇於出面作證，</w:t>
+      </w:r>
+      <w:proofErr w:type="gramStart"/>
+      <w:r>
+        <w:rPr>
+          <w:color w:val="F2F2F2" w:themeColor="background1" w:themeShade="F2"/>
+        </w:rPr>
+        <w:t>俾</w:t>
+      </w:r>
+      <w:proofErr w:type="gramEnd"/>
+      <w:r>
+        <w:rPr>
+          <w:color w:val="F2F2F2" w:themeColor="background1" w:themeShade="F2"/>
+        </w:rPr>
+        <w:t xml:space="preserve">利犯罪之偵查、審判？ ①貪污治罪條例 ②刑事訴訟法 ③行政程序法 ④證人保護法 。 </w:t>
+      </w:r>
+    </w:p>
+    <w:p>
+      <w:pPr>
+        <w:numPr>
+          <w:ilvl w:val="0"/>
+          <w:numId w:val="1"/>
+        </w:numPr>
+        <w:spacing w:beforeLines="50" w:before="120" w:afterLines="50" w:after="120"/>
+        <w:ind w:right="44" w:hanging="554"/>
+        <w:rPr>
+          <w:color w:val="F2F2F2" w:themeColor="background1" w:themeShade="F2"/>
+        </w:rPr>
+      </w:pPr>
+      <w:r>
+        <w:rPr>
+          <w:color w:val="F2F2F2" w:themeColor="background1" w:themeShade="F2"/>
+        </w:rPr>
         <w:t>(1)</w:t>
       </w:r>
       <w:r>
-        <w:t xml:space="preserve"> </w:t>
-      </w:r>
-      <w:r>
+        <w:rPr>
+          <w:color w:val="F2F2F2" w:themeColor="background1" w:themeShade="F2"/>
+        </w:rPr>
+        <w:t xml:space="preserve"> </w:t>
+      </w:r>
+      <w:r>
+        <w:rPr>
+          <w:color w:val="F2F2F2" w:themeColor="background1" w:themeShade="F2"/>
+        </w:rPr>
         <w:t xml:space="preserve">下列何者「非」屬公司對於企業社會責任實踐之原則？ ①加強個人資料揭露 ②維護社會公益 ③發展永續環境 ④落實公司治理 。 </w:t>
       </w:r>
     </w:p>
@@ -1202,14 +2031,26 @@
         </w:numPr>
         <w:spacing w:beforeLines="50" w:before="120" w:afterLines="50" w:after="120"/>
         <w:ind w:right="44" w:hanging="554"/>
-      </w:pPr>
-      <w:r>
+        <w:rPr>
+          <w:color w:val="F2F2F2" w:themeColor="background1" w:themeShade="F2"/>
+        </w:rPr>
+      </w:pPr>
+      <w:r>
+        <w:rPr>
+          <w:color w:val="F2F2F2" w:themeColor="background1" w:themeShade="F2"/>
+        </w:rPr>
         <w:t>(1)</w:t>
       </w:r>
       <w:r>
-        <w:t xml:space="preserve"> </w:t>
-      </w:r>
-      <w:r>
+        <w:rPr>
+          <w:color w:val="F2F2F2" w:themeColor="background1" w:themeShade="F2"/>
+        </w:rPr>
+        <w:t xml:space="preserve"> </w:t>
+      </w:r>
+      <w:r>
+        <w:rPr>
+          <w:color w:val="F2F2F2" w:themeColor="background1" w:themeShade="F2"/>
+        </w:rPr>
         <w:t xml:space="preserve">下列何者「不」屬於職業素養的範疇？ ①獲利能力 ②正確的職業價值觀 ③職業知識技能 ④良好的職業行為習慣 。 </w:t>
       </w:r>
     </w:p>
@@ -1221,34 +2062,72 @@
         </w:numPr>
         <w:spacing w:beforeLines="50" w:before="120" w:afterLines="50" w:after="120"/>
         <w:ind w:right="44" w:hanging="554"/>
-      </w:pPr>
-      <w:r>
+        <w:rPr>
+          <w:color w:val="F2F2F2" w:themeColor="background1" w:themeShade="F2"/>
+        </w:rPr>
+      </w:pPr>
+      <w:r>
+        <w:rPr>
+          <w:color w:val="F2F2F2" w:themeColor="background1" w:themeShade="F2"/>
+        </w:rPr>
         <w:t>(4)</w:t>
       </w:r>
       <w:r>
-        <w:t xml:space="preserve"> </w:t>
-      </w:r>
-      <w:r>
-        <w:t xml:space="preserve">下列行為何者「不」屬於敬業精神的表現？ ①遵守時間約定 ②遵守法律規定 ③保守顧客隱私 ④隱匿公司產品瑕疵訊息 。 </w:t>
-      </w:r>
-    </w:p>
-    <w:p>
-      <w:pPr>
-        <w:numPr>
-          <w:ilvl w:val="0"/>
-          <w:numId w:val="1"/>
-        </w:numPr>
-        <w:spacing w:beforeLines="50" w:before="120" w:afterLines="50" w:after="120"/>
-        <w:ind w:right="44" w:hanging="554"/>
-      </w:pPr>
-      <w:r>
+        <w:rPr>
+          <w:color w:val="F2F2F2" w:themeColor="background1" w:themeShade="F2"/>
+        </w:rPr>
+        <w:t xml:space="preserve"> </w:t>
+      </w:r>
+      <w:r>
+        <w:rPr>
+          <w:color w:val="F2F2F2" w:themeColor="background1" w:themeShade="F2"/>
+        </w:rPr>
+        <w:t>下</w:t>
+      </w:r>
+      <w:proofErr w:type="gramStart"/>
+      <w:r>
+        <w:rPr>
+          <w:color w:val="F2F2F2" w:themeColor="background1" w:themeShade="F2"/>
+        </w:rPr>
+        <w:t>列行</w:t>
+      </w:r>
+      <w:proofErr w:type="gramEnd"/>
+      <w:r>
+        <w:rPr>
+          <w:color w:val="F2F2F2" w:themeColor="background1" w:themeShade="F2"/>
+        </w:rPr>
+        <w:t xml:space="preserve">為何者「不」屬於敬業精神的表現？ ①遵守時間約定 ②遵守法律規定 ③保守顧客隱私 ④隱匿公司產品瑕疵訊息 。 </w:t>
+      </w:r>
+    </w:p>
+    <w:p>
+      <w:pPr>
+        <w:numPr>
+          <w:ilvl w:val="0"/>
+          <w:numId w:val="1"/>
+        </w:numPr>
+        <w:spacing w:beforeLines="50" w:before="120" w:afterLines="50" w:after="120"/>
+        <w:ind w:right="44" w:hanging="554"/>
+        <w:rPr>
+          <w:color w:val="F2F2F2" w:themeColor="background1" w:themeShade="F2"/>
+        </w:rPr>
+      </w:pPr>
+      <w:r>
+        <w:rPr>
+          <w:color w:val="F2F2F2" w:themeColor="background1" w:themeShade="F2"/>
+        </w:rPr>
         <w:lastRenderedPageBreak/>
         <w:t>(4)</w:t>
       </w:r>
       <w:r>
-        <w:t xml:space="preserve"> </w:t>
-      </w:r>
-      <w:r>
+        <w:rPr>
+          <w:color w:val="F2F2F2" w:themeColor="background1" w:themeShade="F2"/>
+        </w:rPr>
+        <w:t xml:space="preserve"> </w:t>
+      </w:r>
+      <w:r>
+        <w:rPr>
+          <w:color w:val="F2F2F2" w:themeColor="background1" w:themeShade="F2"/>
+        </w:rPr>
         <w:t xml:space="preserve">下列何者符合專業人員的職業道德？ ①未經雇主同意，於上班時間從事私人事務 ②利用雇主的機具設備私自接單生產 ③未經顧客同意，任意散佈或利用顧客資料 ④盡力維護雇主及客戶的權益 。 </w:t>
       </w:r>
     </w:p>
@@ -1260,14 +2139,26 @@
         </w:numPr>
         <w:spacing w:beforeLines="50" w:before="120" w:afterLines="50" w:after="120"/>
         <w:ind w:right="44" w:hanging="554"/>
-      </w:pPr>
-      <w:r>
+        <w:rPr>
+          <w:color w:val="F2F2F2" w:themeColor="background1" w:themeShade="F2"/>
+        </w:rPr>
+      </w:pPr>
+      <w:r>
+        <w:rPr>
+          <w:color w:val="F2F2F2" w:themeColor="background1" w:themeShade="F2"/>
+        </w:rPr>
         <w:t>(4)</w:t>
       </w:r>
       <w:r>
-        <w:t xml:space="preserve"> </w:t>
-      </w:r>
-      <w:r>
+        <w:rPr>
+          <w:color w:val="F2F2F2" w:themeColor="background1" w:themeShade="F2"/>
+        </w:rPr>
+        <w:t xml:space="preserve"> </w:t>
+      </w:r>
+      <w:r>
+        <w:rPr>
+          <w:color w:val="F2F2F2" w:themeColor="background1" w:themeShade="F2"/>
+        </w:rPr>
         <w:t xml:space="preserve">身為公司員工必須維護公司利益，下列何者是正確的工作態度或行為？ ① 將公司逾期的產品更改標籤 ②施工時以省時、省料為獲利首要考量，不顧品質 ③服務時首先考慮公司的利益，然後再考量顧客權益 ④工作時謹守本分，以積極態度解決問題 。 </w:t>
       </w:r>
     </w:p>
@@ -1279,14 +2170,26 @@
         </w:numPr>
         <w:spacing w:beforeLines="50" w:before="120" w:afterLines="50" w:after="120"/>
         <w:ind w:right="44" w:hanging="554"/>
-      </w:pPr>
-      <w:r>
+        <w:rPr>
+          <w:color w:val="F2F2F2" w:themeColor="background1" w:themeShade="F2"/>
+        </w:rPr>
+      </w:pPr>
+      <w:r>
+        <w:rPr>
+          <w:color w:val="F2F2F2" w:themeColor="background1" w:themeShade="F2"/>
+        </w:rPr>
         <w:t>(3)</w:t>
       </w:r>
       <w:r>
-        <w:t xml:space="preserve"> </w:t>
-      </w:r>
-      <w:r>
+        <w:rPr>
+          <w:color w:val="F2F2F2" w:themeColor="background1" w:themeShade="F2"/>
+        </w:rPr>
+        <w:t xml:space="preserve"> </w:t>
+      </w:r>
+      <w:r>
+        <w:rPr>
+          <w:color w:val="F2F2F2" w:themeColor="background1" w:themeShade="F2"/>
+        </w:rPr>
         <w:t xml:space="preserve">身為專業技術工作人士，應以何種認知及態度服務客戶？ ①若客戶不瞭解，就儘量減少成本支出，抬高報價 ②遇到維修問題，儘量拖過保固期 ③主動告知可能碰到問題及預防方法 ④隨著個人心情來提供服務的內容及品質 。 </w:t>
       </w:r>
     </w:p>
@@ -1298,14 +2201,26 @@
         </w:numPr>
         <w:spacing w:beforeLines="50" w:before="120" w:afterLines="50" w:after="120"/>
         <w:ind w:right="44" w:hanging="554"/>
-      </w:pPr>
-      <w:r>
+        <w:rPr>
+          <w:color w:val="F2F2F2" w:themeColor="background1" w:themeShade="F2"/>
+        </w:rPr>
+      </w:pPr>
+      <w:r>
+        <w:rPr>
+          <w:color w:val="F2F2F2" w:themeColor="background1" w:themeShade="F2"/>
+        </w:rPr>
         <w:t>(2)</w:t>
       </w:r>
       <w:r>
-        <w:t xml:space="preserve"> </w:t>
-      </w:r>
-      <w:r>
+        <w:rPr>
+          <w:color w:val="F2F2F2" w:themeColor="background1" w:themeShade="F2"/>
+        </w:rPr>
+        <w:t xml:space="preserve"> </w:t>
+      </w:r>
+      <w:r>
+        <w:rPr>
+          <w:color w:val="F2F2F2" w:themeColor="background1" w:themeShade="F2"/>
+        </w:rPr>
         <w:t xml:space="preserve">因為工作本身需要高度專業技術及知識，所以在對客戶服務時應 ①不用理會顧客的意見 ②保持親切、真誠、客戶至上的態度 ③若價錢較低，就敷衍了事 ④以專業機密為由，不用對客戶說明及解釋 。 </w:t>
       </w:r>
     </w:p>
@@ -1317,14 +2232,26 @@
         </w:numPr>
         <w:spacing w:beforeLines="50" w:before="120" w:afterLines="50" w:after="120"/>
         <w:ind w:right="44" w:hanging="554"/>
-      </w:pPr>
-      <w:r>
+        <w:rPr>
+          <w:color w:val="F2F2F2" w:themeColor="background1" w:themeShade="F2"/>
+        </w:rPr>
+      </w:pPr>
+      <w:r>
+        <w:rPr>
+          <w:color w:val="F2F2F2" w:themeColor="background1" w:themeShade="F2"/>
+        </w:rPr>
         <w:t>(2)</w:t>
       </w:r>
       <w:r>
-        <w:t xml:space="preserve"> </w:t>
-      </w:r>
-      <w:r>
+        <w:rPr>
+          <w:color w:val="F2F2F2" w:themeColor="background1" w:themeShade="F2"/>
+        </w:rPr>
+        <w:t xml:space="preserve"> </w:t>
+      </w:r>
+      <w:r>
+        <w:rPr>
+          <w:color w:val="F2F2F2" w:themeColor="background1" w:themeShade="F2"/>
+        </w:rPr>
         <w:t xml:space="preserve">從事專業性工作，在與客戶約定時間應 ①保持彈性，任意調整 ②儘可能準時，依約定時間完成工作 ③能拖就拖，能改就改 ④自己方便就好，不必理會客戶的要求 。 </w:t>
       </w:r>
     </w:p>
@@ -1336,14 +2263,26 @@
         </w:numPr>
         <w:spacing w:beforeLines="50" w:before="120" w:afterLines="50" w:after="120"/>
         <w:ind w:right="44" w:hanging="554"/>
-      </w:pPr>
-      <w:r>
+        <w:rPr>
+          <w:color w:val="F2F2F2" w:themeColor="background1" w:themeShade="F2"/>
+        </w:rPr>
+      </w:pPr>
+      <w:r>
+        <w:rPr>
+          <w:color w:val="F2F2F2" w:themeColor="background1" w:themeShade="F2"/>
+        </w:rPr>
         <w:t>(1)</w:t>
       </w:r>
       <w:r>
-        <w:t xml:space="preserve"> </w:t>
-      </w:r>
-      <w:r>
+        <w:rPr>
+          <w:color w:val="F2F2F2" w:themeColor="background1" w:themeShade="F2"/>
+        </w:rPr>
+        <w:t xml:space="preserve"> </w:t>
+      </w:r>
+      <w:r>
+        <w:rPr>
+          <w:color w:val="F2F2F2" w:themeColor="background1" w:themeShade="F2"/>
+        </w:rPr>
         <w:t xml:space="preserve">從事專業性工作，在服務顧客時應有的態度是 ①選擇最安全、經濟及有效的方法完成工作 ②選擇工時較長、獲利較多的方法服務客戶 ③為了降低成本，可以降低安全標準 ④不必顧及雇主和顧客的立場 。 </w:t>
       </w:r>
     </w:p>
@@ -1355,14 +2294,26 @@
         </w:numPr>
         <w:spacing w:beforeLines="50" w:before="120" w:afterLines="50" w:after="120"/>
         <w:ind w:right="44" w:hanging="554"/>
-      </w:pPr>
-      <w:r>
+        <w:rPr>
+          <w:color w:val="F2F2F2" w:themeColor="background1" w:themeShade="F2"/>
+        </w:rPr>
+      </w:pPr>
+      <w:r>
+        <w:rPr>
+          <w:color w:val="F2F2F2" w:themeColor="background1" w:themeShade="F2"/>
+        </w:rPr>
         <w:t>(1)</w:t>
       </w:r>
       <w:r>
-        <w:t xml:space="preserve"> </w:t>
-      </w:r>
-      <w:r>
+        <w:rPr>
+          <w:color w:val="F2F2F2" w:themeColor="background1" w:themeShade="F2"/>
+        </w:rPr>
+        <w:t xml:space="preserve"> </w:t>
+      </w:r>
+      <w:r>
+        <w:rPr>
+          <w:color w:val="F2F2F2" w:themeColor="background1" w:themeShade="F2"/>
+        </w:rPr>
         <w:t xml:space="preserve">當發現公司的產品可能會對顧客身體產生危害時，正確的作法或行動應是 ①立即向主管或有關單位報告 ②若無其事，置之不理 ③儘量隱瞞事實，協助掩飾問題 ④透過管道告知媒體或競爭對手 。 </w:t>
       </w:r>
     </w:p>
@@ -1374,14 +2325,26 @@
         </w:numPr>
         <w:spacing w:beforeLines="50" w:before="120" w:afterLines="50" w:after="120"/>
         <w:ind w:right="44" w:hanging="554"/>
-      </w:pPr>
-      <w:r>
+        <w:rPr>
+          <w:color w:val="F2F2F2" w:themeColor="background1" w:themeShade="F2"/>
+        </w:rPr>
+      </w:pPr>
+      <w:r>
+        <w:rPr>
+          <w:color w:val="F2F2F2" w:themeColor="background1" w:themeShade="F2"/>
+        </w:rPr>
         <w:t>(4)</w:t>
       </w:r>
       <w:r>
-        <w:t xml:space="preserve"> </w:t>
-      </w:r>
-      <w:r>
+        <w:rPr>
+          <w:color w:val="F2F2F2" w:themeColor="background1" w:themeShade="F2"/>
+        </w:rPr>
+        <w:t xml:space="preserve"> </w:t>
+      </w:r>
+      <w:r>
+        <w:rPr>
+          <w:color w:val="F2F2F2" w:themeColor="background1" w:themeShade="F2"/>
+        </w:rPr>
         <w:t xml:space="preserve">以下哪一項員工的作為符合敬業精神？ ①利用正常工作時間從事私人事務 ②運用雇主的資源，從事個人工作 ③未經雇主同意擅離工作崗位 ④謹守職場紀律及禮節，尊重客戶隱私 。 </w:t>
       </w:r>
     </w:p>
@@ -1393,14 +2356,26 @@
         </w:numPr>
         <w:spacing w:beforeLines="50" w:before="120" w:afterLines="50" w:after="120" w:line="279" w:lineRule="auto"/>
         <w:ind w:right="44" w:hanging="554"/>
-      </w:pPr>
-      <w:r>
+        <w:rPr>
+          <w:color w:val="F2F2F2" w:themeColor="background1" w:themeShade="F2"/>
+        </w:rPr>
+      </w:pPr>
+      <w:r>
+        <w:rPr>
+          <w:color w:val="F2F2F2" w:themeColor="background1" w:themeShade="F2"/>
+        </w:rPr>
         <w:t>(2)</w:t>
       </w:r>
       <w:r>
-        <w:t xml:space="preserve"> </w:t>
-      </w:r>
-      <w:r>
+        <w:rPr>
+          <w:color w:val="F2F2F2" w:themeColor="background1" w:themeShade="F2"/>
+        </w:rPr>
+        <w:t xml:space="preserve"> </w:t>
+      </w:r>
+      <w:r>
+        <w:rPr>
+          <w:color w:val="F2F2F2" w:themeColor="background1" w:themeShade="F2"/>
+        </w:rPr>
         <w:t xml:space="preserve">如果發現有同事，利用公司的財產做私人的事，我們應該要 ①未經查證或勸阻立即向主管報告 ②應該立即勸阻，告知他這是不對的行為 ③不關我的事，我只要管好自己便可以 ④應該告訴其他同事，讓大家來共同糾正與斥責他 。 </w:t>
       </w:r>
     </w:p>
@@ -1412,21 +2387,50 @@
         </w:numPr>
         <w:spacing w:beforeLines="50" w:before="120" w:afterLines="50" w:after="120"/>
         <w:ind w:right="44" w:hanging="554"/>
-      </w:pPr>
-      <w:r>
-        <w:t xml:space="preserve">(2) 小禎離開異鄉就業，來到小明的公司上班，小明是當地的人，他應該： ① 不關他的事，自己管好就好 ②多關心小禎的生活適應情況，如有困難加以協助 ③小禎非當地人，應該不容易相處，不要有太多接觸 ④小禎是同單位的人，是個競爭對手，應該多加防範 。 </w:t>
-      </w:r>
-    </w:p>
-    <w:p>
-      <w:pPr>
-        <w:numPr>
-          <w:ilvl w:val="0"/>
-          <w:numId w:val="1"/>
-        </w:numPr>
-        <w:spacing w:beforeLines="50" w:before="120" w:afterLines="50" w:after="120"/>
-        <w:ind w:right="44" w:hanging="554"/>
-      </w:pPr>
-      <w:r>
+        <w:rPr>
+          <w:color w:val="F2F2F2" w:themeColor="background1" w:themeShade="F2"/>
+        </w:rPr>
+      </w:pPr>
+      <w:r>
+        <w:rPr>
+          <w:color w:val="F2F2F2" w:themeColor="background1" w:themeShade="F2"/>
+        </w:rPr>
+        <w:t>(2)</w:t>
+      </w:r>
+      <w:r>
+        <w:rPr>
+          <w:color w:val="F2F2F2" w:themeColor="background1" w:themeShade="F2"/>
+        </w:rPr>
+        <w:t xml:space="preserve"> 小</w:t>
+      </w:r>
+      <w:proofErr w:type="gramStart"/>
+      <w:r>
+        <w:rPr>
+          <w:color w:val="F2F2F2" w:themeColor="background1" w:themeShade="F2"/>
+        </w:rPr>
+        <w:t>禎</w:t>
+      </w:r>
+      <w:proofErr w:type="gramEnd"/>
+      <w:r>
+        <w:rPr>
+          <w:color w:val="F2F2F2" w:themeColor="background1" w:themeShade="F2"/>
+        </w:rPr>
+        <w:t xml:space="preserve">離開異鄉就業，來到小明的公司上班，小明是當地的人，他應該： ① 不關他的事，自己管好就好 ②多關心小禎的生活適應情況，如有困難加以協助 ③小禎非當地人，應該不容易相處，不要有太多接觸 ④小禎是同單位的人，是個競爭對手，應該多加防範 。 </w:t>
+      </w:r>
+    </w:p>
+    <w:p>
+      <w:pPr>
+        <w:numPr>
+          <w:ilvl w:val="0"/>
+          <w:numId w:val="1"/>
+        </w:numPr>
+        <w:spacing w:beforeLines="50" w:before="120" w:afterLines="50" w:after="120"/>
+        <w:ind w:right="44" w:hanging="554"/>
+      </w:pPr>
+      <w:r>
+        <w:rPr>
+          <w:color w:val="F2F2F2" w:themeColor="background1" w:themeShade="F2"/>
+        </w:rPr>
         <w:t>(3)</w:t>
       </w:r>
       <w:r>
@@ -1444,17 +2448,40 @@
         </w:numPr>
         <w:spacing w:beforeLines="50" w:before="120" w:afterLines="50" w:after="120"/>
         <w:ind w:right="44" w:hanging="554"/>
-      </w:pPr>
-      <w:r>
+        <w:rPr>
+          <w:color w:val="F2F2F2" w:themeColor="background1" w:themeShade="F2"/>
+        </w:rPr>
+      </w:pPr>
+      <w:r>
+        <w:rPr>
+          <w:color w:val="F2F2F2" w:themeColor="background1" w:themeShade="F2"/>
+        </w:rPr>
         <w:t>(2)</w:t>
       </w:r>
       <w:r>
-        <w:t xml:space="preserve"> </w:t>
-      </w:r>
-      <w:r>
-        <w:t>小吳是公司的專用司機，為了能夠隨時用車，經過公司同意，每晚都將公司的車開回家，然而，他發現反正每天上班路線，都要經過女兒學校，就順便載女兒上</w:t>
-      </w:r>
-      <w:r>
+        <w:rPr>
+          <w:color w:val="F2F2F2" w:themeColor="background1" w:themeShade="F2"/>
+        </w:rPr>
+        <w:t xml:space="preserve"> </w:t>
+      </w:r>
+      <w:proofErr w:type="gramStart"/>
+      <w:r>
+        <w:rPr>
+          <w:color w:val="F2F2F2" w:themeColor="background1" w:themeShade="F2"/>
+        </w:rPr>
+        <w:t>小吳是</w:t>
+      </w:r>
+      <w:proofErr w:type="gramEnd"/>
+      <w:r>
+        <w:rPr>
+          <w:color w:val="F2F2F2" w:themeColor="background1" w:themeShade="F2"/>
+        </w:rPr>
+        <w:t>公司的專用司機，為了能夠隨時用車，經過公司同意，每晚都將公司的車開回家，然而，他發現反正每天上班路線，都要經過女兒學校，就順便載女兒上</w:t>
+      </w:r>
+      <w:r>
+        <w:rPr>
+          <w:color w:val="F2F2F2" w:themeColor="background1" w:themeShade="F2"/>
+        </w:rPr>
         <w:lastRenderedPageBreak/>
         <w:t xml:space="preserve">學，請問可以嗎？ ①可以，反正順路 ②不可以，這是公司的車不能私用 ③可以，只要不被公司發現即可 ④可以，要資源須有效使用 。 </w:t>
       </w:r>
@@ -1467,14 +2494,26 @@
         </w:numPr>
         <w:spacing w:beforeLines="50" w:before="120" w:afterLines="50" w:after="120"/>
         <w:ind w:right="44" w:hanging="554"/>
-      </w:pPr>
-      <w:r>
+        <w:rPr>
+          <w:color w:val="F2F2F2" w:themeColor="background1" w:themeShade="F2"/>
+        </w:rPr>
+      </w:pPr>
+      <w:r>
+        <w:rPr>
+          <w:color w:val="F2F2F2" w:themeColor="background1" w:themeShade="F2"/>
+        </w:rPr>
         <w:t>(2)</w:t>
       </w:r>
       <w:r>
-        <w:t xml:space="preserve"> </w:t>
-      </w:r>
-      <w:r>
+        <w:rPr>
+          <w:color w:val="F2F2F2" w:themeColor="background1" w:themeShade="F2"/>
+        </w:rPr>
+        <w:t xml:space="preserve"> </w:t>
+      </w:r>
+      <w:r>
+        <w:rPr>
+          <w:color w:val="F2F2F2" w:themeColor="background1" w:themeShade="F2"/>
+        </w:rPr>
         <w:t xml:space="preserve">如果公司受到不當與不正確的毀謗與指控，你應該是： ①加入毀謗行列，將公司內部的事情，都說出來告訴大家 ②相信公司，幫助公司對抗這些不實的指控 ③向媒體爆料，更多不實的內容 ④不關我的事，只要能夠領到薪水就好 。 </w:t>
       </w:r>
     </w:p>
@@ -1486,46 +2525,89 @@
         </w:numPr>
         <w:spacing w:beforeLines="50" w:before="120" w:afterLines="50" w:after="120"/>
         <w:ind w:right="44" w:hanging="554"/>
-      </w:pPr>
-      <w:r>
+        <w:rPr>
+          <w:color w:val="F2F2F2" w:themeColor="background1" w:themeShade="F2"/>
+        </w:rPr>
+      </w:pPr>
+      <w:r>
+        <w:rPr>
+          <w:color w:val="F2F2F2" w:themeColor="background1" w:themeShade="F2"/>
+        </w:rPr>
         <w:t>(3)</w:t>
       </w:r>
       <w:r>
-        <w:t xml:space="preserve"> </w:t>
-      </w:r>
-      <w:r>
-        <w:t xml:space="preserve">筱珮要離職了，公司主管交代，她要做業務上的交接，她該怎麼辦？ ①不用理它，反正都要離開公司了 ②把以前的業務資料都刪除或設密碼，讓別人都打不開 ③應該將承辦業務整理歸檔清楚，並且留下聯絡的方式，未來有問題可以詢問她 ④盡量交接，如果離職日一到，就不關他的事 。 </w:t>
-      </w:r>
-    </w:p>
-    <w:p>
-      <w:pPr>
-        <w:numPr>
-          <w:ilvl w:val="0"/>
-          <w:numId w:val="1"/>
-        </w:numPr>
-        <w:spacing w:beforeLines="50" w:before="120" w:afterLines="50" w:after="120"/>
-        <w:ind w:right="44" w:hanging="554"/>
-      </w:pPr>
-      <w:r>
+        <w:rPr>
+          <w:color w:val="F2F2F2" w:themeColor="background1" w:themeShade="F2"/>
+        </w:rPr>
+        <w:t xml:space="preserve"> </w:t>
+      </w:r>
+      <w:proofErr w:type="gramStart"/>
+      <w:r>
+        <w:rPr>
+          <w:color w:val="F2F2F2" w:themeColor="background1" w:themeShade="F2"/>
+        </w:rPr>
+        <w:t>筱珮</w:t>
+      </w:r>
+      <w:proofErr w:type="gramEnd"/>
+      <w:r>
+        <w:rPr>
+          <w:color w:val="F2F2F2" w:themeColor="background1" w:themeShade="F2"/>
+        </w:rPr>
+        <w:t xml:space="preserve">要離職了，公司主管交代，她要做業務上的交接，她該怎麼辦？ ①不用理它，反正都要離開公司了 ②把以前的業務資料都刪除或設密碼，讓別人都打不開 ③應該將承辦業務整理歸檔清楚，並且留下聯絡的方式，未來有問題可以詢問她 ④盡量交接，如果離職日一到，就不關他的事 。 </w:t>
+      </w:r>
+    </w:p>
+    <w:p>
+      <w:pPr>
+        <w:numPr>
+          <w:ilvl w:val="0"/>
+          <w:numId w:val="1"/>
+        </w:numPr>
+        <w:spacing w:beforeLines="50" w:before="120" w:afterLines="50" w:after="120"/>
+        <w:ind w:right="44" w:hanging="554"/>
+        <w:rPr>
+          <w:color w:val="F2F2F2" w:themeColor="background1" w:themeShade="F2"/>
+        </w:rPr>
+      </w:pPr>
+      <w:r>
+        <w:rPr>
+          <w:color w:val="F2F2F2" w:themeColor="background1" w:themeShade="F2"/>
+        </w:rPr>
         <w:t>(4)</w:t>
       </w:r>
       <w:r>
-        <w:t xml:space="preserve"> </w:t>
-      </w:r>
-      <w:r>
-        <w:t xml:space="preserve">彥江是職場上的新鮮人，剛進公司不久，他應該具備怎樣的態度 ①上班、下班，管好自己便可 ②仔細觀察公司生態，加入某些小團體，以做為後盾 ③只要做好人脈關係，這樣以後就好辦事 ④努力做好自己職掌的業務，樂於工作，與同事之間有良好的互動，相互協助 。 </w:t>
-      </w:r>
-    </w:p>
-    <w:p>
-      <w:pPr>
-        <w:numPr>
-          <w:ilvl w:val="0"/>
-          <w:numId w:val="1"/>
-        </w:numPr>
-        <w:spacing w:beforeLines="50" w:before="120" w:afterLines="50" w:after="120"/>
-        <w:ind w:right="44" w:hanging="554"/>
-      </w:pPr>
-      <w:r>
+        <w:rPr>
+          <w:color w:val="F2F2F2" w:themeColor="background1" w:themeShade="F2"/>
+        </w:rPr>
+        <w:t xml:space="preserve"> </w:t>
+      </w:r>
+      <w:proofErr w:type="gramStart"/>
+      <w:r>
+        <w:rPr>
+          <w:color w:val="F2F2F2" w:themeColor="background1" w:themeShade="F2"/>
+        </w:rPr>
+        <w:t>彥</w:t>
+      </w:r>
+      <w:proofErr w:type="gramEnd"/>
+      <w:r>
+        <w:rPr>
+          <w:color w:val="F2F2F2" w:themeColor="background1" w:themeShade="F2"/>
+        </w:rPr>
+        <w:t xml:space="preserve">江是職場上的新鮮人，剛進公司不久，他應該具備怎樣的態度 ①上班、下班，管好自己便可 ②仔細觀察公司生態，加入某些小團體，以做為後盾 ③只要做好人脈關係，這樣以後就好辦事 ④努力做好自己職掌的業務，樂於工作，與同事之間有良好的互動，相互協助 。 </w:t>
+      </w:r>
+    </w:p>
+    <w:p>
+      <w:pPr>
+        <w:numPr>
+          <w:ilvl w:val="0"/>
+          <w:numId w:val="1"/>
+        </w:numPr>
+        <w:spacing w:beforeLines="50" w:before="120" w:afterLines="50" w:after="120"/>
+        <w:ind w:right="44" w:hanging="554"/>
+      </w:pPr>
+      <w:r>
+        <w:rPr>
+          <w:color w:val="F2F2F2" w:themeColor="background1" w:themeShade="F2"/>
+        </w:rPr>
         <w:t>(4)</w:t>
       </w:r>
       <w:r>
@@ -1543,14 +2625,26 @@
         </w:numPr>
         <w:spacing w:beforeLines="50" w:before="120" w:afterLines="50" w:after="120"/>
         <w:ind w:right="44" w:hanging="554"/>
-      </w:pPr>
-      <w:r>
+        <w:rPr>
+          <w:color w:val="F2F2F2" w:themeColor="background1" w:themeShade="F2"/>
+        </w:rPr>
+      </w:pPr>
+      <w:r>
+        <w:rPr>
+          <w:color w:val="F2F2F2" w:themeColor="background1" w:themeShade="F2"/>
+        </w:rPr>
         <w:t>(1)</w:t>
       </w:r>
       <w:r>
-        <w:t xml:space="preserve"> </w:t>
-      </w:r>
-      <w:r>
+        <w:rPr>
+          <w:color w:val="F2F2F2" w:themeColor="background1" w:themeShade="F2"/>
+        </w:rPr>
+        <w:t xml:space="preserve"> </w:t>
+      </w:r>
+      <w:r>
+        <w:rPr>
+          <w:color w:val="F2F2F2" w:themeColor="background1" w:themeShade="F2"/>
+        </w:rPr>
         <w:t xml:space="preserve">一位職場新鮮人剛進公司時，良好的工作態度是 ①多觀察、多學習，了解企業文化和價值觀 ②多打聽哪一個部門比較輕鬆，升遷機會較多 ③多探聽哪一個公司在找人，隨時準備跳槽走人 ④多遊走各部門認識同事，建立自己的小圈圈 。 </w:t>
       </w:r>
     </w:p>
@@ -1564,6 +2658,9 @@
         <w:ind w:right="44" w:hanging="554"/>
       </w:pPr>
       <w:r>
+        <w:rPr>
+          <w:color w:val="F2F2F2" w:themeColor="background1" w:themeShade="F2"/>
+        </w:rPr>
         <w:t>(1)</w:t>
       </w:r>
       <w:r>
@@ -1581,40 +2678,95 @@
         </w:numPr>
         <w:spacing w:beforeLines="50" w:before="120" w:afterLines="50" w:after="120"/>
         <w:ind w:right="44" w:hanging="554"/>
-      </w:pPr>
-      <w:r>
+        <w:rPr>
+          <w:color w:val="F2F2F2" w:themeColor="background1" w:themeShade="F2"/>
+        </w:rPr>
+      </w:pPr>
+      <w:r>
+        <w:rPr>
+          <w:color w:val="F2F2F2" w:themeColor="background1" w:themeShade="F2"/>
+        </w:rPr>
         <w:t>(4)</w:t>
       </w:r>
       <w:r>
-        <w:t xml:space="preserve"> </w:t>
-      </w:r>
-      <w:r>
-        <w:t xml:space="preserve">根據性別工作平等法，下列何者非屬職場性騷擾? ①公司員工執行職務時，客戶對其講黃色笑話，該員工感覺被冒犯 ②雇主對求職者要求交往，作為雇用與否之交換條件 ③公司員工執行職務時，遭到同事以「女人就是沒大腦」性別歧視用語加以辱罵，該員工感覺其人格尊嚴受損 ④公司員工下班後搭乘捷運，在捷運上遭到其他乘客偷拍 。 </w:t>
-      </w:r>
-    </w:p>
-    <w:p>
-      <w:pPr>
-        <w:numPr>
-          <w:ilvl w:val="0"/>
-          <w:numId w:val="1"/>
-        </w:numPr>
-        <w:spacing w:beforeLines="50" w:before="120" w:afterLines="50" w:after="120"/>
-        <w:ind w:right="44" w:hanging="554"/>
-      </w:pPr>
-      <w:r>
-        <w:t xml:space="preserve">(4) 根據性別工作平等法，下列何者非屬職場性別歧視？ ①雇主考量男性賺錢養家之社會期待，提供男性高於女性之薪資 ②雇主考量女性以家庭為重之社會期待，裁員時優先資遣女性 ③雇主事先與員工約定倘其有懷孕之情事，必須離職 ④有未滿 2 歲子女之男性員工，也可申請每日六十分鐘的哺乳時間 。 </w:t>
-      </w:r>
-    </w:p>
-    <w:p>
-      <w:pPr>
-        <w:numPr>
-          <w:ilvl w:val="0"/>
-          <w:numId w:val="1"/>
-        </w:numPr>
-        <w:spacing w:beforeLines="50" w:before="120" w:afterLines="50" w:after="120"/>
-        <w:ind w:right="44" w:hanging="554"/>
-      </w:pPr>
-      <w:r>
+        <w:rPr>
+          <w:color w:val="F2F2F2" w:themeColor="background1" w:themeShade="F2"/>
+        </w:rPr>
+        <w:t xml:space="preserve"> </w:t>
+      </w:r>
+      <w:r>
+        <w:rPr>
+          <w:color w:val="F2F2F2" w:themeColor="background1" w:themeShade="F2"/>
+        </w:rPr>
+        <w:t>根據性別工作平等法，下列何者</w:t>
+      </w:r>
+      <w:proofErr w:type="gramStart"/>
+      <w:r>
+        <w:rPr>
+          <w:color w:val="F2F2F2" w:themeColor="background1" w:themeShade="F2"/>
+        </w:rPr>
+        <w:t>非屬職場</w:t>
+      </w:r>
+      <w:proofErr w:type="gramEnd"/>
+      <w:r>
+        <w:rPr>
+          <w:color w:val="F2F2F2" w:themeColor="background1" w:themeShade="F2"/>
+        </w:rPr>
+        <w:t xml:space="preserve">性騷擾? ①公司員工執行職務時，客戶對其講黃色笑話，該員工感覺被冒犯 ②雇主對求職者要求交往，作為雇用與否之交換條件 ③公司員工執行職務時，遭到同事以「女人就是沒大腦」性別歧視用語加以辱罵，該員工感覺其人格尊嚴受損 ④公司員工下班後搭乘捷運，在捷運上遭到其他乘客偷拍 。 </w:t>
+      </w:r>
+    </w:p>
+    <w:p>
+      <w:pPr>
+        <w:numPr>
+          <w:ilvl w:val="0"/>
+          <w:numId w:val="1"/>
+        </w:numPr>
+        <w:spacing w:beforeLines="50" w:before="120" w:afterLines="50" w:after="120"/>
+        <w:ind w:right="44" w:hanging="554"/>
+        <w:rPr>
+          <w:color w:val="F2F2F2" w:themeColor="background1" w:themeShade="F2"/>
+        </w:rPr>
+      </w:pPr>
+      <w:r>
+        <w:rPr>
+          <w:color w:val="F2F2F2" w:themeColor="background1" w:themeShade="F2"/>
+        </w:rPr>
+        <w:t>(4)</w:t>
+      </w:r>
+      <w:r>
+        <w:rPr>
+          <w:color w:val="F2F2F2" w:themeColor="background1" w:themeShade="F2"/>
+        </w:rPr>
+        <w:t xml:space="preserve"> 根據性別工作平等法，下列何者</w:t>
+      </w:r>
+      <w:proofErr w:type="gramStart"/>
+      <w:r>
+        <w:rPr>
+          <w:color w:val="F2F2F2" w:themeColor="background1" w:themeShade="F2"/>
+        </w:rPr>
+        <w:t>非屬職場</w:t>
+      </w:r>
+      <w:proofErr w:type="gramEnd"/>
+      <w:r>
+        <w:rPr>
+          <w:color w:val="F2F2F2" w:themeColor="background1" w:themeShade="F2"/>
+        </w:rPr>
+        <w:t xml:space="preserve">性別歧視？ ①雇主考量男性賺錢養家之社會期待，提供男性高於女性之薪資 ②雇主考量女性以家庭為重之社會期待，裁員時優先資遣女性 ③雇主事先與員工約定倘其有懷孕之情事，必須離職 ④有未滿 2 歲子女之男性員工，也可申請每日六十分鐘的哺乳時間 。 </w:t>
+      </w:r>
+    </w:p>
+    <w:p>
+      <w:pPr>
+        <w:numPr>
+          <w:ilvl w:val="0"/>
+          <w:numId w:val="1"/>
+        </w:numPr>
+        <w:spacing w:beforeLines="50" w:before="120" w:afterLines="50" w:after="120"/>
+        <w:ind w:right="44" w:hanging="554"/>
+      </w:pPr>
+      <w:r>
+        <w:rPr>
+          <w:color w:val="F2F2F2" w:themeColor="background1" w:themeShade="F2"/>
+        </w:rPr>
         <w:t>(3)</w:t>
       </w:r>
       <w:r>
@@ -1634,6 +2786,9 @@
         <w:ind w:right="44" w:hanging="554"/>
       </w:pPr>
       <w:r>
+        <w:rPr>
+          <w:color w:val="F2F2F2" w:themeColor="background1" w:themeShade="F2"/>
+        </w:rPr>
         <w:t>(1)</w:t>
       </w:r>
       <w:r>
@@ -1655,14 +2810,26 @@
         </w:numPr>
         <w:spacing w:beforeLines="50" w:before="120" w:afterLines="50" w:after="120"/>
         <w:ind w:right="44" w:hanging="554"/>
-      </w:pPr>
-      <w:r>
+        <w:rPr>
+          <w:color w:val="F2F2F2" w:themeColor="background1" w:themeShade="F2"/>
+        </w:rPr>
+      </w:pPr>
+      <w:r>
+        <w:rPr>
+          <w:color w:val="F2F2F2" w:themeColor="background1" w:themeShade="F2"/>
+        </w:rPr>
         <w:t>(1)</w:t>
       </w:r>
       <w:r>
-        <w:t xml:space="preserve"> </w:t>
-      </w:r>
-      <w:r>
+        <w:rPr>
+          <w:color w:val="F2F2F2" w:themeColor="background1" w:themeShade="F2"/>
+        </w:rPr>
+        <w:t xml:space="preserve"> </w:t>
+      </w:r>
+      <w:r>
+        <w:rPr>
+          <w:color w:val="F2F2F2" w:themeColor="background1" w:themeShade="F2"/>
+        </w:rPr>
         <w:t xml:space="preserve">根據消除對婦女一切形式歧視公約(CEDAW)，下列何者正確？ ①對婦女的歧視指基於性別而作的任何區別、排斥或限制 ②只關心女性在政治方面的人權和基本自由 ③未要求政府需消除個人或企業對女性的歧視 ④傳統習俗應予保護及傳承，即使含有歧視女性的部分，也不可以改變 。 </w:t>
       </w:r>
     </w:p>
@@ -1674,14 +2841,26 @@
         </w:numPr>
         <w:spacing w:beforeLines="50" w:before="120" w:afterLines="50" w:after="120"/>
         <w:ind w:right="44" w:hanging="554"/>
-      </w:pPr>
-      <w:r>
+        <w:rPr>
+          <w:color w:val="F2F2F2" w:themeColor="background1" w:themeShade="F2"/>
+        </w:rPr>
+      </w:pPr>
+      <w:r>
+        <w:rPr>
+          <w:color w:val="F2F2F2" w:themeColor="background1" w:themeShade="F2"/>
+        </w:rPr>
         <w:t>(2)</w:t>
       </w:r>
       <w:r>
-        <w:t xml:space="preserve"> </w:t>
-      </w:r>
-      <w:r>
+        <w:rPr>
+          <w:color w:val="F2F2F2" w:themeColor="background1" w:themeShade="F2"/>
+        </w:rPr>
+        <w:t xml:space="preserve"> </w:t>
+      </w:r>
+      <w:r>
+        <w:rPr>
+          <w:color w:val="F2F2F2" w:themeColor="background1" w:themeShade="F2"/>
+        </w:rPr>
         <w:t xml:space="preserve">學校駐衛警察之遴選規定以服畢兵役男性作為遴選條件之一，根據消除對婦女一切形式歧視公約(CEDAW)，下列何者錯誤？ ①服畢兵役者仍以男性為主，此條件已排除多數女性被遴選的機會，屬性別歧視 ②此遴選條件雖明定限男性，但實務上不屬性別歧視 ③駐衛警察之遴選應以從事該工作所需的能力或資格作為條件 ④已違反 CEDAW 第 1 條對婦女的歧視 。 </w:t>
       </w:r>
     </w:p>
@@ -1693,14 +2872,26 @@
         </w:numPr>
         <w:spacing w:beforeLines="50" w:before="120" w:afterLines="50" w:after="120"/>
         <w:ind w:right="44" w:hanging="554"/>
-      </w:pPr>
-      <w:r>
+        <w:rPr>
+          <w:color w:val="F2F2F2" w:themeColor="background1" w:themeShade="F2"/>
+        </w:rPr>
+      </w:pPr>
+      <w:r>
+        <w:rPr>
+          <w:color w:val="F2F2F2" w:themeColor="background1" w:themeShade="F2"/>
+        </w:rPr>
         <w:t>(1)</w:t>
       </w:r>
       <w:r>
-        <w:t xml:space="preserve"> </w:t>
-      </w:r>
-      <w:r>
+        <w:rPr>
+          <w:color w:val="F2F2F2" w:themeColor="background1" w:themeShade="F2"/>
+        </w:rPr>
+        <w:t xml:space="preserve"> </w:t>
+      </w:r>
+      <w:r>
+        <w:rPr>
+          <w:color w:val="F2F2F2" w:themeColor="background1" w:themeShade="F2"/>
+        </w:rPr>
         <w:t xml:space="preserve">某規範明定地政機關進用女性測量助理名額，不得超過該機關測量助理名額總數二分之一，根據消除對婦女一切形式歧視公約(CEDAW)，下列何者正確？ ①限制女性測量助理人數比例，屬於直接歧視 ②土地測量經常在戶外工作，基於保護女性所作的限制，不屬性別歧視 ③此項二分之一規定是為促進男女比例平衡 ④此限制是為確保機關業務順暢推動，並未歧視女性 。 </w:t>
       </w:r>
     </w:p>
@@ -1712,14 +2903,26 @@
         </w:numPr>
         <w:spacing w:beforeLines="50" w:before="120" w:afterLines="50" w:after="120"/>
         <w:ind w:right="44" w:hanging="554"/>
-      </w:pPr>
-      <w:r>
+        <w:rPr>
+          <w:color w:val="F2F2F2" w:themeColor="background1" w:themeShade="F2"/>
+        </w:rPr>
+      </w:pPr>
+      <w:r>
+        <w:rPr>
+          <w:color w:val="F2F2F2" w:themeColor="background1" w:themeShade="F2"/>
+        </w:rPr>
         <w:t>(4)</w:t>
       </w:r>
       <w:r>
-        <w:t xml:space="preserve"> </w:t>
-      </w:r>
-      <w:r>
+        <w:rPr>
+          <w:color w:val="F2F2F2" w:themeColor="background1" w:themeShade="F2"/>
+        </w:rPr>
+        <w:t xml:space="preserve"> </w:t>
+      </w:r>
+      <w:r>
+        <w:rPr>
+          <w:color w:val="F2F2F2" w:themeColor="background1" w:themeShade="F2"/>
+        </w:rPr>
         <w:t xml:space="preserve">根據消除對婦女一切形式歧視公約(CEDAW)之間接歧視意涵，下列何者錯誤？ ①一項法律、政策、方案或措施表面上對男性和女性無任何歧視，但實際上卻產生歧視女性的效果 ②察覺間接歧視的一個方法，是善加利用性別統計與性別分析 ③如果未正視歧視之結構和歷史模式，及忽略男女權力關係之不平等，可能使現有不平等狀況更為惡化 ④不論在任何情況下，只要以相同方式對待男性和女性，就能避免間接歧視之產生 。 </w:t>
       </w:r>
     </w:p>
@@ -1733,121 +2936,263 @@
         <w:ind w:right="44" w:hanging="554"/>
       </w:pPr>
       <w:r>
-        <w:t xml:space="preserve">(3) 關於菸品對人體的危害的敘述，下列何者「正確」？ ①只要開電風扇、或是空調就可以去除二手菸 ②抽雪茄比抽紙菸危害還要小 ③吸菸者比不吸菸者容易得肺癌 ④只要不將菸吸入肺部，就不會對身體造成傷害 。 </w:t>
-      </w:r>
-    </w:p>
-    <w:p>
-      <w:pPr>
-        <w:numPr>
-          <w:ilvl w:val="0"/>
-          <w:numId w:val="1"/>
-        </w:numPr>
-        <w:spacing w:beforeLines="50" w:before="120" w:afterLines="50" w:after="120"/>
-        <w:ind w:right="44" w:hanging="554"/>
-      </w:pPr>
-      <w:r>
+        <w:rPr>
+          <w:color w:val="F2F2F2" w:themeColor="background1" w:themeShade="F2"/>
+        </w:rPr>
+        <w:t>(3)</w:t>
+      </w:r>
+      <w:r>
+        <w:t xml:space="preserve"> 關於</w:t>
+      </w:r>
+      <w:proofErr w:type="gramStart"/>
+      <w:r>
+        <w:t>菸</w:t>
+      </w:r>
+      <w:proofErr w:type="gramEnd"/>
+      <w:r>
+        <w:t xml:space="preserve">品對人體的危害的敘述，下列何者「正確」？ ①只要開電風扇、或是空調就可以去除二手菸 ②抽雪茄比抽紙菸危害還要小 ③吸菸者比不吸菸者容易得肺癌 ④只要不將菸吸入肺部，就不會對身體造成傷害 。 </w:t>
+      </w:r>
+    </w:p>
+    <w:p>
+      <w:pPr>
+        <w:numPr>
+          <w:ilvl w:val="0"/>
+          <w:numId w:val="1"/>
+        </w:numPr>
+        <w:spacing w:beforeLines="50" w:before="120" w:afterLines="50" w:after="120"/>
+        <w:ind w:right="44" w:hanging="554"/>
+        <w:rPr>
+          <w:color w:val="F2F2F2" w:themeColor="background1" w:themeShade="F2"/>
+        </w:rPr>
+      </w:pPr>
+      <w:r>
+        <w:rPr>
+          <w:color w:val="F2F2F2" w:themeColor="background1" w:themeShade="F2"/>
+        </w:rPr>
         <w:t>(4)</w:t>
       </w:r>
       <w:r>
-        <w:t xml:space="preserve"> </w:t>
-      </w:r>
-      <w:r>
-        <w:t xml:space="preserve">下列何者「不是」菸害防制法之立法目的？ ①防制菸害 ②保護未成年免於菸害 ③保護孕婦免於菸害 ④促進菸品的使用 。 </w:t>
-      </w:r>
-    </w:p>
-    <w:p>
-      <w:pPr>
-        <w:numPr>
-          <w:ilvl w:val="0"/>
-          <w:numId w:val="1"/>
-        </w:numPr>
-        <w:spacing w:beforeLines="50" w:before="120" w:afterLines="50" w:after="120"/>
-        <w:ind w:right="44" w:hanging="554"/>
-      </w:pPr>
-      <w:r>
+        <w:rPr>
+          <w:color w:val="F2F2F2" w:themeColor="background1" w:themeShade="F2"/>
+        </w:rPr>
+        <w:t xml:space="preserve"> </w:t>
+      </w:r>
+      <w:r>
+        <w:rPr>
+          <w:color w:val="F2F2F2" w:themeColor="background1" w:themeShade="F2"/>
+        </w:rPr>
+        <w:t>下列何者「不是」</w:t>
+      </w:r>
+      <w:proofErr w:type="gramStart"/>
+      <w:r>
+        <w:rPr>
+          <w:color w:val="F2F2F2" w:themeColor="background1" w:themeShade="F2"/>
+        </w:rPr>
+        <w:t>菸</w:t>
+      </w:r>
+      <w:proofErr w:type="gramEnd"/>
+      <w:r>
+        <w:rPr>
+          <w:color w:val="F2F2F2" w:themeColor="background1" w:themeShade="F2"/>
+        </w:rPr>
+        <w:t xml:space="preserve">害防制法之立法目的？ ①防制菸害 ②保護未成年免於菸害 ③保護孕婦免於菸害 ④促進菸品的使用 。 </w:t>
+      </w:r>
+    </w:p>
+    <w:p>
+      <w:pPr>
+        <w:numPr>
+          <w:ilvl w:val="0"/>
+          <w:numId w:val="1"/>
+        </w:numPr>
+        <w:spacing w:beforeLines="50" w:before="120" w:afterLines="50" w:after="120"/>
+        <w:ind w:right="44" w:hanging="554"/>
+      </w:pPr>
+      <w:r>
+        <w:rPr>
+          <w:color w:val="F2F2F2" w:themeColor="background1" w:themeShade="F2"/>
+        </w:rPr>
         <w:t>(3)</w:t>
       </w:r>
       <w:r>
         <w:t xml:space="preserve"> </w:t>
       </w:r>
       <w:r>
-        <w:t xml:space="preserve">有關菸害防制法規範，「不可販賣菸品」給幾歲以下的人？ ①20 ②19 ③18 ④17 。 </w:t>
-      </w:r>
-    </w:p>
-    <w:p>
-      <w:pPr>
-        <w:numPr>
-          <w:ilvl w:val="0"/>
-          <w:numId w:val="1"/>
-        </w:numPr>
-        <w:spacing w:beforeLines="50" w:before="120" w:afterLines="50" w:after="120"/>
-        <w:ind w:right="44" w:hanging="554"/>
-      </w:pPr>
-      <w:r>
+        <w:t>有關</w:t>
+      </w:r>
+      <w:proofErr w:type="gramStart"/>
+      <w:r>
+        <w:t>菸</w:t>
+      </w:r>
+      <w:proofErr w:type="gramEnd"/>
+      <w:r>
+        <w:t>害防制法規範，「不可販賣</w:t>
+      </w:r>
+      <w:proofErr w:type="gramStart"/>
+      <w:r>
+        <w:t>菸</w:t>
+      </w:r>
+      <w:proofErr w:type="gramEnd"/>
+      <w:r>
+        <w:t xml:space="preserve">品」給幾歲以下的人？ ①20 ②19 ③18 ④17 。 </w:t>
+      </w:r>
+    </w:p>
+    <w:p>
+      <w:pPr>
+        <w:numPr>
+          <w:ilvl w:val="0"/>
+          <w:numId w:val="1"/>
+        </w:numPr>
+        <w:spacing w:beforeLines="50" w:before="120" w:afterLines="50" w:after="120"/>
+        <w:ind w:right="44" w:hanging="554"/>
+      </w:pPr>
+      <w:r>
+        <w:rPr>
+          <w:color w:val="F2F2F2" w:themeColor="background1" w:themeShade="F2"/>
+        </w:rPr>
         <w:t>(1)</w:t>
       </w:r>
       <w:r>
         <w:t xml:space="preserve"> </w:t>
       </w:r>
       <w:r>
-        <w:t xml:space="preserve">按菸害防制法規定，對於在禁菸場所吸菸會被罰多少錢？ ①新臺幣 2 千元至 1 萬元罰鍰 ②新臺幣 1 千元至 5 千元罰鍰 ③新臺幣 1 萬元至 5 萬元罰鍰 ④新臺幣 2 萬元至 10 萬元罰鍰 。 </w:t>
-      </w:r>
-    </w:p>
-    <w:p>
-      <w:pPr>
-        <w:numPr>
-          <w:ilvl w:val="0"/>
-          <w:numId w:val="1"/>
-        </w:numPr>
-        <w:spacing w:beforeLines="50" w:before="120" w:afterLines="50" w:after="120"/>
-        <w:ind w:right="44" w:hanging="554"/>
-      </w:pPr>
-      <w:r>
+        <w:t>按</w:t>
+      </w:r>
+      <w:proofErr w:type="gramStart"/>
+      <w:r>
+        <w:t>菸</w:t>
+      </w:r>
+      <w:proofErr w:type="gramEnd"/>
+      <w:r>
+        <w:t>害防制法規定，對於在禁</w:t>
+      </w:r>
+      <w:proofErr w:type="gramStart"/>
+      <w:r>
+        <w:t>菸</w:t>
+      </w:r>
+      <w:proofErr w:type="gramEnd"/>
+      <w:r>
+        <w:t xml:space="preserve">場所吸菸會被罰多少錢？ ①新臺幣 2 千元至 1 萬元罰鍰 ②新臺幣 1 千元至 5 千元罰鍰 ③新臺幣 1 萬元至 5 萬元罰鍰 ④新臺幣 2 萬元至 10 萬元罰鍰 。 </w:t>
+      </w:r>
+    </w:p>
+    <w:p>
+      <w:pPr>
+        <w:numPr>
+          <w:ilvl w:val="0"/>
+          <w:numId w:val="1"/>
+        </w:numPr>
+        <w:spacing w:beforeLines="50" w:before="120" w:afterLines="50" w:after="120"/>
+        <w:ind w:right="44" w:hanging="554"/>
+        <w:rPr>
+          <w:color w:val="F2F2F2" w:themeColor="background1" w:themeShade="F2"/>
+        </w:rPr>
+      </w:pPr>
+      <w:r>
+        <w:rPr>
+          <w:color w:val="F2F2F2" w:themeColor="background1" w:themeShade="F2"/>
+        </w:rPr>
         <w:t>(1)</w:t>
       </w:r>
       <w:r>
-        <w:t xml:space="preserve"> </w:t>
-      </w:r>
-      <w:r>
-        <w:t xml:space="preserve">按菸害防制法規定，下列敘述何者錯誤？ ①只有老闆、店員才可以出面勸阻在禁菸場所抽菸的人 ②任何人都可以出面勸阻在禁菸場所抽菸的人 ③ 餐廳、旅館設置室內吸菸室，需經專業技師簽證核可 ④加油站屬易燃易爆場所，任何人都要勸阻在禁菸場所抽菸的人 。 </w:t>
-      </w:r>
-    </w:p>
-    <w:p>
-      <w:pPr>
-        <w:numPr>
-          <w:ilvl w:val="0"/>
-          <w:numId w:val="1"/>
-        </w:numPr>
-        <w:spacing w:beforeLines="50" w:before="120" w:afterLines="50" w:after="120"/>
-        <w:ind w:right="44" w:hanging="554"/>
-      </w:pPr>
-      <w:r>
+        <w:rPr>
+          <w:color w:val="F2F2F2" w:themeColor="background1" w:themeShade="F2"/>
+        </w:rPr>
+        <w:t xml:space="preserve"> </w:t>
+      </w:r>
+      <w:r>
+        <w:rPr>
+          <w:color w:val="F2F2F2" w:themeColor="background1" w:themeShade="F2"/>
+        </w:rPr>
+        <w:t>按</w:t>
+      </w:r>
+      <w:proofErr w:type="gramStart"/>
+      <w:r>
+        <w:rPr>
+          <w:color w:val="F2F2F2" w:themeColor="background1" w:themeShade="F2"/>
+        </w:rPr>
+        <w:t>菸</w:t>
+      </w:r>
+      <w:proofErr w:type="gramEnd"/>
+      <w:r>
+        <w:rPr>
+          <w:color w:val="F2F2F2" w:themeColor="background1" w:themeShade="F2"/>
+        </w:rPr>
+        <w:t xml:space="preserve">害防制法規定，下列敘述何者錯誤？ ①只有老闆、店員才可以出面勸阻在禁菸場所抽菸的人 ②任何人都可以出面勸阻在禁菸場所抽菸的人 ③ 餐廳、旅館設置室內吸菸室，需經專業技師簽證核可 ④加油站屬易燃易爆場所，任何人都要勸阻在禁菸場所抽菸的人 。 </w:t>
+      </w:r>
+    </w:p>
+    <w:p>
+      <w:pPr>
+        <w:numPr>
+          <w:ilvl w:val="0"/>
+          <w:numId w:val="1"/>
+        </w:numPr>
+        <w:spacing w:beforeLines="50" w:before="120" w:afterLines="50" w:after="120"/>
+        <w:ind w:right="44" w:hanging="554"/>
+        <w:rPr>
+          <w:color w:val="F2F2F2" w:themeColor="background1" w:themeShade="F2"/>
+        </w:rPr>
+      </w:pPr>
+      <w:r>
+        <w:rPr>
+          <w:color w:val="F2F2F2" w:themeColor="background1" w:themeShade="F2"/>
+        </w:rPr>
         <w:lastRenderedPageBreak/>
         <w:t>(3)</w:t>
       </w:r>
       <w:r>
-        <w:t xml:space="preserve"> </w:t>
-      </w:r>
-      <w:r>
-        <w:t xml:space="preserve">按菸害防制法規定，對於主管每天在辦公室內吸菸，應如何處理？ ①未違反菸害防制法 ②因為是主管，所以只好忍耐 ③撥打菸害申訴專線檢舉(0800-531-531) ④開空氣清淨機，睜一隻眼閉一睜眼 。 </w:t>
-      </w:r>
-    </w:p>
-    <w:p>
-      <w:pPr>
-        <w:numPr>
-          <w:ilvl w:val="0"/>
-          <w:numId w:val="1"/>
-        </w:numPr>
-        <w:spacing w:beforeLines="50" w:before="120" w:afterLines="50" w:after="120"/>
-        <w:ind w:right="44" w:hanging="554"/>
-      </w:pPr>
-      <w:r>
+        <w:rPr>
+          <w:color w:val="F2F2F2" w:themeColor="background1" w:themeShade="F2"/>
+        </w:rPr>
+        <w:t xml:space="preserve"> </w:t>
+      </w:r>
+      <w:r>
+        <w:rPr>
+          <w:color w:val="F2F2F2" w:themeColor="background1" w:themeShade="F2"/>
+        </w:rPr>
+        <w:t>按</w:t>
+      </w:r>
+      <w:proofErr w:type="gramStart"/>
+      <w:r>
+        <w:rPr>
+          <w:color w:val="F2F2F2" w:themeColor="background1" w:themeShade="F2"/>
+        </w:rPr>
+        <w:t>菸</w:t>
+      </w:r>
+      <w:proofErr w:type="gramEnd"/>
+      <w:r>
+        <w:rPr>
+          <w:color w:val="F2F2F2" w:themeColor="background1" w:themeShade="F2"/>
+        </w:rPr>
+        <w:t xml:space="preserve">害防制法規定，對於主管每天在辦公室內吸菸，應如何處理？ ①未違反菸害防制法 ②因為是主管，所以只好忍耐 ③撥打菸害申訴專線檢舉(0800-531-531) ④開空氣清淨機，睜一隻眼閉一睜眼 。 </w:t>
+      </w:r>
+    </w:p>
+    <w:p>
+      <w:pPr>
+        <w:numPr>
+          <w:ilvl w:val="0"/>
+          <w:numId w:val="1"/>
+        </w:numPr>
+        <w:spacing w:beforeLines="50" w:before="120" w:afterLines="50" w:after="120"/>
+        <w:ind w:right="44" w:hanging="554"/>
+        <w:rPr>
+          <w:color w:val="F2F2F2" w:themeColor="background1" w:themeShade="F2"/>
+        </w:rPr>
+      </w:pPr>
+      <w:r>
+        <w:rPr>
+          <w:color w:val="F2F2F2" w:themeColor="background1" w:themeShade="F2"/>
+        </w:rPr>
         <w:t>(4)</w:t>
       </w:r>
       <w:r>
-        <w:t xml:space="preserve"> </w:t>
-      </w:r>
-      <w:r>
+        <w:rPr>
+          <w:color w:val="F2F2F2" w:themeColor="background1" w:themeShade="F2"/>
+        </w:rPr>
+        <w:t xml:space="preserve"> </w:t>
+      </w:r>
+      <w:r>
+        <w:rPr>
+          <w:color w:val="F2F2F2" w:themeColor="background1" w:themeShade="F2"/>
+        </w:rPr>
         <w:t xml:space="preserve">對電子煙的敘述，何者錯誤？ ①含有尼古丁會成癮 ②會有爆炸危險 ③含有毒致癌物質 ④可以幫助戒菸 。 </w:t>
       </w:r>
     </w:p>
@@ -1859,10 +3204,24 @@
         </w:numPr>
         <w:spacing w:beforeLines="50" w:before="120" w:afterLines="50" w:after="120"/>
         <w:ind w:right="44" w:hanging="554"/>
-      </w:pPr>
-      <w:r>
-        <w:t>(4) 下列何者是錯誤的「戒菸」方式？ ①撥打戒菸專線 0800-63-63-63 ②求助醫療院所、社區藥局專業戒菸 ③參加醫院或衛生所所辦理的戒菸班 ④自己購買電子煙來戒菸 。</w:t>
-      </w:r>
+        <w:rPr>
+          <w:color w:val="F2F2F2" w:themeColor="background1" w:themeShade="F2"/>
+        </w:rPr>
+      </w:pPr>
+      <w:r>
+        <w:rPr>
+          <w:color w:val="F2F2F2" w:themeColor="background1" w:themeShade="F2"/>
+        </w:rPr>
+        <w:t>(4)</w:t>
+      </w:r>
+      <w:r>
+        <w:rPr>
+          <w:color w:val="F2F2F2" w:themeColor="background1" w:themeShade="F2"/>
+        </w:rPr>
+        <w:t xml:space="preserve"> 下列何者是錯誤的「戒菸」方式？ ①撥打戒菸專線 0800-63-63-63 ②求助醫療院所、社區藥局專業戒菸 ③參加醫院或衛生所所辦理的戒菸班 ④自己購買電子煙來戒菸 。</w:t>
+      </w:r>
+      <w:bookmarkStart w:id="0" w:name="_GoBack"/>
+      <w:bookmarkEnd w:id="0"/>
     </w:p>
     <w:sectPr>
       <w:footerReference w:type="even" r:id="rId7"/>
@@ -1878,7 +3237,7 @@
 </file>
 
 <file path=word/endnotes.xml><?xml version="1.0" encoding="utf-8"?>
-<w:endnotes xmlns:wpc="http://schemas.microsoft.com/office/word/2010/wordprocessingCanvas" xmlns:cx="http://schemas.microsoft.com/office/drawing/2014/chartex" xmlns:cx1="http://schemas.microsoft.com/office/drawing/2015/9/8/chartex" xmlns:cx2="http://schemas.microsoft.com/office/drawing/2015/10/21/chartex" xmlns:cx3="http://schemas.microsoft.com/office/drawing/2016/5/9/chartex" xmlns:cx4="http://schemas.microsoft.com/office/drawing/2016/5/10/chartex" xmlns:cx5="http://schemas.microsoft.com/office/drawing/2016/5/11/chartex" xmlns:cx6="http://schemas.microsoft.com/office/drawing/2016/5/12/chartex" xmlns:cx7="http://schemas.microsoft.com/office/drawing/2016/5/13/chartex" xmlns:cx8="http://schemas.microsoft.com/office/drawing/2016/5/14/chartex" xmlns:mc="http://schemas.openxmlformats.org/markup-compatibility/2006" xmlns:aink="http://schemas.microsoft.com/office/drawing/2016/ink" xmlns:am3d="http://schemas.microsoft.com/office/drawing/2017/model3d" xmlns:o="urn:schemas-microsoft-com:office:office" xmlns:r="http://schemas.openxmlformats.org/officeDocument/2006/relationships" xmlns:m="http://schemas.openxmlformats.org/officeDocument/2006/math" xmlns:v="urn:schemas-microsoft-com:vml" xmlns:wp14="http://schemas.microsoft.com/office/word/2010/wordprocessingDrawing" xmlns:wp="http://schemas.openxmlformats.org/drawingml/2006/wordprocessingDrawing" xmlns:w10="urn:schemas-microsoft-com:office:word" xmlns:w="http://schemas.openxmlformats.org/wordprocessingml/2006/main" xmlns:w14="http://schemas.microsoft.com/office/word/2010/wordml" xmlns:w15="http://schemas.microsoft.com/office/word/2012/wordml" xmlns:w16cex="http://schemas.microsoft.com/office/word/2018/wordml/cex" xmlns:w16cid="http://schemas.microsoft.com/office/word/2016/wordml/cid" xmlns:w16="http://schemas.microsoft.com/office/word/2018/wordml" xmlns:w16sdtdh="http://schemas.microsoft.com/office/word/2020/wordml/sdtdatahash" xmlns:w16se="http://schemas.microsoft.com/office/word/2015/wordml/symex" xmlns:wpg="http://schemas.microsoft.com/office/word/2010/wordprocessingGroup" xmlns:wpi="http://schemas.microsoft.com/office/word/2010/wordprocessingInk" xmlns:wne="http://schemas.microsoft.com/office/word/2006/wordml" xmlns:wps="http://schemas.microsoft.com/office/word/2010/wordprocessingShape" mc:Ignorable="w14 w15 w16se w16cid w16 w16cex w16sdtdh wp14">
+<w:endnotes xmlns:wpc="http://schemas.microsoft.com/office/word/2010/wordprocessingCanvas" xmlns:cx="http://schemas.microsoft.com/office/drawing/2014/chartex" xmlns:mc="http://schemas.openxmlformats.org/markup-compatibility/2006" xmlns:o="urn:schemas-microsoft-com:office:office" xmlns:r="http://schemas.openxmlformats.org/officeDocument/2006/relationships" xmlns:m="http://schemas.openxmlformats.org/officeDocument/2006/math" xmlns:v="urn:schemas-microsoft-com:vml" xmlns:wp14="http://schemas.microsoft.com/office/word/2010/wordprocessingDrawing" xmlns:wp="http://schemas.openxmlformats.org/drawingml/2006/wordprocessingDrawing" xmlns:w10="urn:schemas-microsoft-com:office:word" xmlns:w="http://schemas.openxmlformats.org/wordprocessingml/2006/main" xmlns:w14="http://schemas.microsoft.com/office/word/2010/wordml" xmlns:w15="http://schemas.microsoft.com/office/word/2012/wordml" xmlns:w16se="http://schemas.microsoft.com/office/word/2015/wordml/symex" xmlns:wpg="http://schemas.microsoft.com/office/word/2010/wordprocessingGroup" xmlns:wpi="http://schemas.microsoft.com/office/word/2010/wordprocessingInk" xmlns:wne="http://schemas.microsoft.com/office/word/2006/wordml" xmlns:wps="http://schemas.microsoft.com/office/word/2010/wordprocessingShape" mc:Ignorable="w14 w15 w16se wp14">
   <w:endnote w:type="separator" w:id="-1">
     <w:p>
       <w:pPr>
@@ -1903,7 +3262,7 @@
 </file>
 
 <file path=word/footer1.xml><?xml version="1.0" encoding="utf-8"?>
-<w:ftr xmlns:wpc="http://schemas.microsoft.com/office/word/2010/wordprocessingCanvas" xmlns:cx="http://schemas.microsoft.com/office/drawing/2014/chartex" xmlns:cx1="http://schemas.microsoft.com/office/drawing/2015/9/8/chartex" xmlns:cx2="http://schemas.microsoft.com/office/drawing/2015/10/21/chartex" xmlns:cx3="http://schemas.microsoft.com/office/drawing/2016/5/9/chartex" xmlns:cx4="http://schemas.microsoft.com/office/drawing/2016/5/10/chartex" xmlns:cx5="http://schemas.microsoft.com/office/drawing/2016/5/11/chartex" xmlns:cx6="http://schemas.microsoft.com/office/drawing/2016/5/12/chartex" xmlns:cx7="http://schemas.microsoft.com/office/drawing/2016/5/13/chartex" xmlns:cx8="http://schemas.microsoft.com/office/drawing/2016/5/14/chartex" xmlns:mc="http://schemas.openxmlformats.org/markup-compatibility/2006" xmlns:aink="http://schemas.microsoft.com/office/drawing/2016/ink" xmlns:am3d="http://schemas.microsoft.com/office/drawing/2017/model3d" xmlns:o="urn:schemas-microsoft-com:office:office" xmlns:r="http://schemas.openxmlformats.org/officeDocument/2006/relationships" xmlns:m="http://schemas.openxmlformats.org/officeDocument/2006/math" xmlns:v="urn:schemas-microsoft-com:vml" xmlns:wp14="http://schemas.microsoft.com/office/word/2010/wordprocessingDrawing" xmlns:wp="http://schemas.openxmlformats.org/drawingml/2006/wordprocessingDrawing" xmlns:w10="urn:schemas-microsoft-com:office:word" xmlns:w="http://schemas.openxmlformats.org/wordprocessingml/2006/main" xmlns:w14="http://schemas.microsoft.com/office/word/2010/wordml" xmlns:w15="http://schemas.microsoft.com/office/word/2012/wordml" xmlns:w16cex="http://schemas.microsoft.com/office/word/2018/wordml/cex" xmlns:w16cid="http://schemas.microsoft.com/office/word/2016/wordml/cid" xmlns:w16="http://schemas.microsoft.com/office/word/2018/wordml" xmlns:w16sdtdh="http://schemas.microsoft.com/office/word/2020/wordml/sdtdatahash" xmlns:w16se="http://schemas.microsoft.com/office/word/2015/wordml/symex" xmlns:wpg="http://schemas.microsoft.com/office/word/2010/wordprocessingGroup" xmlns:wpi="http://schemas.microsoft.com/office/word/2010/wordprocessingInk" xmlns:wne="http://schemas.microsoft.com/office/word/2006/wordml" xmlns:wps="http://schemas.microsoft.com/office/word/2010/wordprocessingShape" mc:Ignorable="w14 w15 w16se w16cid w16 w16cex w16sdtdh wp14">
+<w:ftr xmlns:wpc="http://schemas.microsoft.com/office/word/2010/wordprocessingCanvas" xmlns:cx="http://schemas.microsoft.com/office/drawing/2014/chartex" xmlns:mc="http://schemas.openxmlformats.org/markup-compatibility/2006" xmlns:o="urn:schemas-microsoft-com:office:office" xmlns:r="http://schemas.openxmlformats.org/officeDocument/2006/relationships" xmlns:m="http://schemas.openxmlformats.org/officeDocument/2006/math" xmlns:v="urn:schemas-microsoft-com:vml" xmlns:wp14="http://schemas.microsoft.com/office/word/2010/wordprocessingDrawing" xmlns:wp="http://schemas.openxmlformats.org/drawingml/2006/wordprocessingDrawing" xmlns:w10="urn:schemas-microsoft-com:office:word" xmlns:w="http://schemas.openxmlformats.org/wordprocessingml/2006/main" xmlns:w14="http://schemas.microsoft.com/office/word/2010/wordml" xmlns:w15="http://schemas.microsoft.com/office/word/2012/wordml" xmlns:w16se="http://schemas.microsoft.com/office/word/2015/wordml/symex" xmlns:wpg="http://schemas.microsoft.com/office/word/2010/wordprocessingGroup" xmlns:wpi="http://schemas.microsoft.com/office/word/2010/wordprocessingInk" xmlns:wne="http://schemas.microsoft.com/office/word/2006/wordml" xmlns:wps="http://schemas.microsoft.com/office/word/2010/wordprocessingShape" mc:Ignorable="w14 w15 w16se wp14">
   <w:p>
     <w:pPr>
       <w:spacing w:after="0" w:line="259" w:lineRule="auto"/>
@@ -1932,7 +3291,7 @@
         <w:noProof/>
         <w:sz w:val="22"/>
       </w:rPr>
-      <w:t>10</w:t>
+      <w:t>2</w:t>
     </w:r>
     <w:r>
       <w:rPr>
@@ -1948,37 +3307,22 @@
       </w:rPr>
       <w:t xml:space="preserve"> of </w:t>
     </w:r>
-    <w:r>
-      <w:fldChar w:fldCharType="begin"/>
-    </w:r>
-    <w:r>
-      <w:instrText xml:space="preserve"> NUMPAGES   \* MERGEFORMAT </w:instrText>
-    </w:r>
-    <w:r>
-      <w:fldChar w:fldCharType="separate"/>
-    </w:r>
-    <w:r>
-      <w:rPr>
-        <w:rFonts w:ascii="Arial" w:eastAsia="Arial" w:hAnsi="Arial" w:cs="Arial"/>
-        <w:noProof/>
-        <w:sz w:val="22"/>
-      </w:rPr>
-      <w:t>10</w:t>
-    </w:r>
-    <w:r>
-      <w:rPr>
-        <w:rFonts w:ascii="Arial" w:eastAsia="Arial" w:hAnsi="Arial" w:cs="Arial"/>
-        <w:noProof/>
-        <w:sz w:val="22"/>
-      </w:rPr>
-      <w:fldChar w:fldCharType="end"/>
-    </w:r>
+    <w:fldSimple w:instr=" NUMPAGES   \* MERGEFORMAT ">
+      <w:r>
+        <w:rPr>
+          <w:rFonts w:ascii="Arial" w:eastAsia="Arial" w:hAnsi="Arial" w:cs="Arial"/>
+          <w:noProof/>
+          <w:sz w:val="22"/>
+        </w:rPr>
+        <w:t>10</w:t>
+      </w:r>
+    </w:fldSimple>
   </w:p>
 </w:ftr>
 </file>
 
 <file path=word/footer2.xml><?xml version="1.0" encoding="utf-8"?>
-<w:ftr xmlns:wpc="http://schemas.microsoft.com/office/word/2010/wordprocessingCanvas" xmlns:cx="http://schemas.microsoft.com/office/drawing/2014/chartex" xmlns:cx1="http://schemas.microsoft.com/office/drawing/2015/9/8/chartex" xmlns:cx2="http://schemas.microsoft.com/office/drawing/2015/10/21/chartex" xmlns:cx3="http://schemas.microsoft.com/office/drawing/2016/5/9/chartex" xmlns:cx4="http://schemas.microsoft.com/office/drawing/2016/5/10/chartex" xmlns:cx5="http://schemas.microsoft.com/office/drawing/2016/5/11/chartex" xmlns:cx6="http://schemas.microsoft.com/office/drawing/2016/5/12/chartex" xmlns:cx7="http://schemas.microsoft.com/office/drawing/2016/5/13/chartex" xmlns:cx8="http://schemas.microsoft.com/office/drawing/2016/5/14/chartex" xmlns:mc="http://schemas.openxmlformats.org/markup-compatibility/2006" xmlns:aink="http://schemas.microsoft.com/office/drawing/2016/ink" xmlns:am3d="http://schemas.microsoft.com/office/drawing/2017/model3d" xmlns:o="urn:schemas-microsoft-com:office:office" xmlns:r="http://schemas.openxmlformats.org/officeDocument/2006/relationships" xmlns:m="http://schemas.openxmlformats.org/officeDocument/2006/math" xmlns:v="urn:schemas-microsoft-com:vml" xmlns:wp14="http://schemas.microsoft.com/office/word/2010/wordprocessingDrawing" xmlns:wp="http://schemas.openxmlformats.org/drawingml/2006/wordprocessingDrawing" xmlns:w10="urn:schemas-microsoft-com:office:word" xmlns:w="http://schemas.openxmlformats.org/wordprocessingml/2006/main" xmlns:w14="http://schemas.microsoft.com/office/word/2010/wordml" xmlns:w15="http://schemas.microsoft.com/office/word/2012/wordml" xmlns:w16cex="http://schemas.microsoft.com/office/word/2018/wordml/cex" xmlns:w16cid="http://schemas.microsoft.com/office/word/2016/wordml/cid" xmlns:w16="http://schemas.microsoft.com/office/word/2018/wordml" xmlns:w16sdtdh="http://schemas.microsoft.com/office/word/2020/wordml/sdtdatahash" xmlns:w16se="http://schemas.microsoft.com/office/word/2015/wordml/symex" xmlns:wpg="http://schemas.microsoft.com/office/word/2010/wordprocessingGroup" xmlns:wpi="http://schemas.microsoft.com/office/word/2010/wordprocessingInk" xmlns:wne="http://schemas.microsoft.com/office/word/2006/wordml" xmlns:wps="http://schemas.microsoft.com/office/word/2010/wordprocessingShape" mc:Ignorable="w14 w15 w16se w16cid w16 w16cex w16sdtdh wp14">
+<w:ftr xmlns:wpc="http://schemas.microsoft.com/office/word/2010/wordprocessingCanvas" xmlns:cx="http://schemas.microsoft.com/office/drawing/2014/chartex" xmlns:mc="http://schemas.openxmlformats.org/markup-compatibility/2006" xmlns:o="urn:schemas-microsoft-com:office:office" xmlns:r="http://schemas.openxmlformats.org/officeDocument/2006/relationships" xmlns:m="http://schemas.openxmlformats.org/officeDocument/2006/math" xmlns:v="urn:schemas-microsoft-com:vml" xmlns:wp14="http://schemas.microsoft.com/office/word/2010/wordprocessingDrawing" xmlns:wp="http://schemas.openxmlformats.org/drawingml/2006/wordprocessingDrawing" xmlns:w10="urn:schemas-microsoft-com:office:word" xmlns:w="http://schemas.openxmlformats.org/wordprocessingml/2006/main" xmlns:w14="http://schemas.microsoft.com/office/word/2010/wordml" xmlns:w15="http://schemas.microsoft.com/office/word/2012/wordml" xmlns:w16se="http://schemas.microsoft.com/office/word/2015/wordml/symex" xmlns:wpg="http://schemas.microsoft.com/office/word/2010/wordprocessingGroup" xmlns:wpi="http://schemas.microsoft.com/office/word/2010/wordprocessingInk" xmlns:wne="http://schemas.microsoft.com/office/word/2006/wordml" xmlns:wps="http://schemas.microsoft.com/office/word/2010/wordprocessingShape" mc:Ignorable="w14 w15 w16se wp14">
   <w:p>
     <w:pPr>
       <w:spacing w:after="0" w:line="259" w:lineRule="auto"/>
@@ -2007,7 +3351,7 @@
         <w:noProof/>
         <w:sz w:val="22"/>
       </w:rPr>
-      <w:t>9</w:t>
+      <w:t>3</w:t>
     </w:r>
     <w:r>
       <w:rPr>
@@ -2023,37 +3367,22 @@
       </w:rPr>
       <w:t xml:space="preserve"> of </w:t>
     </w:r>
-    <w:r>
-      <w:fldChar w:fldCharType="begin"/>
-    </w:r>
-    <w:r>
-      <w:instrText xml:space="preserve"> NUMPAGES   \* MERGEFORMAT </w:instrText>
-    </w:r>
-    <w:r>
-      <w:fldChar w:fldCharType="separate"/>
-    </w:r>
-    <w:r>
-      <w:rPr>
-        <w:rFonts w:ascii="Arial" w:eastAsia="Arial" w:hAnsi="Arial" w:cs="Arial"/>
-        <w:noProof/>
-        <w:sz w:val="22"/>
-      </w:rPr>
-      <w:t>10</w:t>
-    </w:r>
-    <w:r>
-      <w:rPr>
-        <w:rFonts w:ascii="Arial" w:eastAsia="Arial" w:hAnsi="Arial" w:cs="Arial"/>
-        <w:noProof/>
-        <w:sz w:val="22"/>
-      </w:rPr>
-      <w:fldChar w:fldCharType="end"/>
-    </w:r>
+    <w:fldSimple w:instr=" NUMPAGES   \* MERGEFORMAT ">
+      <w:r>
+        <w:rPr>
+          <w:rFonts w:ascii="Arial" w:eastAsia="Arial" w:hAnsi="Arial" w:cs="Arial"/>
+          <w:noProof/>
+          <w:sz w:val="22"/>
+        </w:rPr>
+        <w:t>10</w:t>
+      </w:r>
+    </w:fldSimple>
   </w:p>
 </w:ftr>
 </file>
 
 <file path=word/footer3.xml><?xml version="1.0" encoding="utf-8"?>
-<w:ftr xmlns:wpc="http://schemas.microsoft.com/office/word/2010/wordprocessingCanvas" xmlns:cx="http://schemas.microsoft.com/office/drawing/2014/chartex" xmlns:cx1="http://schemas.microsoft.com/office/drawing/2015/9/8/chartex" xmlns:cx2="http://schemas.microsoft.com/office/drawing/2015/10/21/chartex" xmlns:cx3="http://schemas.microsoft.com/office/drawing/2016/5/9/chartex" xmlns:cx4="http://schemas.microsoft.com/office/drawing/2016/5/10/chartex" xmlns:cx5="http://schemas.microsoft.com/office/drawing/2016/5/11/chartex" xmlns:cx6="http://schemas.microsoft.com/office/drawing/2016/5/12/chartex" xmlns:cx7="http://schemas.microsoft.com/office/drawing/2016/5/13/chartex" xmlns:cx8="http://schemas.microsoft.com/office/drawing/2016/5/14/chartex" xmlns:mc="http://schemas.openxmlformats.org/markup-compatibility/2006" xmlns:aink="http://schemas.microsoft.com/office/drawing/2016/ink" xmlns:am3d="http://schemas.microsoft.com/office/drawing/2017/model3d" xmlns:o="urn:schemas-microsoft-com:office:office" xmlns:r="http://schemas.openxmlformats.org/officeDocument/2006/relationships" xmlns:m="http://schemas.openxmlformats.org/officeDocument/2006/math" xmlns:v="urn:schemas-microsoft-com:vml" xmlns:wp14="http://schemas.microsoft.com/office/word/2010/wordprocessingDrawing" xmlns:wp="http://schemas.openxmlformats.org/drawingml/2006/wordprocessingDrawing" xmlns:w10="urn:schemas-microsoft-com:office:word" xmlns:w="http://schemas.openxmlformats.org/wordprocessingml/2006/main" xmlns:w14="http://schemas.microsoft.com/office/word/2010/wordml" xmlns:w15="http://schemas.microsoft.com/office/word/2012/wordml" xmlns:w16cex="http://schemas.microsoft.com/office/word/2018/wordml/cex" xmlns:w16cid="http://schemas.microsoft.com/office/word/2016/wordml/cid" xmlns:w16="http://schemas.microsoft.com/office/word/2018/wordml" xmlns:w16sdtdh="http://schemas.microsoft.com/office/word/2020/wordml/sdtdatahash" xmlns:w16se="http://schemas.microsoft.com/office/word/2015/wordml/symex" xmlns:wpg="http://schemas.microsoft.com/office/word/2010/wordprocessingGroup" xmlns:wpi="http://schemas.microsoft.com/office/word/2010/wordprocessingInk" xmlns:wne="http://schemas.microsoft.com/office/word/2006/wordml" xmlns:wps="http://schemas.microsoft.com/office/word/2010/wordprocessingShape" mc:Ignorable="w14 w15 w16se w16cid w16 w16cex w16sdtdh wp14">
+<w:ftr xmlns:wpc="http://schemas.microsoft.com/office/word/2010/wordprocessingCanvas" xmlns:cx="http://schemas.microsoft.com/office/drawing/2014/chartex" xmlns:mc="http://schemas.openxmlformats.org/markup-compatibility/2006" xmlns:o="urn:schemas-microsoft-com:office:office" xmlns:r="http://schemas.openxmlformats.org/officeDocument/2006/relationships" xmlns:m="http://schemas.openxmlformats.org/officeDocument/2006/math" xmlns:v="urn:schemas-microsoft-com:vml" xmlns:wp14="http://schemas.microsoft.com/office/word/2010/wordprocessingDrawing" xmlns:wp="http://schemas.openxmlformats.org/drawingml/2006/wordprocessingDrawing" xmlns:w10="urn:schemas-microsoft-com:office:word" xmlns:w="http://schemas.openxmlformats.org/wordprocessingml/2006/main" xmlns:w14="http://schemas.microsoft.com/office/word/2010/wordml" xmlns:w15="http://schemas.microsoft.com/office/word/2012/wordml" xmlns:w16se="http://schemas.microsoft.com/office/word/2015/wordml/symex" xmlns:wpg="http://schemas.microsoft.com/office/word/2010/wordprocessingGroup" xmlns:wpi="http://schemas.microsoft.com/office/word/2010/wordprocessingInk" xmlns:wne="http://schemas.microsoft.com/office/word/2006/wordml" xmlns:wps="http://schemas.microsoft.com/office/word/2010/wordprocessingShape" mc:Ignorable="w14 w15 w16se wp14">
   <w:p>
     <w:pPr>
       <w:spacing w:after="0" w:line="259" w:lineRule="auto"/>
@@ -2098,37 +3427,22 @@
       </w:rPr>
       <w:t xml:space="preserve"> of </w:t>
     </w:r>
-    <w:r>
-      <w:fldChar w:fldCharType="begin"/>
-    </w:r>
-    <w:r>
-      <w:instrText xml:space="preserve"> NUMPAGES   \* MERGEFORMAT </w:instrText>
-    </w:r>
-    <w:r>
-      <w:fldChar w:fldCharType="separate"/>
-    </w:r>
-    <w:r>
-      <w:rPr>
-        <w:rFonts w:ascii="Arial" w:eastAsia="Arial" w:hAnsi="Arial" w:cs="Arial"/>
-        <w:noProof/>
-        <w:sz w:val="22"/>
-      </w:rPr>
-      <w:t>10</w:t>
-    </w:r>
-    <w:r>
-      <w:rPr>
-        <w:rFonts w:ascii="Arial" w:eastAsia="Arial" w:hAnsi="Arial" w:cs="Arial"/>
-        <w:noProof/>
-        <w:sz w:val="22"/>
-      </w:rPr>
-      <w:fldChar w:fldCharType="end"/>
-    </w:r>
+    <w:fldSimple w:instr=" NUMPAGES   \* MERGEFORMAT ">
+      <w:r>
+        <w:rPr>
+          <w:rFonts w:ascii="Arial" w:eastAsia="Arial" w:hAnsi="Arial" w:cs="Arial"/>
+          <w:noProof/>
+          <w:sz w:val="22"/>
+        </w:rPr>
+        <w:t>10</w:t>
+      </w:r>
+    </w:fldSimple>
   </w:p>
 </w:ftr>
 </file>
 
 <file path=word/footnotes.xml><?xml version="1.0" encoding="utf-8"?>
-<w:footnotes xmlns:wpc="http://schemas.microsoft.com/office/word/2010/wordprocessingCanvas" xmlns:cx="http://schemas.microsoft.com/office/drawing/2014/chartex" xmlns:cx1="http://schemas.microsoft.com/office/drawing/2015/9/8/chartex" xmlns:cx2="http://schemas.microsoft.com/office/drawing/2015/10/21/chartex" xmlns:cx3="http://schemas.microsoft.com/office/drawing/2016/5/9/chartex" xmlns:cx4="http://schemas.microsoft.com/office/drawing/2016/5/10/chartex" xmlns:cx5="http://schemas.microsoft.com/office/drawing/2016/5/11/chartex" xmlns:cx6="http://schemas.microsoft.com/office/drawing/2016/5/12/chartex" xmlns:cx7="http://schemas.microsoft.com/office/drawing/2016/5/13/chartex" xmlns:cx8="http://schemas.microsoft.com/office/drawing/2016/5/14/chartex" xmlns:mc="http://schemas.openxmlformats.org/markup-compatibility/2006" xmlns:aink="http://schemas.microsoft.com/office/drawing/2016/ink" xmlns:am3d="http://schemas.microsoft.com/office/drawing/2017/model3d" xmlns:o="urn:schemas-microsoft-com:office:office" xmlns:r="http://schemas.openxmlformats.org/officeDocument/2006/relationships" xmlns:m="http://schemas.openxmlformats.org/officeDocument/2006/math" xmlns:v="urn:schemas-microsoft-com:vml" xmlns:wp14="http://schemas.microsoft.com/office/word/2010/wordprocessingDrawing" xmlns:wp="http://schemas.openxmlformats.org/drawingml/2006/wordprocessingDrawing" xmlns:w10="urn:schemas-microsoft-com:office:word" xmlns:w="http://schemas.openxmlformats.org/wordprocessingml/2006/main" xmlns:w14="http://schemas.microsoft.com/office/word/2010/wordml" xmlns:w15="http://schemas.microsoft.com/office/word/2012/wordml" xmlns:w16cex="http://schemas.microsoft.com/office/word/2018/wordml/cex" xmlns:w16cid="http://schemas.microsoft.com/office/word/2016/wordml/cid" xmlns:w16="http://schemas.microsoft.com/office/word/2018/wordml" xmlns:w16sdtdh="http://schemas.microsoft.com/office/word/2020/wordml/sdtdatahash" xmlns:w16se="http://schemas.microsoft.com/office/word/2015/wordml/symex" xmlns:wpg="http://schemas.microsoft.com/office/word/2010/wordprocessingGroup" xmlns:wpi="http://schemas.microsoft.com/office/word/2010/wordprocessingInk" xmlns:wne="http://schemas.microsoft.com/office/word/2006/wordml" xmlns:wps="http://schemas.microsoft.com/office/word/2010/wordprocessingShape" mc:Ignorable="w14 w15 w16se w16cid w16 w16cex w16sdtdh wp14">
+<w:footnotes xmlns:wpc="http://schemas.microsoft.com/office/word/2010/wordprocessingCanvas" xmlns:cx="http://schemas.microsoft.com/office/drawing/2014/chartex" xmlns:mc="http://schemas.openxmlformats.org/markup-compatibility/2006" xmlns:o="urn:schemas-microsoft-com:office:office" xmlns:r="http://schemas.openxmlformats.org/officeDocument/2006/relationships" xmlns:m="http://schemas.openxmlformats.org/officeDocument/2006/math" xmlns:v="urn:schemas-microsoft-com:vml" xmlns:wp14="http://schemas.microsoft.com/office/word/2010/wordprocessingDrawing" xmlns:wp="http://schemas.openxmlformats.org/drawingml/2006/wordprocessingDrawing" xmlns:w10="urn:schemas-microsoft-com:office:word" xmlns:w="http://schemas.openxmlformats.org/wordprocessingml/2006/main" xmlns:w14="http://schemas.microsoft.com/office/word/2010/wordml" xmlns:w15="http://schemas.microsoft.com/office/word/2012/wordml" xmlns:w16se="http://schemas.microsoft.com/office/word/2015/wordml/symex" xmlns:wpg="http://schemas.microsoft.com/office/word/2010/wordprocessingGroup" xmlns:wpi="http://schemas.microsoft.com/office/word/2010/wordprocessingInk" xmlns:wne="http://schemas.microsoft.com/office/word/2006/wordml" xmlns:wps="http://schemas.microsoft.com/office/word/2010/wordprocessingShape" mc:Ignorable="w14 w15 w16se wp14">
   <w:footnote w:type="separator" w:id="-1">
     <w:p>
       <w:pPr>
@@ -2153,7 +3467,7 @@
 </file>
 
 <file path=word/numbering.xml><?xml version="1.0" encoding="utf-8"?>
-<w:numbering xmlns:wpc="http://schemas.microsoft.com/office/word/2010/wordprocessingCanvas" xmlns:cx="http://schemas.microsoft.com/office/drawing/2014/chartex" xmlns:cx1="http://schemas.microsoft.com/office/drawing/2015/9/8/chartex" xmlns:cx2="http://schemas.microsoft.com/office/drawing/2015/10/21/chartex" xmlns:cx3="http://schemas.microsoft.com/office/drawing/2016/5/9/chartex" xmlns:cx4="http://schemas.microsoft.com/office/drawing/2016/5/10/chartex" xmlns:cx5="http://schemas.microsoft.com/office/drawing/2016/5/11/chartex" xmlns:cx6="http://schemas.microsoft.com/office/drawing/2016/5/12/chartex" xmlns:cx7="http://schemas.microsoft.com/office/drawing/2016/5/13/chartex" xmlns:cx8="http://schemas.microsoft.com/office/drawing/2016/5/14/chartex" xmlns:mc="http://schemas.openxmlformats.org/markup-compatibility/2006" xmlns:aink="http://schemas.microsoft.com/office/drawing/2016/ink" xmlns:am3d="http://schemas.microsoft.com/office/drawing/2017/model3d" xmlns:o="urn:schemas-microsoft-com:office:office" xmlns:r="http://schemas.openxmlformats.org/officeDocument/2006/relationships" xmlns:m="http://schemas.openxmlformats.org/officeDocument/2006/math" xmlns:v="urn:schemas-microsoft-com:vml" xmlns:wp14="http://schemas.microsoft.com/office/word/2010/wordprocessingDrawing" xmlns:wp="http://schemas.openxmlformats.org/drawingml/2006/wordprocessingDrawing" xmlns:w10="urn:schemas-microsoft-com:office:word" xmlns:w="http://schemas.openxmlformats.org/wordprocessingml/2006/main" xmlns:w14="http://schemas.microsoft.com/office/word/2010/wordml" xmlns:w15="http://schemas.microsoft.com/office/word/2012/wordml" xmlns:w16cex="http://schemas.microsoft.com/office/word/2018/wordml/cex" xmlns:w16cid="http://schemas.microsoft.com/office/word/2016/wordml/cid" xmlns:w16="http://schemas.microsoft.com/office/word/2018/wordml" xmlns:w16sdtdh="http://schemas.microsoft.com/office/word/2020/wordml/sdtdatahash" xmlns:w16se="http://schemas.microsoft.com/office/word/2015/wordml/symex" xmlns:wpg="http://schemas.microsoft.com/office/word/2010/wordprocessingGroup" xmlns:wpi="http://schemas.microsoft.com/office/word/2010/wordprocessingInk" xmlns:wne="http://schemas.microsoft.com/office/word/2006/wordml" xmlns:wps="http://schemas.microsoft.com/office/word/2010/wordprocessingShape" mc:Ignorable="w14 w15 w16se w16cid w16 w16cex w16sdtdh wp14">
+<w:numbering xmlns:wpc="http://schemas.microsoft.com/office/word/2010/wordprocessingCanvas" xmlns:cx="http://schemas.microsoft.com/office/drawing/2014/chartex" xmlns:mc="http://schemas.openxmlformats.org/markup-compatibility/2006" xmlns:o="urn:schemas-microsoft-com:office:office" xmlns:r="http://schemas.openxmlformats.org/officeDocument/2006/relationships" xmlns:m="http://schemas.openxmlformats.org/officeDocument/2006/math" xmlns:v="urn:schemas-microsoft-com:vml" xmlns:wp14="http://schemas.microsoft.com/office/word/2010/wordprocessingDrawing" xmlns:wp="http://schemas.openxmlformats.org/drawingml/2006/wordprocessingDrawing" xmlns:w10="urn:schemas-microsoft-com:office:word" xmlns:w="http://schemas.openxmlformats.org/wordprocessingml/2006/main" xmlns:w14="http://schemas.microsoft.com/office/word/2010/wordml" xmlns:w15="http://schemas.microsoft.com/office/word/2012/wordml" xmlns:w16se="http://schemas.microsoft.com/office/word/2015/wordml/symex" xmlns:wpg="http://schemas.microsoft.com/office/word/2010/wordprocessingGroup" xmlns:wpi="http://schemas.microsoft.com/office/word/2010/wordprocessingInk" xmlns:wne="http://schemas.microsoft.com/office/word/2006/wordml" xmlns:wps="http://schemas.microsoft.com/office/word/2010/wordprocessingShape" mc:Ignorable="w14 w15 w16se wp14">
   <w:abstractNum w:abstractNumId="0" w15:restartNumberingAfterBreak="0">
     <w:nsid w:val="79544FA4"/>
     <w:multiLevelType w:val="hybridMultilevel"/>
@@ -2373,7 +3687,7 @@
 </file>
 
 <file path=word/styles.xml><?xml version="1.0" encoding="utf-8"?>
-<w:styles xmlns:mc="http://schemas.openxmlformats.org/markup-compatibility/2006" xmlns:r="http://schemas.openxmlformats.org/officeDocument/2006/relationships" xmlns:w="http://schemas.openxmlformats.org/wordprocessingml/2006/main" xmlns:w14="http://schemas.microsoft.com/office/word/2010/wordml" xmlns:w15="http://schemas.microsoft.com/office/word/2012/wordml" xmlns:w16cex="http://schemas.microsoft.com/office/word/2018/wordml/cex" xmlns:w16cid="http://schemas.microsoft.com/office/word/2016/wordml/cid" xmlns:w16="http://schemas.microsoft.com/office/word/2018/wordml" xmlns:w16sdtdh="http://schemas.microsoft.com/office/word/2020/wordml/sdtdatahash" xmlns:w16se="http://schemas.microsoft.com/office/word/2015/wordml/symex" mc:Ignorable="w14 w15 w16se w16cid w16 w16cex w16sdtdh">
+<w:styles xmlns:mc="http://schemas.openxmlformats.org/markup-compatibility/2006" xmlns:r="http://schemas.openxmlformats.org/officeDocument/2006/relationships" xmlns:w="http://schemas.openxmlformats.org/wordprocessingml/2006/main" xmlns:w14="http://schemas.microsoft.com/office/word/2010/wordml" xmlns:w15="http://schemas.microsoft.com/office/word/2012/wordml" xmlns:w16se="http://schemas.microsoft.com/office/word/2015/wordml/symex" mc:Ignorable="w14 w15 w16se">
   <w:docDefaults>
     <w:rPrDefault>
       <w:rPr>
@@ -2386,7 +3700,7 @@
     </w:rPrDefault>
     <w:pPrDefault/>
   </w:docDefaults>
-  <w:latentStyles w:defLockedState="0" w:defUIPriority="99" w:defSemiHidden="0" w:defUnhideWhenUsed="0" w:defQFormat="0" w:count="376">
+  <w:latentStyles w:defLockedState="0" w:defUIPriority="99" w:defSemiHidden="0" w:defUnhideWhenUsed="0" w:defQFormat="0" w:count="371">
     <w:lsdException w:name="Normal" w:uiPriority="0" w:qFormat="1"/>
     <w:lsdException w:name="heading 1" w:uiPriority="9" w:qFormat="1"/>
     <w:lsdException w:name="heading 2" w:semiHidden="1" w:uiPriority="9" w:unhideWhenUsed="1" w:qFormat="1"/>
@@ -2492,6 +3806,7 @@
     <w:lsdException w:name="HTML Sample" w:semiHidden="1" w:unhideWhenUsed="1"/>
     <w:lsdException w:name="HTML Typewriter" w:semiHidden="1" w:unhideWhenUsed="1"/>
     <w:lsdException w:name="HTML Variable" w:semiHidden="1" w:unhideWhenUsed="1"/>
+    <w:lsdException w:name="Normal Table" w:semiHidden="1" w:unhideWhenUsed="1"/>
     <w:lsdException w:name="annotation subject" w:semiHidden="1" w:unhideWhenUsed="1"/>
     <w:lsdException w:name="No List" w:semiHidden="1" w:unhideWhenUsed="1"/>
     <w:lsdException w:name="Outline List 1" w:semiHidden="1" w:unhideWhenUsed="1"/>
@@ -2534,8 +3849,11 @@
     <w:lsdException w:name="Table Contemporary" w:semiHidden="1" w:unhideWhenUsed="1"/>
     <w:lsdException w:name="Table Elegant" w:semiHidden="1" w:unhideWhenUsed="1"/>
     <w:lsdException w:name="Table Professional" w:semiHidden="1" w:unhideWhenUsed="1"/>
+    <w:lsdException w:name="Table Subtle 1" w:semiHidden="1" w:unhideWhenUsed="1"/>
     <w:lsdException w:name="Table Subtle 2" w:semiHidden="1" w:unhideWhenUsed="1"/>
     <w:lsdException w:name="Table Web 1" w:semiHidden="1" w:unhideWhenUsed="1"/>
+    <w:lsdException w:name="Table Web 2" w:semiHidden="1" w:unhideWhenUsed="1"/>
+    <w:lsdException w:name="Table Web 3" w:semiHidden="1" w:unhideWhenUsed="1"/>
     <w:lsdException w:name="Balloon Text" w:semiHidden="1" w:unhideWhenUsed="1"/>
     <w:lsdException w:name="Table Grid" w:uiPriority="39"/>
     <w:lsdException w:name="Table Theme" w:semiHidden="1" w:unhideWhenUsed="1"/>
@@ -2754,11 +4072,6 @@
     <w:lsdException w:name="List Table 5 Dark Accent 6" w:uiPriority="50"/>
     <w:lsdException w:name="List Table 6 Colorful Accent 6" w:uiPriority="51"/>
     <w:lsdException w:name="List Table 7 Colorful Accent 6" w:uiPriority="52"/>
-    <w:lsdException w:name="Mention" w:semiHidden="1" w:unhideWhenUsed="1"/>
-    <w:lsdException w:name="Smart Hyperlink" w:semiHidden="1" w:unhideWhenUsed="1"/>
-    <w:lsdException w:name="Hashtag" w:semiHidden="1" w:unhideWhenUsed="1"/>
-    <w:lsdException w:name="Unresolved Mention" w:semiHidden="1" w:unhideWhenUsed="1"/>
-    <w:lsdException w:name="Smart Link" w:semiHidden="1" w:unhideWhenUsed="1"/>
   </w:latentStyles>
   <w:style w:type="paragraph" w:default="1" w:styleId="a">
     <w:name w:val="Normal"/>

</xml_diff>